<commit_message>
CV export: add ΔΗΜΟΣΙΕΥΣΕΙΣ section for employee publications
- prepareTemplate.ts: inject publications header + data tables before body sectPr, matching ΕΠΑΓΓΕΛΜΑΤΙΚΗ ΕΜΠΕΙΡΙΑ format; section wrapped in {#hasPublications} so it is hidden when no publications exist
- cvService.ts: fetch EmployeePublication records, pass publicationRows and hasPublications to template
- Regenerated cv_template_placeholders.docx with all new placeholders verified

Co-Authored-By: Claude Sonnet 4.6 <noreply@anthropic.com>
</commit_message>
<xml_diff>
--- a/backend/templates/cv_template_placeholders.docx
+++ b/backend/templates/cv_template_placeholders.docx
@@ -1870,6 +1870,122 @@
           <w:lang w:val="en-US"/>
         </w:rPr>
       </w:pPr>
+    </w:p>
+    <w:p>
+      <w:r>
+        <w:t>{#hasPublications}</w:t>
+      </w:r>
+    </w:p>
+    <w:tbl>
+      <w:tblPr>
+        <w:tblW w:w="5652" w:type="pct"/>
+        <w:tblInd w:w="-601" w:type="dxa"/>
+        <w:tblBorders>
+          <w:top w:val="single" w:sz="4" w:space="0" w:color="auto"/>
+          <w:left w:val="single" w:sz="4" w:space="0" w:color="auto"/>
+          <w:bottom w:val="single" w:sz="4" w:space="0" w:color="auto"/>
+          <w:right w:val="single" w:sz="4" w:space="0" w:color="auto"/>
+          <w:insideH w:val="single" w:sz="4" w:space="0" w:color="auto"/>
+          <w:insideV w:val="single" w:sz="4" w:space="0" w:color="auto"/>
+        </w:tblBorders>
+        <w:tblLook w:val="0000" w:firstRow="0" w:lastRow="0" w:firstColumn="0" w:lastColumn="0" w:noHBand="0" w:noVBand="0"/>
+      </w:tblPr>
+      <w:tblGrid>
+        <w:gridCol w:w="9640"/>
+      </w:tblGrid>
+      <w:tr w:rsidR="00PUB001" w14:paraId="PUB00001">
+        <w:trPr>
+          <w:trHeight w:val="567"/>
+        </w:trPr>
+        <w:tc>
+          <w:tcPr>
+            <w:tcW w:w="5000" w:type="pct"/>
+            <w:shd w:val="pct10" w:color="auto" w:fill="auto"/>
+            <w:vAlign w:val="center"/>
+          </w:tcPr>
+          <w:p>
+            <w:pPr>
+              <w:jc w:val="center"/>
+              <w:rPr>
+                <w:sz w:val="18"/>
+                <w:szCs w:val="18"/>
+              </w:rPr>
+            </w:pPr>
+            <w:r>
+              <w:rPr>
+                <w:b/>
+                <w:sz w:val="18"/>
+                <w:szCs w:val="18"/>
+                <w:lang w:val="el-GR"/>
+              </w:rPr>
+              <w:t>ΔΗΜΟΣΙΕΥΣΕΙΣ</w:t>
+            </w:r>
+          </w:p>
+        </w:tc>
+      </w:tr>
+    </w:tbl>
+    <w:p>
+      <w:pPr>
+        <w:rPr>
+          <w:sz w:val="18"/>
+          <w:szCs w:val="18"/>
+          <w:lang w:val="el-GR"/>
+        </w:rPr>
+      </w:pPr>
+    </w:p>
+    <w:tbl>
+      <w:tblPr>
+        <w:tblW w:w="5652" w:type="pct"/>
+        <w:tblInd w:w="-601" w:type="dxa"/>
+        <w:tblBorders>
+          <w:top w:val="single" w:sz="4" w:space="0" w:color="auto"/>
+          <w:left w:val="single" w:sz="4" w:space="0" w:color="auto"/>
+          <w:bottom w:val="single" w:sz="4" w:space="0" w:color="auto"/>
+          <w:right w:val="single" w:sz="4" w:space="0" w:color="auto"/>
+          <w:insideH w:val="single" w:sz="4" w:space="0" w:color="auto"/>
+          <w:insideV w:val="single" w:sz="4" w:space="0" w:color="auto"/>
+        </w:tblBorders>
+        <w:tblLook w:val="0000" w:firstRow="0" w:lastRow="0" w:firstColumn="0" w:lastColumn="0" w:noHBand="0" w:noVBand="0"/>
+      </w:tblPr>
+      <w:tblGrid>
+        <w:gridCol w:w="9640"/>
+      </w:tblGrid>
+      <w:tr w:rsidR="00PUB002" w14:paraId="PUB00002">
+        <w:trPr>
+          <w:cantSplit/>
+        </w:trPr>
+        <w:tc>
+          <w:tcPr>
+            <w:tcW w:w="5000" w:type="pct"/>
+            <w:vAlign w:val="center"/>
+          </w:tcPr>
+          <w:p>
+            <w:pPr>
+              <w:spacing w:before="0"/>
+              <w:rPr>
+                <w:rFonts w:ascii="Calibri" w:hAnsi="Calibri" w:cs="Calibri"/>
+                <w:sz w:val="20"/>
+                <w:szCs w:val="20"/>
+                <w:lang w:val="el-GR"/>
+              </w:rPr>
+            </w:pPr>
+            <w:r>
+              <w:rPr>
+                <w:rFonts w:ascii="Calibri" w:hAnsi="Calibri" w:cs="Calibri"/>
+                <w:sz w:val="20"/>
+                <w:szCs w:val="20"/>
+                <w:lang w:val="el-GR"/>
+              </w:rPr>
+              <w:t>{#publicationRows}{publicationText}{/publicationRows}</w:t>
+            </w:r>
+          </w:p>
+        </w:tc>
+      </w:tr>
+    </w:tbl>
+    <w:p>
+      <w:r>
+        <w:t>{/hasPublications}</w:t>
+      </w:r>
     </w:p>
     <w:sectPr>
       <w:pgSz w:w="11906" w:h="16838"/>

</xml_diff>

<commit_message>
CV: show Greek names in export list; add ΚΑΤΗΓΟΡΙΑ ΣΤΕΛΕΧΟΥΣ section to template
Co-Authored-By: Claude Sonnet 4.6 <noreply@anthropic.com>
</commit_message>
<xml_diff>
--- a/backend/templates/cv_template_placeholders.docx
+++ b/backend/templates/cv_template_placeholders.docx
@@ -1,2000 +1,6 @@
 
-<file path=word/document.xml><?xml version="1.0" encoding="utf-8"?>
-<w:document xmlns:wpc="http://schemas.microsoft.com/office/word/2010/wordprocessingCanvas" xmlns:cx="http://schemas.microsoft.com/office/drawing/2014/chartex" xmlns:cx1="http://schemas.microsoft.com/office/drawing/2015/9/8/chartex" xmlns:cx2="http://schemas.microsoft.com/office/drawing/2015/10/21/chartex" xmlns:cx3="http://schemas.microsoft.com/office/drawing/2016/5/9/chartex" xmlns:cx4="http://schemas.microsoft.com/office/drawing/2016/5/10/chartex" xmlns:cx5="http://schemas.microsoft.com/office/drawing/2016/5/11/chartex" xmlns:cx6="http://schemas.microsoft.com/office/drawing/2016/5/12/chartex" xmlns:cx7="http://schemas.microsoft.com/office/drawing/2016/5/13/chartex" xmlns:cx8="http://schemas.microsoft.com/office/drawing/2016/5/14/chartex" xmlns:mc="http://schemas.openxmlformats.org/markup-compatibility/2006" xmlns:aink="http://schemas.microsoft.com/office/drawing/2016/ink" xmlns:am3d="http://schemas.microsoft.com/office/drawing/2017/model3d" xmlns:o="urn:schemas-microsoft-com:office:office" xmlns:oel="http://schemas.microsoft.com/office/2019/extlst" xmlns:r="http://schemas.openxmlformats.org/officeDocument/2006/relationships" xmlns:m="http://schemas.openxmlformats.org/officeDocument/2006/math" xmlns:v="urn:schemas-microsoft-com:vml" xmlns:wp14="http://schemas.microsoft.com/office/word/2010/wordprocessingDrawing" xmlns:wp="http://schemas.openxmlformats.org/drawingml/2006/wordprocessingDrawing" xmlns:w10="urn:schemas-microsoft-com:office:word" xmlns:w="http://schemas.openxmlformats.org/wordprocessingml/2006/main" xmlns:w14="http://schemas.microsoft.com/office/word/2010/wordml" xmlns:w15="http://schemas.microsoft.com/office/word/2012/wordml" xmlns:w16cex="http://schemas.microsoft.com/office/word/2018/wordml/cex" xmlns:w16cid="http://schemas.microsoft.com/office/word/2016/wordml/cid" xmlns:w16="http://schemas.microsoft.com/office/word/2018/wordml" xmlns:w16du="http://schemas.microsoft.com/office/word/2023/wordml/word16du" xmlns:w16sdtdh="http://schemas.microsoft.com/office/word/2020/wordml/sdtdatahash" xmlns:w16sdtfl="http://schemas.microsoft.com/office/word/2024/wordml/sdtformatlock" xmlns:w16se="http://schemas.microsoft.com/office/word/2015/wordml/symex" xmlns:wpg="http://schemas.microsoft.com/office/word/2010/wordprocessingGroup" xmlns:wpi="http://schemas.microsoft.com/office/word/2010/wordprocessingInk" xmlns:wne="http://schemas.microsoft.com/office/word/2006/wordml" xmlns:wps="http://schemas.microsoft.com/office/word/2010/wordprocessingShape" mc:Ignorable="w14 w15 w16se w16cid w16 w16cex w16sdtdh w16sdtfl w16du wp14">
-  <w:body>
-    <w:p>
-      <w:pPr>
-        <w:jc w:val="right"/>
-        <w:rPr>
-          <w:sz w:val="18"/>
-          <w:szCs w:val="18"/>
-          <w:lang w:val="el-GR"/>
-        </w:rPr>
-      </w:pPr>
-    </w:p>
-    <w:tbl>
-      <w:tblPr>
-        <w:tblW w:w="5000" w:type="pct"/>
-        <w:tblLook w:val="0000" w:firstRow="0" w:lastRow="0" w:firstColumn="0" w:lastColumn="0" w:noHBand="0" w:noVBand="0"/>
-      </w:tblPr>
-      <w:tblGrid>
-        <w:gridCol w:w="1443"/>
-        <w:gridCol w:w="332"/>
-        <w:gridCol w:w="305"/>
-        <w:gridCol w:w="24"/>
-        <w:gridCol w:w="13"/>
-        <w:gridCol w:w="385"/>
-        <w:gridCol w:w="281"/>
-        <w:gridCol w:w="711"/>
-        <w:gridCol w:w="827"/>
-        <w:gridCol w:w="18"/>
-        <w:gridCol w:w="1208"/>
-        <w:gridCol w:w="67"/>
-        <w:gridCol w:w="381"/>
-        <w:gridCol w:w="113"/>
-        <w:gridCol w:w="226"/>
-        <w:gridCol w:w="49"/>
-        <w:gridCol w:w="413"/>
-        <w:gridCol w:w="1732"/>
-      </w:tblGrid>
-      <w:tr>
-        <w:trPr>
-          <w:trHeight w:val="567"/>
-        </w:trPr>
-        <w:tc>
-          <w:tcPr>
-            <w:tcW w:w="5000" w:type="pct"/>
-            <w:gridSpan w:val="18"/>
-            <w:tcBorders>
-              <w:top w:val="single" w:sz="6" w:space="0" w:color="auto"/>
-              <w:left w:val="single" w:sz="6" w:space="0" w:color="auto"/>
-              <w:bottom w:val="single" w:sz="6" w:space="0" w:color="auto"/>
-              <w:right w:val="single" w:sz="6" w:space="0" w:color="auto"/>
-            </w:tcBorders>
-            <w:shd w:val="pct10" w:color="auto" w:fill="auto"/>
-            <w:vAlign w:val="center"/>
-          </w:tcPr>
-          <w:p>
-            <w:pPr>
-              <w:jc w:val="center"/>
-              <w:rPr>
-                <w:b/>
-                <w:sz w:val="18"/>
-                <w:szCs w:val="18"/>
-                <w:lang w:val="el-GR"/>
-              </w:rPr>
-            </w:pPr>
-            <w:r>
-              <w:rPr>
-                <w:b/>
-                <w:sz w:val="18"/>
-                <w:szCs w:val="18"/>
-                <w:lang w:val="el-GR"/>
-              </w:rPr>
-              <w:t>ΒΙΟΓΡΑΦΙΚΟ ΣΗΜΕΙΩΜΑ</w:t>
-            </w:r>
-          </w:p>
-        </w:tc>
-      </w:tr>
-      <w:tr>
-        <w:tc>
-          <w:tcPr>
-            <w:tcW w:w="5000" w:type="pct"/>
-            <w:gridSpan w:val="18"/>
-          </w:tcPr>
-          <w:p>
-            <w:pPr>
-              <w:rPr>
-                <w:sz w:val="18"/>
-                <w:szCs w:val="18"/>
-                <w:lang w:val="el-GR"/>
-              </w:rPr>
-            </w:pPr>
-          </w:p>
-        </w:tc>
-      </w:tr>
-      <w:tr>
-        <w:tc>
-          <w:tcPr>
-            <w:tcW w:w="2054" w:type="pct"/>
-            <w:gridSpan w:val="8"/>
-            <w:tcBorders>
-              <w:top w:val="single" w:sz="6" w:space="0" w:color="auto"/>
-              <w:left w:val="single" w:sz="6" w:space="0" w:color="auto"/>
-              <w:bottom w:val="single" w:sz="6" w:space="0" w:color="auto"/>
-              <w:right w:val="single" w:sz="6" w:space="0" w:color="auto"/>
-            </w:tcBorders>
-            <w:shd w:val="pct10" w:color="auto" w:fill="auto"/>
-            <w:vAlign w:val="center"/>
-          </w:tcPr>
-          <w:p>
-            <w:pPr>
-              <w:rPr>
-                <w:b/>
-                <w:sz w:val="18"/>
-                <w:szCs w:val="18"/>
-                <w:lang w:val="el-GR"/>
-              </w:rPr>
-            </w:pPr>
-            <w:r>
-              <w:rPr>
-                <w:b/>
-                <w:sz w:val="18"/>
-                <w:szCs w:val="18"/>
-                <w:lang w:val="el-GR"/>
-              </w:rPr>
-              <w:t>ΠΡΟΣΩΠΙΚΑ ΣΤΟΙΧΕΙΑ</w:t>
-            </w:r>
-          </w:p>
-        </w:tc>
-        <w:tc>
-          <w:tcPr>
-            <w:tcW w:w="2946" w:type="pct"/>
-            <w:gridSpan w:val="10"/>
-            <w:vAlign w:val="center"/>
-          </w:tcPr>
-          <w:p>
-            <w:pPr>
-              <w:rPr>
-                <w:sz w:val="18"/>
-                <w:szCs w:val="18"/>
-                <w:lang w:val="el-GR"/>
-              </w:rPr>
-            </w:pPr>
-          </w:p>
-        </w:tc>
-      </w:tr>
-      <w:tr>
-        <w:tc>
-          <w:tcPr>
-            <w:tcW w:w="847" w:type="pct"/>
-            <w:tcBorders>
-              <w:top w:val="double" w:sz="6" w:space="0" w:color="auto"/>
-              <w:left w:val="double" w:sz="6" w:space="0" w:color="auto"/>
-              <w:bottom w:val="nil"/>
-              <w:right w:val="nil"/>
-            </w:tcBorders>
-            <w:vAlign w:val="center"/>
-          </w:tcPr>
-          <w:p>
-            <w:pPr>
-              <w:rPr>
-                <w:b/>
-                <w:sz w:val="18"/>
-                <w:szCs w:val="18"/>
-                <w:lang w:val="el-GR"/>
-              </w:rPr>
-            </w:pPr>
-            <w:r>
-              <w:rPr>
-                <w:b/>
-                <w:sz w:val="18"/>
-                <w:szCs w:val="18"/>
-                <w:lang w:val="el-GR"/>
-              </w:rPr>
-              <w:t>Επώνυμο:</w:t>
-            </w:r>
-          </w:p>
-        </w:tc>
-        <w:tc>
-          <w:tcPr>
-            <w:tcW w:w="1708" w:type="pct"/>
-            <w:gridSpan w:val="9"/>
-            <w:tcBorders>
-              <w:top w:val="double" w:sz="6" w:space="0" w:color="auto"/>
-              <w:left w:val="nil"/>
-              <w:bottom w:val="single" w:sz="6" w:space="0" w:color="auto"/>
-              <w:right w:val="nil"/>
-            </w:tcBorders>
-            <w:vAlign w:val="center"/>
-          </w:tcPr>
-          <w:p>
-            <w:pPr>
-              <w:rPr>
-                <w:sz w:val="18"/>
-                <w:szCs w:val="18"/>
-                <w:lang w:val="el-GR"/>
-              </w:rPr>
-            </w:pPr>
-            <w:r>
-              <w:rPr>
-                <w:sz w:val="18"/>
-                <w:szCs w:val="18"/>
-                <w:lang w:val="el-GR"/>
-              </w:rPr>
-              <w:t xml:space="preserve">{lastName} </w:t>
-            </w:r>
-          </w:p>
-        </w:tc>
-        <w:tc>
-          <w:tcPr>
-            <w:tcW w:w="709" w:type="pct"/>
-            <w:tcBorders>
-              <w:top w:val="double" w:sz="6" w:space="0" w:color="auto"/>
-              <w:left w:val="nil"/>
-              <w:bottom w:val="nil"/>
-              <w:right w:val="nil"/>
-            </w:tcBorders>
-            <w:vAlign w:val="center"/>
-          </w:tcPr>
-          <w:p>
-            <w:pPr>
-              <w:rPr>
-                <w:b/>
-                <w:sz w:val="18"/>
-                <w:szCs w:val="18"/>
-                <w:lang w:val="el-GR"/>
-              </w:rPr>
-            </w:pPr>
-            <w:r>
-              <w:rPr>
-                <w:b/>
-                <w:sz w:val="18"/>
-                <w:szCs w:val="18"/>
-                <w:lang w:val="el-GR"/>
-              </w:rPr>
-              <w:t>Όνομα:</w:t>
-            </w:r>
-          </w:p>
-        </w:tc>
-        <w:tc>
-          <w:tcPr>
-            <w:tcW w:w="1735" w:type="pct"/>
-            <w:gridSpan w:val="7"/>
-            <w:tcBorders>
-              <w:top w:val="double" w:sz="6" w:space="0" w:color="auto"/>
-              <w:left w:val="nil"/>
-              <w:bottom w:val="single" w:sz="6" w:space="0" w:color="auto"/>
-              <w:right w:val="double" w:sz="6" w:space="0" w:color="auto"/>
-            </w:tcBorders>
-            <w:vAlign w:val="center"/>
-          </w:tcPr>
-          <w:p>
-            <w:pPr>
-              <w:rPr>
-                <w:sz w:val="18"/>
-                <w:szCs w:val="18"/>
-                <w:lang w:val="el-GR"/>
-              </w:rPr>
-            </w:pPr>
-            <w:r>
-              <w:rPr>
-                <w:sz w:val="18"/>
-                <w:szCs w:val="18"/>
-                <w:lang w:val="el-GR"/>
-              </w:rPr>
-              <w:t>{firstName}</w:t>
-            </w:r>
-          </w:p>
-        </w:tc>
-      </w:tr>
-      <w:tr>
-        <w:trPr>
-          <w:trHeight w:val="247"/>
-        </w:trPr>
-        <w:tc>
-          <w:tcPr>
-            <w:tcW w:w="5000" w:type="pct"/>
-            <w:gridSpan w:val="18"/>
-            <w:tcBorders>
-              <w:top w:val="nil"/>
-              <w:left w:val="double" w:sz="6" w:space="0" w:color="auto"/>
-              <w:bottom w:val="nil"/>
-              <w:right w:val="double" w:sz="6" w:space="0" w:color="auto"/>
-            </w:tcBorders>
-            <w:vAlign w:val="center"/>
-          </w:tcPr>
-          <w:p>
-            <w:pPr>
-              <w:rPr>
-                <w:sz w:val="18"/>
-                <w:szCs w:val="18"/>
-                <w:lang w:val="el-GR"/>
-              </w:rPr>
-            </w:pPr>
-          </w:p>
-        </w:tc>
-      </w:tr>
-      <w:tr>
-        <w:tc>
-          <w:tcPr>
-            <w:tcW w:w="1043" w:type="pct"/>
-            <w:gridSpan w:val="2"/>
-            <w:tcBorders>
-              <w:top w:val="nil"/>
-              <w:left w:val="double" w:sz="6" w:space="0" w:color="auto"/>
-              <w:bottom w:val="nil"/>
-              <w:right w:val="nil"/>
-            </w:tcBorders>
-            <w:vAlign w:val="center"/>
-          </w:tcPr>
-          <w:p>
-            <w:pPr>
-              <w:rPr>
-                <w:b/>
-                <w:sz w:val="18"/>
-                <w:szCs w:val="18"/>
-                <w:lang w:val="el-GR"/>
-              </w:rPr>
-            </w:pPr>
-            <w:r>
-              <w:rPr>
-                <w:b/>
-                <w:sz w:val="18"/>
-                <w:szCs w:val="18"/>
-                <w:lang w:val="el-GR"/>
-              </w:rPr>
-              <w:t>Πατρώνυμο:</w:t>
-            </w:r>
-          </w:p>
-        </w:tc>
-        <w:tc>
-          <w:tcPr>
-            <w:tcW w:w="1513" w:type="pct"/>
-            <w:gridSpan w:val="8"/>
-            <w:tcBorders>
-              <w:top w:val="nil"/>
-              <w:left w:val="nil"/>
-              <w:bottom w:val="single" w:sz="6" w:space="0" w:color="auto"/>
-              <w:right w:val="nil"/>
-            </w:tcBorders>
-            <w:vAlign w:val="center"/>
-          </w:tcPr>
-          <w:p>
-            <w:pPr>
-              <w:rPr>
-                <w:sz w:val="18"/>
-                <w:szCs w:val="18"/>
-                <w:lang w:val="el-GR"/>
-              </w:rPr>
-            </w:pPr>
-            <w:r>
-              <w:rPr>
-                <w:sz w:val="18"/>
-                <w:szCs w:val="18"/>
-                <w:lang w:val="el-GR"/>
-              </w:rPr>
-              <w:t>{fatherName}</w:t>
-            </w:r>
-          </w:p>
-        </w:tc>
-        <w:tc>
-          <w:tcPr>
-            <w:tcW w:w="1033" w:type="pct"/>
-            <w:gridSpan w:val="4"/>
-            <w:vAlign w:val="center"/>
-          </w:tcPr>
-          <w:p>
-            <w:pPr>
-              <w:rPr>
-                <w:b/>
-                <w:sz w:val="18"/>
-                <w:szCs w:val="18"/>
-                <w:lang w:val="el-GR"/>
-              </w:rPr>
-            </w:pPr>
-            <w:r>
-              <w:rPr>
-                <w:b/>
-                <w:sz w:val="18"/>
-                <w:szCs w:val="18"/>
-                <w:lang w:val="el-GR"/>
-              </w:rPr>
-              <w:t>Μητρώνυμο:</w:t>
-            </w:r>
-          </w:p>
-        </w:tc>
-        <w:tc>
-          <w:tcPr>
-            <w:tcW w:w="1411" w:type="pct"/>
-            <w:gridSpan w:val="4"/>
-            <w:tcBorders>
-              <w:top w:val="nil"/>
-              <w:left w:val="nil"/>
-              <w:bottom w:val="single" w:sz="6" w:space="0" w:color="auto"/>
-              <w:right w:val="double" w:sz="6" w:space="0" w:color="auto"/>
-            </w:tcBorders>
-            <w:vAlign w:val="center"/>
-          </w:tcPr>
-          <w:p>
-            <w:pPr>
-              <w:rPr>
-                <w:sz w:val="18"/>
-                <w:szCs w:val="18"/>
-                <w:lang w:val="el-GR"/>
-              </w:rPr>
-            </w:pPr>
-            <w:r>
-              <w:rPr>
-                <w:sz w:val="18"/>
-                <w:szCs w:val="18"/>
-                <w:lang w:val="el-GR"/>
-              </w:rPr>
-              <w:t>{motherName}</w:t>
-            </w:r>
-          </w:p>
-        </w:tc>
-      </w:tr>
-      <w:tr>
-        <w:tc>
-          <w:tcPr>
-            <w:tcW w:w="5000" w:type="pct"/>
-            <w:gridSpan w:val="18"/>
-            <w:tcBorders>
-              <w:top w:val="nil"/>
-              <w:left w:val="double" w:sz="6" w:space="0" w:color="auto"/>
-              <w:bottom w:val="nil"/>
-              <w:right w:val="double" w:sz="6" w:space="0" w:color="auto"/>
-            </w:tcBorders>
-            <w:vAlign w:val="center"/>
-          </w:tcPr>
-          <w:p>
-            <w:pPr>
-              <w:rPr>
-                <w:sz w:val="18"/>
-                <w:szCs w:val="18"/>
-                <w:lang w:val="el-GR"/>
-              </w:rPr>
-            </w:pPr>
-          </w:p>
-        </w:tc>
-      </w:tr>
-      <w:tr>
-        <w:tc>
-          <w:tcPr>
-            <w:tcW w:w="1238" w:type="pct"/>
-            <w:gridSpan w:val="4"/>
-            <w:tcBorders>
-              <w:top w:val="nil"/>
-              <w:left w:val="double" w:sz="6" w:space="0" w:color="auto"/>
-              <w:bottom w:val="nil"/>
-              <w:right w:val="nil"/>
-            </w:tcBorders>
-            <w:vAlign w:val="center"/>
-          </w:tcPr>
-          <w:p>
-            <w:pPr>
-              <w:rPr>
-                <w:b/>
-                <w:sz w:val="18"/>
-                <w:szCs w:val="18"/>
-                <w:lang w:val="el-GR"/>
-              </w:rPr>
-            </w:pPr>
-            <w:r>
-              <w:rPr>
-                <w:b/>
-                <w:sz w:val="18"/>
-                <w:szCs w:val="18"/>
-                <w:lang w:val="el-GR"/>
-              </w:rPr>
-              <w:t>Ημερομηνία Γέννησης:</w:t>
-            </w:r>
-          </w:p>
-        </w:tc>
-        <w:tc>
-          <w:tcPr>
-            <w:tcW w:w="1317" w:type="pct"/>
-            <w:gridSpan w:val="6"/>
-            <w:tcBorders>
-              <w:top w:val="nil"/>
-              <w:left w:val="nil"/>
-              <w:bottom w:val="single" w:sz="6" w:space="0" w:color="auto"/>
-              <w:right w:val="nil"/>
-            </w:tcBorders>
-            <w:vAlign w:val="center"/>
-          </w:tcPr>
-          <w:p>
-            <w:pPr>
-              <w:rPr>
-                <w:sz w:val="18"/>
-                <w:szCs w:val="18"/>
-                <w:lang w:val="el-GR"/>
-              </w:rPr>
-            </w:pPr>
-            <w:r>
-              <w:rPr>
-                <w:sz w:val="18"/>
-                <w:szCs w:val="18"/>
-                <w:lang w:val="el-GR"/>
-              </w:rPr>
-              <w:t>{dateOfBirth}</w:t>
-            </w:r>
-          </w:p>
-        </w:tc>
-        <w:tc>
-          <w:tcPr>
-            <w:tcW w:w="1163" w:type="pct"/>
-            <w:gridSpan w:val="5"/>
-            <w:vAlign w:val="center"/>
-          </w:tcPr>
-          <w:p>
-            <w:pPr>
-              <w:rPr>
-                <w:b/>
-                <w:sz w:val="18"/>
-                <w:szCs w:val="18"/>
-              </w:rPr>
-            </w:pPr>
-            <w:r>
-              <w:rPr>
-                <w:b/>
-                <w:sz w:val="18"/>
-                <w:szCs w:val="18"/>
-                <w:lang w:val="el-GR"/>
-              </w:rPr>
-              <w:t>Τόπος Γέννησης</w:t>
-            </w:r>
-            <w:r>
-              <w:rPr>
-                <w:b/>
-                <w:sz w:val="18"/>
-                <w:szCs w:val="18"/>
-              </w:rPr>
-              <w:t>:</w:t>
-            </w:r>
-          </w:p>
-        </w:tc>
-        <w:tc>
-          <w:tcPr>
-            <w:tcW w:w="1281" w:type="pct"/>
-            <w:gridSpan w:val="3"/>
-            <w:tcBorders>
-              <w:top w:val="nil"/>
-              <w:left w:val="nil"/>
-              <w:bottom w:val="single" w:sz="6" w:space="0" w:color="auto"/>
-              <w:right w:val="double" w:sz="6" w:space="0" w:color="auto"/>
-            </w:tcBorders>
-            <w:vAlign w:val="center"/>
-          </w:tcPr>
-          <w:p>
-            <w:pPr>
-              <w:rPr>
-                <w:sz w:val="18"/>
-                <w:szCs w:val="18"/>
-                <w:lang w:val="el-GR"/>
-              </w:rPr>
-            </w:pPr>
-            <w:r>
-              <w:rPr>
-                <w:sz w:val="18"/>
-                <w:szCs w:val="18"/>
-                <w:lang w:val="el-GR"/>
-              </w:rPr>
-              <w:t>{placeOfBirth}</w:t>
-            </w:r>
-          </w:p>
-        </w:tc>
-      </w:tr>
-      <w:tr>
-        <w:trPr>
-          <w:trHeight w:val="65"/>
-        </w:trPr>
-        <w:tc>
-          <w:tcPr>
-            <w:tcW w:w="5000" w:type="pct"/>
-            <w:gridSpan w:val="18"/>
-            <w:tcBorders>
-              <w:top w:val="nil"/>
-              <w:left w:val="double" w:sz="6" w:space="0" w:color="auto"/>
-              <w:bottom w:val="nil"/>
-              <w:right w:val="double" w:sz="6" w:space="0" w:color="auto"/>
-            </w:tcBorders>
-            <w:vAlign w:val="center"/>
-          </w:tcPr>
-          <w:p>
-            <w:pPr>
-              <w:rPr>
-                <w:sz w:val="18"/>
-                <w:szCs w:val="18"/>
-                <w:lang w:val="el-GR"/>
-              </w:rPr>
-            </w:pPr>
-          </w:p>
-        </w:tc>
-      </w:tr>
-      <w:tr>
-        <w:tc>
-          <w:tcPr>
-            <w:tcW w:w="1640" w:type="pct"/>
-            <w:gridSpan w:val="7"/>
-            <w:tcBorders>
-              <w:top w:val="nil"/>
-              <w:left w:val="double" w:sz="6" w:space="0" w:color="auto"/>
-              <w:bottom w:val="nil"/>
-              <w:right w:val="nil"/>
-            </w:tcBorders>
-            <w:vAlign w:val="center"/>
-          </w:tcPr>
-          <w:p>
-            <w:pPr>
-              <w:rPr>
-                <w:b/>
-                <w:sz w:val="18"/>
-                <w:szCs w:val="18"/>
-              </w:rPr>
-            </w:pPr>
-            <w:r>
-              <w:rPr>
-                <w:b/>
-                <w:sz w:val="18"/>
-                <w:szCs w:val="18"/>
-                <w:lang w:val="el-GR"/>
-              </w:rPr>
-              <w:t>Τηλέφωνο</w:t>
-            </w:r>
-            <w:r>
-              <w:rPr>
-                <w:b/>
-                <w:sz w:val="18"/>
-                <w:szCs w:val="18"/>
-              </w:rPr>
-              <w:t>:</w:t>
-            </w:r>
-          </w:p>
-        </w:tc>
-        <w:tc>
-          <w:tcPr>
-            <w:tcW w:w="916" w:type="pct"/>
-            <w:gridSpan w:val="3"/>
-            <w:tcBorders>
-              <w:top w:val="nil"/>
-              <w:left w:val="nil"/>
-              <w:bottom w:val="single" w:sz="6" w:space="0" w:color="auto"/>
-              <w:right w:val="nil"/>
-            </w:tcBorders>
-            <w:vAlign w:val="center"/>
-          </w:tcPr>
-          <w:p>
-            <w:pPr>
-              <w:rPr>
-                <w:sz w:val="18"/>
-                <w:szCs w:val="18"/>
-                <w:lang w:val="el-GR"/>
-              </w:rPr>
-            </w:pPr>
-            <w:r>
-              <w:rPr>
-                <w:sz w:val="18"/>
-                <w:szCs w:val="18"/>
-                <w:lang w:val="el-GR"/>
-              </w:rPr>
-              <w:t>{phone}</w:t>
-            </w:r>
-          </w:p>
-        </w:tc>
-        <w:tc>
-          <w:tcPr>
-            <w:tcW w:w="968" w:type="pct"/>
-            <w:gridSpan w:val="3"/>
-            <w:vAlign w:val="center"/>
-          </w:tcPr>
-          <w:p>
-            <w:pPr>
-              <w:rPr>
-                <w:b/>
-                <w:sz w:val="18"/>
-                <w:szCs w:val="18"/>
-                <w:lang w:val="en-US"/>
-              </w:rPr>
-            </w:pPr>
-            <w:r>
-              <w:rPr>
-                <w:b/>
-                <w:sz w:val="18"/>
-                <w:szCs w:val="18"/>
-                <w:lang w:val="en-US"/>
-              </w:rPr>
-              <w:t>E-mail:</w:t>
-            </w:r>
-          </w:p>
-        </w:tc>
-        <w:tc>
-          <w:tcPr>
-            <w:tcW w:w="1476" w:type="pct"/>
-            <w:gridSpan w:val="5"/>
-            <w:tcBorders>
-              <w:top w:val="nil"/>
-              <w:left w:val="nil"/>
-              <w:bottom w:val="single" w:sz="6" w:space="0" w:color="auto"/>
-              <w:right w:val="double" w:sz="6" w:space="0" w:color="auto"/>
-            </w:tcBorders>
-            <w:vAlign w:val="center"/>
-          </w:tcPr>
-          <w:p>
-            <w:pPr>
-              <w:rPr>
-                <w:sz w:val="18"/>
-                <w:szCs w:val="18"/>
-                <w:lang w:val="en-US"/>
-              </w:rPr>
-            </w:pPr>
-            <w:r>
-              <w:rPr>
-                <w:sz w:val="18"/>
-                <w:szCs w:val="18"/>
-                <w:lang w:val="en-US"/>
-              </w:rPr>
-              <w:t>{email}</w:t>
-            </w:r>
-          </w:p>
-        </w:tc>
-      </w:tr>
-      <w:tr>
-        <w:tc>
-          <w:tcPr>
-            <w:tcW w:w="1640" w:type="pct"/>
-            <w:gridSpan w:val="7"/>
-            <w:tcBorders>
-              <w:top w:val="nil"/>
-              <w:left w:val="double" w:sz="6" w:space="0" w:color="auto"/>
-              <w:bottom w:val="nil"/>
-              <w:right w:val="nil"/>
-            </w:tcBorders>
-            <w:vAlign w:val="center"/>
-          </w:tcPr>
-          <w:p>
-            <w:pPr>
-              <w:rPr>
-                <w:b/>
-                <w:sz w:val="18"/>
-                <w:szCs w:val="18"/>
-                <w:lang w:val="en-US"/>
-              </w:rPr>
-            </w:pPr>
-            <w:r>
-              <w:rPr>
-                <w:b/>
-                <w:sz w:val="18"/>
-                <w:szCs w:val="18"/>
-                <w:lang w:val="en-US"/>
-              </w:rPr>
-              <w:t>Fax:</w:t>
-            </w:r>
-          </w:p>
-        </w:tc>
-        <w:tc>
-          <w:tcPr>
-            <w:tcW w:w="916" w:type="pct"/>
-            <w:gridSpan w:val="3"/>
-            <w:tcBorders>
-              <w:top w:val="nil"/>
-              <w:left w:val="nil"/>
-              <w:bottom w:val="single" w:sz="6" w:space="0" w:color="auto"/>
-              <w:right w:val="nil"/>
-            </w:tcBorders>
-            <w:vAlign w:val="center"/>
-          </w:tcPr>
-          <w:p>
-            <w:pPr>
-              <w:rPr>
-                <w:sz w:val="18"/>
-                <w:szCs w:val="18"/>
-                <w:lang w:val="en-US"/>
-              </w:rPr>
-            </w:pPr>
-          </w:p>
-        </w:tc>
-        <w:tc>
-          <w:tcPr>
-            <w:tcW w:w="968" w:type="pct"/>
-            <w:gridSpan w:val="3"/>
-            <w:vAlign w:val="center"/>
-          </w:tcPr>
-          <w:p>
-            <w:pPr>
-              <w:rPr>
-                <w:b/>
-                <w:sz w:val="18"/>
-                <w:szCs w:val="18"/>
-                <w:lang w:val="en-US"/>
-              </w:rPr>
-            </w:pPr>
-          </w:p>
-        </w:tc>
-        <w:tc>
-          <w:tcPr>
-            <w:tcW w:w="1476" w:type="pct"/>
-            <w:gridSpan w:val="5"/>
-            <w:tcBorders>
-              <w:top w:val="single" w:sz="6" w:space="0" w:color="auto"/>
-              <w:left w:val="nil"/>
-              <w:bottom w:val="nil"/>
-              <w:right w:val="double" w:sz="6" w:space="0" w:color="auto"/>
-            </w:tcBorders>
-            <w:vAlign w:val="center"/>
-          </w:tcPr>
-          <w:p>
-            <w:pPr>
-              <w:rPr>
-                <w:sz w:val="18"/>
-                <w:szCs w:val="18"/>
-                <w:lang w:val="en-US"/>
-              </w:rPr>
-            </w:pPr>
-          </w:p>
-        </w:tc>
-      </w:tr>
-      <w:tr>
-        <w:tc>
-          <w:tcPr>
-            <w:tcW w:w="1247" w:type="pct"/>
-            <w:gridSpan w:val="5"/>
-            <w:tcBorders>
-              <w:top w:val="nil"/>
-              <w:left w:val="double" w:sz="6" w:space="0" w:color="auto"/>
-              <w:bottom w:val="nil"/>
-              <w:right w:val="nil"/>
-            </w:tcBorders>
-            <w:vAlign w:val="center"/>
-          </w:tcPr>
-          <w:p>
-            <w:pPr>
-              <w:rPr>
-                <w:sz w:val="18"/>
-                <w:szCs w:val="18"/>
-                <w:lang w:val="en-US"/>
-              </w:rPr>
-            </w:pPr>
-          </w:p>
-        </w:tc>
-        <w:tc>
-          <w:tcPr>
-            <w:tcW w:w="1297" w:type="pct"/>
-            <w:gridSpan w:val="4"/>
-            <w:vAlign w:val="center"/>
-          </w:tcPr>
-          <w:p>
-            <w:pPr>
-              <w:rPr>
-                <w:sz w:val="18"/>
-                <w:szCs w:val="18"/>
-                <w:lang w:val="en-US"/>
-              </w:rPr>
-            </w:pPr>
-          </w:p>
-        </w:tc>
-        <w:tc>
-          <w:tcPr>
-            <w:tcW w:w="1203" w:type="pct"/>
-            <w:gridSpan w:val="7"/>
-            <w:vAlign w:val="center"/>
-          </w:tcPr>
-          <w:p>
-            <w:pPr>
-              <w:rPr>
-                <w:sz w:val="18"/>
-                <w:szCs w:val="18"/>
-                <w:lang w:val="en-US"/>
-              </w:rPr>
-            </w:pPr>
-          </w:p>
-        </w:tc>
-        <w:tc>
-          <w:tcPr>
-            <w:tcW w:w="1253" w:type="pct"/>
-            <w:gridSpan w:val="2"/>
-            <w:tcBorders>
-              <w:top w:val="nil"/>
-              <w:left w:val="nil"/>
-              <w:bottom w:val="nil"/>
-              <w:right w:val="double" w:sz="6" w:space="0" w:color="auto"/>
-            </w:tcBorders>
-            <w:vAlign w:val="center"/>
-          </w:tcPr>
-          <w:p>
-            <w:pPr>
-              <w:rPr>
-                <w:sz w:val="18"/>
-                <w:szCs w:val="18"/>
-                <w:lang w:val="en-US"/>
-              </w:rPr>
-            </w:pPr>
-          </w:p>
-        </w:tc>
-      </w:tr>
-      <w:tr>
-        <w:tc>
-          <w:tcPr>
-            <w:tcW w:w="1474" w:type="pct"/>
-            <w:gridSpan w:val="6"/>
-            <w:tcBorders>
-              <w:top w:val="nil"/>
-              <w:left w:val="double" w:sz="6" w:space="0" w:color="auto"/>
-              <w:bottom w:val="nil"/>
-              <w:right w:val="nil"/>
-            </w:tcBorders>
-            <w:vAlign w:val="center"/>
-          </w:tcPr>
-          <w:p>
-            <w:pPr>
-              <w:rPr>
-                <w:b/>
-                <w:sz w:val="18"/>
-                <w:szCs w:val="18"/>
-              </w:rPr>
-            </w:pPr>
-            <w:r>
-              <w:rPr>
-                <w:b/>
-                <w:sz w:val="18"/>
-                <w:szCs w:val="18"/>
-                <w:lang w:val="el-GR"/>
-              </w:rPr>
-              <w:t>Διεύθυνση Κατοικίας</w:t>
-            </w:r>
-            <w:r>
-              <w:rPr>
-                <w:b/>
-                <w:sz w:val="18"/>
-                <w:szCs w:val="18"/>
-              </w:rPr>
-              <w:t>:</w:t>
-            </w:r>
-          </w:p>
-        </w:tc>
-        <w:tc>
-          <w:tcPr>
-            <w:tcW w:w="3526" w:type="pct"/>
-            <w:gridSpan w:val="12"/>
-            <w:tcBorders>
-              <w:top w:val="nil"/>
-              <w:left w:val="nil"/>
-              <w:bottom w:val="single" w:sz="6" w:space="0" w:color="auto"/>
-              <w:right w:val="double" w:sz="6" w:space="0" w:color="auto"/>
-            </w:tcBorders>
-            <w:vAlign w:val="center"/>
-          </w:tcPr>
-          <w:p>
-            <w:pPr>
-              <w:rPr>
-                <w:sz w:val="18"/>
-                <w:szCs w:val="18"/>
-                <w:lang w:val="el-GR"/>
-              </w:rPr>
-            </w:pPr>
-            <w:r>
-              <w:rPr>
-                <w:sz w:val="18"/>
-                <w:szCs w:val="18"/>
-                <w:lang w:val="el-GR"/>
-              </w:rPr>
-              <w:t xml:space="preserve">{homeAddress}</w:t>
-            </w:r>
-          </w:p>
-        </w:tc>
-      </w:tr>
-      <w:tr>
-        <w:tc>
-          <w:tcPr>
-            <w:tcW w:w="1247" w:type="pct"/>
-            <w:gridSpan w:val="5"/>
-            <w:tcBorders>
-              <w:top w:val="nil"/>
-              <w:left w:val="double" w:sz="6" w:space="0" w:color="auto"/>
-              <w:bottom w:val="double" w:sz="6" w:space="0" w:color="auto"/>
-              <w:right w:val="nil"/>
-            </w:tcBorders>
-            <w:vAlign w:val="center"/>
-          </w:tcPr>
-          <w:p>
-            <w:pPr>
-              <w:rPr>
-                <w:sz w:val="18"/>
-                <w:szCs w:val="18"/>
-                <w:lang w:val="el-GR"/>
-              </w:rPr>
-            </w:pPr>
-          </w:p>
-        </w:tc>
-        <w:tc>
-          <w:tcPr>
-            <w:tcW w:w="1297" w:type="pct"/>
-            <w:gridSpan w:val="4"/>
-            <w:tcBorders>
-              <w:top w:val="nil"/>
-              <w:left w:val="nil"/>
-              <w:bottom w:val="double" w:sz="6" w:space="0" w:color="auto"/>
-              <w:right w:val="nil"/>
-            </w:tcBorders>
-            <w:vAlign w:val="center"/>
-          </w:tcPr>
-          <w:p>
-            <w:pPr>
-              <w:rPr>
-                <w:sz w:val="18"/>
-                <w:szCs w:val="18"/>
-                <w:lang w:val="el-GR"/>
-              </w:rPr>
-            </w:pPr>
-          </w:p>
-        </w:tc>
-        <w:tc>
-          <w:tcPr>
-            <w:tcW w:w="1203" w:type="pct"/>
-            <w:gridSpan w:val="7"/>
-            <w:tcBorders>
-              <w:top w:val="nil"/>
-              <w:left w:val="nil"/>
-              <w:bottom w:val="double" w:sz="6" w:space="0" w:color="auto"/>
-              <w:right w:val="nil"/>
-            </w:tcBorders>
-            <w:vAlign w:val="center"/>
-          </w:tcPr>
-          <w:p>
-            <w:pPr>
-              <w:rPr>
-                <w:sz w:val="18"/>
-                <w:szCs w:val="18"/>
-                <w:lang w:val="el-GR"/>
-              </w:rPr>
-            </w:pPr>
-          </w:p>
-        </w:tc>
-        <w:tc>
-          <w:tcPr>
-            <w:tcW w:w="1253" w:type="pct"/>
-            <w:gridSpan w:val="2"/>
-            <w:tcBorders>
-              <w:top w:val="nil"/>
-              <w:left w:val="nil"/>
-              <w:bottom w:val="double" w:sz="6" w:space="0" w:color="auto"/>
-              <w:right w:val="double" w:sz="6" w:space="0" w:color="auto"/>
-            </w:tcBorders>
-            <w:vAlign w:val="center"/>
-          </w:tcPr>
-          <w:p>
-            <w:pPr>
-              <w:rPr>
-                <w:sz w:val="18"/>
-                <w:szCs w:val="18"/>
-                <w:lang w:val="el-GR"/>
-              </w:rPr>
-            </w:pPr>
-          </w:p>
-        </w:tc>
-      </w:tr>
-      <w:tr>
-        <w:tc>
-          <w:tcPr>
-            <w:tcW w:w="5000" w:type="pct"/>
-            <w:gridSpan w:val="18"/>
-          </w:tcPr>
-          <w:p>
-            <w:pPr>
-              <w:rPr>
-                <w:sz w:val="18"/>
-                <w:szCs w:val="18"/>
-                <w:lang w:val="el-GR"/>
-              </w:rPr>
-            </w:pPr>
-          </w:p>
-          <w:p>
-            <w:pPr>
-              <w:rPr>
-                <w:sz w:val="18"/>
-                <w:szCs w:val="18"/>
-                <w:lang w:val="el-GR"/>
-              </w:rPr>
-            </w:pPr>
-          </w:p>
-        </w:tc>
-      </w:tr>
-      <w:tr>
-        <w:tc>
-          <w:tcPr>
-            <w:tcW w:w="1223" w:type="pct"/>
-            <w:gridSpan w:val="3"/>
-            <w:tcBorders>
-              <w:top w:val="single" w:sz="6" w:space="0" w:color="auto"/>
-              <w:left w:val="single" w:sz="6" w:space="0" w:color="auto"/>
-              <w:bottom w:val="single" w:sz="6" w:space="0" w:color="auto"/>
-              <w:right w:val="single" w:sz="6" w:space="0" w:color="auto"/>
-            </w:tcBorders>
-            <w:shd w:val="pct10" w:color="auto" w:fill="auto"/>
-          </w:tcPr>
-          <w:p>
-            <w:pPr>
-              <w:rPr>
-                <w:b/>
-                <w:sz w:val="18"/>
-                <w:szCs w:val="18"/>
-                <w:lang w:val="el-GR"/>
-              </w:rPr>
-            </w:pPr>
-            <w:r>
-              <w:rPr>
-                <w:b/>
-                <w:sz w:val="18"/>
-                <w:szCs w:val="18"/>
-                <w:lang w:val="el-GR"/>
-              </w:rPr>
-              <w:t>ΕΚΠΑΙΔΕΥΣΗ</w:t>
-            </w:r>
-          </w:p>
-        </w:tc>
-        <w:tc>
-          <w:tcPr>
-            <w:tcW w:w="3777" w:type="pct"/>
-            <w:gridSpan w:val="15"/>
-          </w:tcPr>
-          <w:p>
-            <w:pPr>
-              <w:rPr>
-                <w:sz w:val="18"/>
-                <w:szCs w:val="18"/>
-                <w:lang w:val="el-GR"/>
-              </w:rPr>
-            </w:pPr>
-          </w:p>
-        </w:tc>
-      </w:tr>
-      <w:tr>
-        <w:tc>
-          <w:tcPr>
-            <w:tcW w:w="2058" w:type="pct"/>
-            <w:gridSpan w:val="8"/>
-            <w:tcBorders>
-              <w:top w:val="double" w:sz="6" w:space="0" w:color="auto"/>
-              <w:left w:val="double" w:sz="6" w:space="0" w:color="auto"/>
-              <w:bottom w:val="nil"/>
-              <w:right w:val="single" w:sz="6" w:space="0" w:color="auto"/>
-            </w:tcBorders>
-            <w:vAlign w:val="center"/>
-          </w:tcPr>
-          <w:p>
-            <w:pPr>
-              <w:jc w:val="center"/>
-              <w:rPr>
-                <w:b/>
-                <w:sz w:val="18"/>
-                <w:szCs w:val="18"/>
-                <w:lang w:val="el-GR"/>
-              </w:rPr>
-            </w:pPr>
-            <w:r>
-              <w:rPr>
-                <w:b/>
-                <w:sz w:val="18"/>
-                <w:szCs w:val="18"/>
-                <w:lang w:val="el-GR"/>
-              </w:rPr>
-              <w:t>Όνομα Ιδρύματος</w:t>
-            </w:r>
-          </w:p>
-        </w:tc>
-        <w:tc>
-          <w:tcPr>
-            <w:tcW w:w="1247" w:type="pct"/>
-            <w:gridSpan w:val="4"/>
-            <w:tcBorders>
-              <w:top w:val="double" w:sz="6" w:space="0" w:color="auto"/>
-              <w:left w:val="nil"/>
-              <w:bottom w:val="nil"/>
-              <w:right w:val="single" w:sz="6" w:space="0" w:color="auto"/>
-            </w:tcBorders>
-            <w:vAlign w:val="center"/>
-          </w:tcPr>
-          <w:p>
-            <w:pPr>
-              <w:jc w:val="center"/>
-              <w:rPr>
-                <w:b/>
-                <w:sz w:val="18"/>
-                <w:szCs w:val="18"/>
-                <w:lang w:val="el-GR"/>
-              </w:rPr>
-            </w:pPr>
-            <w:r>
-              <w:rPr>
-                <w:b/>
-                <w:sz w:val="18"/>
-                <w:szCs w:val="18"/>
-                <w:lang w:val="el-GR"/>
-              </w:rPr>
-              <w:t>Τίτλος Πτυχίου</w:t>
-            </w:r>
-          </w:p>
-        </w:tc>
-        <w:tc>
-          <w:tcPr>
-            <w:tcW w:w="679" w:type="pct"/>
-            <w:gridSpan w:val="5"/>
-            <w:tcBorders>
-              <w:top w:val="double" w:sz="6" w:space="0" w:color="auto"/>
-              <w:left w:val="nil"/>
-              <w:bottom w:val="nil"/>
-              <w:right w:val="single" w:sz="6" w:space="0" w:color="auto"/>
-            </w:tcBorders>
-            <w:vAlign w:val="center"/>
-          </w:tcPr>
-          <w:p>
-            <w:pPr>
-              <w:jc w:val="center"/>
-              <w:rPr>
-                <w:b/>
-                <w:sz w:val="18"/>
-                <w:szCs w:val="18"/>
-                <w:lang w:val="el-GR"/>
-              </w:rPr>
-            </w:pPr>
-            <w:r>
-              <w:rPr>
-                <w:b/>
-                <w:sz w:val="18"/>
-                <w:szCs w:val="18"/>
-                <w:lang w:val="el-GR"/>
-              </w:rPr>
-              <w:t>Ειδικότητα</w:t>
-            </w:r>
-          </w:p>
-        </w:tc>
-        <w:tc>
-          <w:tcPr>
-            <w:tcW w:w="1016" w:type="pct"/>
-            <w:tcBorders>
-              <w:top w:val="double" w:sz="6" w:space="0" w:color="auto"/>
-              <w:left w:val="nil"/>
-              <w:bottom w:val="nil"/>
-              <w:right w:val="double" w:sz="6" w:space="0" w:color="auto"/>
-            </w:tcBorders>
-            <w:vAlign w:val="center"/>
-          </w:tcPr>
-          <w:p>
-            <w:pPr>
-              <w:jc w:val="center"/>
-              <w:rPr>
-                <w:b/>
-                <w:sz w:val="18"/>
-                <w:szCs w:val="18"/>
-                <w:lang w:val="el-GR"/>
-              </w:rPr>
-            </w:pPr>
-            <w:r>
-              <w:rPr>
-                <w:b/>
-                <w:sz w:val="18"/>
-                <w:szCs w:val="18"/>
-                <w:lang w:val="el-GR"/>
-              </w:rPr>
-              <w:t>Ημερομηνία Απόκτησης Πτυχίου</w:t>
-            </w:r>
-          </w:p>
-        </w:tc>
-      </w:tr>
-      <w:tr w14:paraId="EDU00001">
-        <w:tc>
-          <w:tcPr>
-            <w:tcW w:w="2058" w:type="pct"/>
-            <w:gridSpan w:val="8"/>
-            <w:tcBorders>
-              <w:top w:val="double" w:sz="6" w:space="0" w:color="auto"/>
-              <w:left w:val="double" w:sz="6" w:space="0" w:color="auto"/>
-              <w:bottom w:val="single" w:sz="6" w:space="0" w:color="auto"/>
-              <w:right w:val="single" w:sz="6" w:space="0" w:color="auto"/>
-            </w:tcBorders>
-          </w:tcPr>
-          <w:p>
-            <w:pPr>
-              <w:rPr>
-                <w:rFonts w:ascii="Calibri" w:hAnsi="Calibri"/>
-                <w:sz w:val="20"/>
-                <w:szCs w:val="22"/>
-                <w:lang w:val="el-GR"/>
-              </w:rPr>
-            </w:pPr>
-            <w:r>
-              <w:rPr>
-                <w:rFonts w:ascii="Calibri" w:hAnsi="Calibri"/>
-                <w:sz w:val="20"/>
-                <w:szCs w:val="22"/>
-                <w:lang w:val="el-GR"/>
-              </w:rPr>
-              <w:t>{#educationRows}{institutionFull}</w:t>
-            </w:r>
-          </w:p>
-        </w:tc>
-        <w:tc>
-          <w:tcPr>
-            <w:tcW w:w="1247" w:type="pct"/>
-            <w:gridSpan w:val="4"/>
-            <w:tcBorders>
-              <w:top w:val="double" w:sz="6" w:space="0" w:color="auto"/>
-              <w:left w:val="nil"/>
-              <w:bottom w:val="single" w:sz="6" w:space="0" w:color="auto"/>
-              <w:right w:val="single" w:sz="6" w:space="0" w:color="auto"/>
-            </w:tcBorders>
-            <w:vAlign w:val="center"/>
-          </w:tcPr>
-          <w:p>
-            <w:pPr>
-              <w:jc w:val="center"/>
-              <w:rPr>
-                <w:rFonts w:ascii="Calibri" w:hAnsi="Calibri"/>
-                <w:sz w:val="20"/>
-                <w:szCs w:val="22"/>
-                <w:lang w:val="el-GR"/>
-              </w:rPr>
-            </w:pPr>
-            <w:r>
-              <w:rPr>
-                <w:rFonts w:ascii="Calibri" w:hAnsi="Calibri"/>
-                <w:sz w:val="20"/>
-                <w:szCs w:val="22"/>
-                <w:lang w:val="el-GR"/>
-              </w:rPr>
-              <w:t>{degreeTitle}</w:t>
-            </w:r>
-          </w:p>
-        </w:tc>
-        <w:tc>
-          <w:tcPr>
-            <w:tcW w:w="679" w:type="pct"/>
-            <w:gridSpan w:val="5"/>
-            <w:tcBorders>
-              <w:top w:val="double" w:sz="6" w:space="0" w:color="auto"/>
-              <w:left w:val="nil"/>
-              <w:bottom w:val="single" w:sz="6" w:space="0" w:color="auto"/>
-              <w:right w:val="single" w:sz="6" w:space="0" w:color="auto"/>
-            </w:tcBorders>
-          </w:tcPr>
-          <w:p>
-            <w:pPr>
-              <w:rPr>
-                <w:rFonts w:ascii="Calibri" w:hAnsi="Calibri"/>
-                <w:sz w:val="20"/>
-                <w:szCs w:val="22"/>
-                <w:lang w:val="el-GR"/>
-              </w:rPr>
-            </w:pPr>
-            <w:r>
-              <w:rPr>
-                <w:rFonts w:ascii="Calibri" w:hAnsi="Calibri"/>
-                <w:sz w:val="20"/>
-                <w:szCs w:val="22"/>
-                <w:lang w:val="el-GR"/>
-              </w:rPr>
-              <w:t>{specialization}</w:t>
-            </w:r>
-          </w:p>
-        </w:tc>
-        <w:tc>
-          <w:tcPr>
-            <w:tcW w:w="1016" w:type="pct"/>
-            <w:tcBorders>
-              <w:top w:val="double" w:sz="6" w:space="0" w:color="auto"/>
-              <w:left w:val="nil"/>
-              <w:bottom w:val="single" w:sz="6" w:space="0" w:color="auto"/>
-              <w:right w:val="double" w:sz="6" w:space="0" w:color="auto"/>
-            </w:tcBorders>
-          </w:tcPr>
-          <w:p>
-            <w:pPr>
-              <w:jc w:val="center"/>
-              <w:rPr>
-                <w:rFonts w:ascii="Calibri" w:hAnsi="Calibri"/>
-                <w:sz w:val="20"/>
-                <w:szCs w:val="22"/>
-                <w:lang w:val="el-GR"/>
-              </w:rPr>
-            </w:pPr>
-            <w:r>
-              <w:rPr>
-                <w:rFonts w:ascii="Calibri" w:hAnsi="Calibri"/>
-                <w:sz w:val="20"/>
-                <w:szCs w:val="22"/>
-                <w:lang w:val="el-GR"/>
-              </w:rPr>
-              <w:t>{dateAwarded}{/educationRows}</w:t>
-            </w:r>
-          </w:p>
-        </w:tc>
-      </w:tr>
-    </w:tbl>
-    <w:p>
-      <w:pPr>
-        <w:ind w:right="-334"/>
-        <w:rPr>
-          <w:sz w:val="18"/>
-          <w:szCs w:val="18"/>
-          <w:lang w:val="el-GR"/>
-        </w:rPr>
-        <w:sectPr>
-          <w:pgSz w:w="11906" w:h="16838"/>
-          <w:pgMar w:top="1440" w:right="1797" w:bottom="1440" w:left="1797" w:header="709" w:footer="709" w:gutter="0"/>
-          <w:cols w:space="708"/>
-          <w:docGrid w:linePitch="360"/>
-        </w:sectPr>
-      </w:pPr>
-    </w:p>
-    <w:p>
-      <w:pPr>
-        <w:ind w:right="-334"/>
-        <w:rPr>
-          <w:sz w:val="18"/>
-          <w:szCs w:val="18"/>
-          <w:lang w:val="en-US"/>
-        </w:rPr>
-      </w:pPr>
-    </w:p>
-    <w:tbl>
-      <w:tblPr>
-        <w:tblW w:w="5652" w:type="pct"/>
-        <w:tblInd w:w="-601" w:type="dxa"/>
-        <w:tblBorders>
-          <w:top w:val="single" w:sz="4" w:space="0" w:color="auto"/>
-          <w:left w:val="single" w:sz="4" w:space="0" w:color="auto"/>
-          <w:bottom w:val="single" w:sz="4" w:space="0" w:color="auto"/>
-          <w:right w:val="single" w:sz="4" w:space="0" w:color="auto"/>
-          <w:insideH w:val="single" w:sz="4" w:space="0" w:color="auto"/>
-          <w:insideV w:val="single" w:sz="4" w:space="0" w:color="auto"/>
-        </w:tblBorders>
-        <w:tblLook w:val="0000" w:firstRow="0" w:lastRow="0" w:firstColumn="0" w:lastColumn="0" w:noHBand="0" w:noVBand="0"/>
-      </w:tblPr>
-      <w:tblGrid>
-        <w:gridCol w:w="9640"/>
-      </w:tblGrid>
-      <w:tr>
-        <w:trPr>
-          <w:trHeight w:val="567"/>
-        </w:trPr>
-        <w:tc>
-          <w:tcPr>
-            <w:tcW w:w="5000" w:type="pct"/>
-            <w:shd w:val="pct10" w:color="auto" w:fill="auto"/>
-            <w:vAlign w:val="center"/>
-          </w:tcPr>
-          <w:p>
-            <w:pPr>
-              <w:jc w:val="center"/>
-              <w:rPr>
-                <w:sz w:val="18"/>
-                <w:szCs w:val="18"/>
-              </w:rPr>
-            </w:pPr>
-            <w:r>
-              <w:rPr>
-                <w:b/>
-                <w:sz w:val="18"/>
-                <w:szCs w:val="18"/>
-                <w:lang w:val="el-GR"/>
-              </w:rPr>
-              <w:t>ΕΠΑΓΓΕΛΜΑΤΙΚΗ ΕΜΠΕΙΡΙΑ</w:t>
-            </w:r>
-          </w:p>
-        </w:tc>
-      </w:tr>
-    </w:tbl>
-    <w:p>
-      <w:pPr>
-        <w:rPr>
-          <w:sz w:val="18"/>
-          <w:szCs w:val="18"/>
-          <w:lang w:val="el-GR"/>
-        </w:rPr>
-      </w:pPr>
-    </w:p>
-    <w:tbl>
-      <w:tblPr>
-        <w:tblW w:w="5652" w:type="pct"/>
-        <w:tblInd w:w="-601" w:type="dxa"/>
-        <w:tblBorders>
-          <w:top w:val="single" w:sz="4" w:space="0" w:color="auto"/>
-          <w:left w:val="single" w:sz="4" w:space="0" w:color="auto"/>
-          <w:bottom w:val="single" w:sz="4" w:space="0" w:color="auto"/>
-          <w:right w:val="single" w:sz="4" w:space="0" w:color="auto"/>
-          <w:insideH w:val="single" w:sz="4" w:space="0" w:color="auto"/>
-          <w:insideV w:val="single" w:sz="4" w:space="0" w:color="auto"/>
-        </w:tblBorders>
-        <w:tblLook w:val="0000" w:firstRow="0" w:lastRow="0" w:firstColumn="0" w:lastColumn="0" w:noHBand="0" w:noVBand="0"/>
-      </w:tblPr>
-      <w:tblGrid>
-        <w:gridCol w:w="3917"/>
-        <w:gridCol w:w="1307"/>
-        <w:gridCol w:w="2506"/>
-        <w:gridCol w:w="1910"/>
-      </w:tblGrid>
-      <w:tr>
-        <w:trPr>
-          <w:cantSplit/>
-          <w:tblHeader/>
-        </w:trPr>
-        <w:tc>
-          <w:tcPr>
-            <w:tcW w:w="2048" w:type="pct"/>
-            <w:vMerge w:val="restart"/>
-            <w:shd w:val="clear" w:color="auto" w:fill="E6E6E6"/>
-            <w:vAlign w:val="center"/>
-          </w:tcPr>
-          <w:p>
-            <w:pPr>
-              <w:jc w:val="center"/>
-              <w:rPr>
-                <w:rFonts w:ascii="Calibri" w:hAnsi="Calibri" w:cs="Calibri"/>
-                <w:b/>
-                <w:sz w:val="20"/>
-                <w:szCs w:val="20"/>
-                <w:lang w:val="el-GR"/>
-              </w:rPr>
-            </w:pPr>
-            <w:r>
-              <w:rPr>
-                <w:rFonts w:ascii="Calibri" w:hAnsi="Calibri" w:cs="Calibri"/>
-                <w:b/>
-                <w:sz w:val="20"/>
-                <w:szCs w:val="20"/>
-                <w:lang w:val="el-GR"/>
-              </w:rPr>
-              <w:t>Έργο</w:t>
-            </w:r>
-          </w:p>
-        </w:tc>
-        <w:tc>
-          <w:tcPr>
-            <w:tcW w:w="629" w:type="pct"/>
-            <w:vMerge w:val="restart"/>
-            <w:shd w:val="clear" w:color="auto" w:fill="E6E6E6"/>
-            <w:vAlign w:val="center"/>
-          </w:tcPr>
-          <w:p>
-            <w:pPr>
-              <w:jc w:val="center"/>
-              <w:rPr>
-                <w:rFonts w:ascii="Calibri" w:hAnsi="Calibri" w:cs="Calibri"/>
-                <w:b/>
-                <w:sz w:val="20"/>
-                <w:szCs w:val="20"/>
-                <w:lang w:val="el-GR"/>
-              </w:rPr>
-            </w:pPr>
-            <w:r>
-              <w:rPr>
-                <w:rFonts w:ascii="Calibri" w:hAnsi="Calibri" w:cs="Calibri"/>
-                <w:b/>
-                <w:sz w:val="20"/>
-                <w:szCs w:val="20"/>
-                <w:lang w:val="el-GR"/>
-              </w:rPr>
-              <w:t>Εργοδότης</w:t>
-            </w:r>
-          </w:p>
-        </w:tc>
-        <w:tc>
-          <w:tcPr>
-            <w:tcW w:w="1316" w:type="pct"/>
-            <w:vMerge w:val="restart"/>
-            <w:shd w:val="clear" w:color="auto" w:fill="E6E6E6"/>
-            <w:vAlign w:val="center"/>
-          </w:tcPr>
-          <w:p>
-            <w:pPr>
-              <w:jc w:val="center"/>
-              <w:rPr>
-                <w:rFonts w:ascii="Calibri" w:hAnsi="Calibri" w:cs="Calibri"/>
-                <w:sz w:val="20"/>
-                <w:szCs w:val="20"/>
-                <w:lang w:val="el-GR"/>
-              </w:rPr>
-            </w:pPr>
-            <w:r>
-              <w:rPr>
-                <w:rFonts w:ascii="Calibri" w:hAnsi="Calibri" w:cs="Calibri"/>
-                <w:b/>
-                <w:sz w:val="20"/>
-                <w:szCs w:val="20"/>
-                <w:lang w:val="el-GR"/>
-              </w:rPr>
-              <w:t xml:space="preserve">Θέση και Καθήκοντα στο Έργο </w:t>
-            </w:r>
-          </w:p>
-        </w:tc>
-        <w:tc>
-          <w:tcPr>
-            <w:tcW w:w="1007" w:type="pct"/>
-            <w:shd w:val="clear" w:color="auto" w:fill="E6E6E6"/>
-            <w:vAlign w:val="center"/>
-          </w:tcPr>
-          <w:p>
-            <w:pPr>
-              <w:jc w:val="center"/>
-              <w:rPr>
-                <w:rFonts w:ascii="Calibri" w:hAnsi="Calibri" w:cs="Calibri"/>
-                <w:b/>
-                <w:sz w:val="20"/>
-                <w:szCs w:val="20"/>
-                <w:lang w:val="el-GR"/>
-              </w:rPr>
-            </w:pPr>
-            <w:r>
-              <w:rPr>
-                <w:rFonts w:ascii="Calibri" w:hAnsi="Calibri" w:cs="Calibri"/>
-                <w:b/>
-                <w:sz w:val="20"/>
-                <w:szCs w:val="20"/>
-                <w:lang w:val="el-GR"/>
-              </w:rPr>
-              <w:t>Απασχόληση στο Έργο</w:t>
-            </w:r>
-          </w:p>
-        </w:tc>
-      </w:tr>
-      <w:tr>
-        <w:trPr>
-          <w:cantSplit/>
-          <w:tblHeader/>
-        </w:trPr>
-        <w:tc>
-          <w:tcPr>
-            <w:tcW w:w="2048" w:type="pct"/>
-            <w:vMerge/>
-            <w:vAlign w:val="center"/>
-          </w:tcPr>
-          <w:p>
-            <w:pPr>
-              <w:jc w:val="left"/>
-              <w:rPr>
-                <w:rFonts w:ascii="Calibri" w:hAnsi="Calibri" w:cs="Calibri"/>
-                <w:b/>
-                <w:sz w:val="20"/>
-                <w:szCs w:val="20"/>
-                <w:lang w:val="el-GR"/>
-              </w:rPr>
-            </w:pPr>
-          </w:p>
-        </w:tc>
-        <w:tc>
-          <w:tcPr>
-            <w:tcW w:w="629" w:type="pct"/>
-            <w:vMerge/>
-            <w:vAlign w:val="center"/>
-          </w:tcPr>
-          <w:p>
-            <w:pPr>
-              <w:jc w:val="center"/>
-              <w:rPr>
-                <w:rFonts w:ascii="Calibri" w:hAnsi="Calibri" w:cs="Calibri"/>
-                <w:b/>
-                <w:sz w:val="20"/>
-                <w:szCs w:val="20"/>
-                <w:lang w:val="el-GR"/>
-              </w:rPr>
-            </w:pPr>
-          </w:p>
-        </w:tc>
-        <w:tc>
-          <w:tcPr>
-            <w:tcW w:w="1316" w:type="pct"/>
-            <w:vMerge/>
-            <w:vAlign w:val="center"/>
-          </w:tcPr>
-          <w:p>
-            <w:pPr>
-              <w:jc w:val="left"/>
-              <w:rPr>
-                <w:rFonts w:ascii="Calibri" w:hAnsi="Calibri" w:cs="Calibri"/>
-                <w:b/>
-                <w:sz w:val="20"/>
-                <w:szCs w:val="20"/>
-                <w:lang w:val="el-GR"/>
-              </w:rPr>
-            </w:pPr>
-          </w:p>
-        </w:tc>
-        <w:tc>
-          <w:tcPr>
-            <w:tcW w:w="1007" w:type="pct"/>
-            <w:shd w:val="clear" w:color="auto" w:fill="E6E6E6"/>
-            <w:vAlign w:val="center"/>
-          </w:tcPr>
-          <w:p>
-            <w:pPr>
-              <w:jc w:val="center"/>
-              <w:rPr>
-                <w:rFonts w:ascii="Calibri" w:hAnsi="Calibri" w:cs="Calibri"/>
-                <w:b/>
-                <w:sz w:val="20"/>
-                <w:szCs w:val="20"/>
-                <w:lang w:val="el-GR"/>
-              </w:rPr>
-            </w:pPr>
-            <w:r>
-              <w:rPr>
-                <w:rFonts w:ascii="Calibri" w:hAnsi="Calibri" w:cs="Calibri"/>
-                <w:b/>
-                <w:sz w:val="20"/>
-                <w:szCs w:val="20"/>
-                <w:lang w:val="el-GR"/>
-              </w:rPr>
-              <w:t>Περίοδος</w:t>
-            </w:r>
-          </w:p>
-          <w:p>
-            <w:pPr>
-              <w:jc w:val="center"/>
-              <w:rPr>
-                <w:rFonts w:ascii="Calibri" w:hAnsi="Calibri" w:cs="Calibri"/>
-                <w:b/>
-                <w:sz w:val="20"/>
-                <w:szCs w:val="20"/>
-                <w:lang w:val="el-GR"/>
-              </w:rPr>
-            </w:pPr>
-            <w:r>
-              <w:rPr>
-                <w:rFonts w:ascii="Calibri" w:hAnsi="Calibri" w:cs="Calibri"/>
-                <w:sz w:val="20"/>
-                <w:szCs w:val="20"/>
-                <w:lang w:val="el-GR"/>
-              </w:rPr>
-              <w:t xml:space="preserve">(από </w:t>
-            </w:r>
-            <w:r>
-              <w:rPr>
-                <w:rFonts w:ascii="Calibri" w:hAnsi="Calibri" w:cs="Calibri"/>
-                <w:b/>
-                <w:sz w:val="20"/>
-                <w:szCs w:val="20"/>
-                <w:lang w:val="el-GR"/>
-              </w:rPr>
-              <w:t>-</w:t>
-            </w:r>
-            <w:r>
-              <w:rPr>
-                <w:rFonts w:ascii="Calibri" w:hAnsi="Calibri" w:cs="Calibri"/>
-                <w:sz w:val="20"/>
-                <w:szCs w:val="20"/>
-                <w:lang w:val="el-GR"/>
-              </w:rPr>
-              <w:t xml:space="preserve"> έως)</w:t>
-            </w:r>
-          </w:p>
-        </w:tc>
-      </w:tr>
-      <w:tr w14:paraId="EXP00001">
-        <w:trPr>
-          <w:cantSplit/>
-        </w:trPr>
-        <w:tc>
-          <w:tcPr>
-            <w:tcW w:w="2048" w:type="pct"/>
-            <w:vAlign w:val="center"/>
-          </w:tcPr>
-          <w:p>
-            <w:pPr>
-              <w:spacing w:before="0"/>
-              <w:jc w:val="left"/>
-              <w:rPr>
-                <w:rFonts w:ascii="Calibri" w:hAnsi="Calibri" w:cs="Calibri"/>
-                <w:sz w:val="20"/>
-                <w:szCs w:val="20"/>
-                <w:lang w:val="el-GR"/>
-              </w:rPr>
-            </w:pPr>
-            <w:r>
-              <w:rPr>
-                <w:rFonts w:ascii="Calibri" w:hAnsi="Calibri" w:cs="Calibri"/>
-                <w:sz w:val="20"/>
-                <w:szCs w:val="20"/>
-                <w:lang w:val="el-GR"/>
-              </w:rPr>
-              <w:t>{#experienceRows}{projectText}</w:t>
-            </w:r>
-          </w:p>
-        </w:tc>
-        <w:tc>
-          <w:tcPr>
-            <w:tcW w:w="629" w:type="pct"/>
-            <w:vAlign w:val="center"/>
-          </w:tcPr>
-          <w:p>
-            <w:pPr>
-              <w:spacing w:before="0"/>
-              <w:jc w:val="center"/>
-              <w:rPr>
-                <w:rFonts w:ascii="Calibri" w:hAnsi="Calibri" w:cs="Calibri"/>
-                <w:sz w:val="20"/>
-                <w:szCs w:val="20"/>
-                <w:lang w:val="el-GR"/>
-              </w:rPr>
-            </w:pPr>
-            <w:r>
-              <w:rPr>
-                <w:rFonts w:ascii="Calibri" w:hAnsi="Calibri" w:cs="Calibri"/>
-                <w:sz w:val="20"/>
-                <w:szCs w:val="20"/>
-                <w:lang w:val="el-GR"/>
-              </w:rPr>
-              <w:t>{employerName}</w:t>
-            </w:r>
-          </w:p>
-        </w:tc>
-        <w:tc>
-          <w:tcPr>
-            <w:tcW w:w="1316" w:type="pct"/>
-            <w:vAlign w:val="center"/>
-          </w:tcPr>
-          <w:p>
-            <w:pPr>
-              <w:jc w:val="center"/>
-              <w:rPr>
-                <w:rFonts w:ascii="Calibri" w:hAnsi="Calibri" w:cs="Calibri"/>
-                <w:sz w:val="20"/>
-                <w:szCs w:val="20"/>
-                <w:lang w:val="el-GR"/>
-              </w:rPr>
-            </w:pPr>
-            <w:r>
-              <w:rPr>
-                <w:rFonts w:ascii="Calibri" w:hAnsi="Calibri" w:cs="Calibri"/>
-                <w:sz w:val="20"/>
-                <w:szCs w:val="20"/>
-                <w:lang w:val="el-GR"/>
-              </w:rPr>
-              <w:t>{roleName}</w:t>
-            </w:r>
-          </w:p>
-        </w:tc>
-        <w:tc>
-          <w:tcPr>
-            <w:tcW w:w="1007" w:type="pct"/>
-            <w:vAlign w:val="center"/>
-          </w:tcPr>
-          <w:p>
-            <w:pPr>
-              <w:jc w:val="center"/>
-              <w:rPr>
-                <w:rFonts w:ascii="Calibri" w:hAnsi="Calibri" w:cs="Calibri"/>
-                <w:sz w:val="20"/>
-                <w:szCs w:val="20"/>
-                <w:lang w:val="el-GR"/>
-              </w:rPr>
-            </w:pPr>
-            <w:r>
-              <w:rPr>
-                <w:rFonts w:ascii="Calibri" w:hAnsi="Calibri" w:cs="Calibri"/>
-                <w:sz w:val="20"/>
-                <w:szCs w:val="20"/>
-                <w:lang w:val="el-GR"/>
-              </w:rPr>
-              <w:t>{period}{/experienceRows}</w:t>
-            </w:r>
-          </w:p>
-        </w:tc>
-      </w:tr>
-    </w:tbl>
-    <w:p>
-      <w:pPr>
-        <w:rPr>
-          <w:sz w:val="18"/>
-          <w:szCs w:val="18"/>
-          <w:lang w:val="en-US"/>
-        </w:rPr>
-      </w:pPr>
-    </w:p>
-    <w:p>
-      <w:r>
-        <w:t>{#hasPublications}</w:t>
-      </w:r>
-    </w:p>
-    <w:tbl>
-      <w:tblPr>
-        <w:tblW w:w="5652" w:type="pct"/>
-        <w:tblInd w:w="-601" w:type="dxa"/>
-        <w:tblBorders>
-          <w:top w:val="single" w:sz="4" w:space="0" w:color="auto"/>
-          <w:left w:val="single" w:sz="4" w:space="0" w:color="auto"/>
-          <w:bottom w:val="single" w:sz="4" w:space="0" w:color="auto"/>
-          <w:right w:val="single" w:sz="4" w:space="0" w:color="auto"/>
-          <w:insideH w:val="single" w:sz="4" w:space="0" w:color="auto"/>
-          <w:insideV w:val="single" w:sz="4" w:space="0" w:color="auto"/>
-        </w:tblBorders>
-        <w:tblLook w:val="0000" w:firstRow="0" w:lastRow="0" w:firstColumn="0" w:lastColumn="0" w:noHBand="0" w:noVBand="0"/>
-      </w:tblPr>
-      <w:tblGrid>
-        <w:gridCol w:w="9640"/>
-      </w:tblGrid>
-      <w:tr w:rsidR="00PUB001" w14:paraId="PUB00001">
-        <w:trPr>
-          <w:trHeight w:val="567"/>
-        </w:trPr>
-        <w:tc>
-          <w:tcPr>
-            <w:tcW w:w="5000" w:type="pct"/>
-            <w:shd w:val="pct10" w:color="auto" w:fill="auto"/>
-            <w:vAlign w:val="center"/>
-          </w:tcPr>
-          <w:p>
-            <w:pPr>
-              <w:jc w:val="center"/>
-              <w:rPr>
-                <w:sz w:val="18"/>
-                <w:szCs w:val="18"/>
-              </w:rPr>
-            </w:pPr>
-            <w:r>
-              <w:rPr>
-                <w:b/>
-                <w:sz w:val="18"/>
-                <w:szCs w:val="18"/>
-                <w:lang w:val="el-GR"/>
-              </w:rPr>
-              <w:t>ΔΗΜΟΣΙΕΥΣΕΙΣ</w:t>
-            </w:r>
-          </w:p>
-        </w:tc>
-      </w:tr>
-    </w:tbl>
-    <w:p>
-      <w:pPr>
-        <w:rPr>
-          <w:sz w:val="18"/>
-          <w:szCs w:val="18"/>
-          <w:lang w:val="el-GR"/>
-        </w:rPr>
-      </w:pPr>
-    </w:p>
-    <w:tbl>
-      <w:tblPr>
-        <w:tblW w:w="5652" w:type="pct"/>
-        <w:tblInd w:w="-601" w:type="dxa"/>
-        <w:tblBorders>
-          <w:top w:val="single" w:sz="4" w:space="0" w:color="auto"/>
-          <w:left w:val="single" w:sz="4" w:space="0" w:color="auto"/>
-          <w:bottom w:val="single" w:sz="4" w:space="0" w:color="auto"/>
-          <w:right w:val="single" w:sz="4" w:space="0" w:color="auto"/>
-          <w:insideH w:val="single" w:sz="4" w:space="0" w:color="auto"/>
-          <w:insideV w:val="single" w:sz="4" w:space="0" w:color="auto"/>
-        </w:tblBorders>
-        <w:tblLook w:val="0000" w:firstRow="0" w:lastRow="0" w:firstColumn="0" w:lastColumn="0" w:noHBand="0" w:noVBand="0"/>
-      </w:tblPr>
-      <w:tblGrid>
-        <w:gridCol w:w="9640"/>
-      </w:tblGrid>
-      <w:tr w:rsidR="00PUB002" w14:paraId="PUB00002">
-        <w:trPr>
-          <w:cantSplit/>
-        </w:trPr>
-        <w:tc>
-          <w:tcPr>
-            <w:tcW w:w="5000" w:type="pct"/>
-            <w:vAlign w:val="center"/>
-          </w:tcPr>
-          <w:p>
-            <w:pPr>
-              <w:spacing w:before="0"/>
-              <w:rPr>
-                <w:rFonts w:ascii="Calibri" w:hAnsi="Calibri" w:cs="Calibri"/>
-                <w:sz w:val="20"/>
-                <w:szCs w:val="20"/>
-                <w:lang w:val="el-GR"/>
-              </w:rPr>
-            </w:pPr>
-            <w:r>
-              <w:rPr>
-                <w:rFonts w:ascii="Calibri" w:hAnsi="Calibri" w:cs="Calibri"/>
-                <w:sz w:val="20"/>
-                <w:szCs w:val="20"/>
-                <w:lang w:val="el-GR"/>
-              </w:rPr>
-              <w:t>{publicationsText}</w:t>
-            </w:r>
-          </w:p>
-        </w:tc>
-      </w:tr>
-    </w:tbl>
-    <w:p>
-      <w:r>
-        <w:t>{/hasPublications}</w:t>
-      </w:r>
-    </w:p>
-    <w:sectPr>
-      <w:pgSz w:w="11906" w:h="16838"/>
-      <w:pgMar w:top="1440" w:right="1797" w:bottom="1440" w:left="1797" w:header="709" w:footer="709" w:gutter="0"/>
-      <w:cols w:space="708"/>
-      <w:docGrid w:linePitch="360"/>
-    </w:sectPr>
-  </w:body>
-</w:document>
+<file path=word/document.xml><?xml version="1.0" encoding="UTF-8" standalone="yes"?>
+<w:document xmlns:wpc="http://schemas.microsoft.com/office/word/2010/wordprocessingCanvas" xmlns:cx="http://schemas.microsoft.com/office/drawing/2014/chartex" xmlns:cx1="http://schemas.microsoft.com/office/drawing/2015/9/8/chartex" xmlns:cx2="http://schemas.microsoft.com/office/drawing/2015/10/21/chartex" xmlns:cx3="http://schemas.microsoft.com/office/drawing/2016/5/9/chartex" xmlns:cx4="http://schemas.microsoft.com/office/drawing/2016/5/10/chartex" xmlns:cx5="http://schemas.microsoft.com/office/drawing/2016/5/11/chartex" xmlns:cx6="http://schemas.microsoft.com/office/drawing/2016/5/12/chartex" xmlns:cx7="http://schemas.microsoft.com/office/drawing/2016/5/13/chartex" xmlns:cx8="http://schemas.microsoft.com/office/drawing/2016/5/14/chartex" xmlns:mc="http://schemas.openxmlformats.org/markup-compatibility/2006" xmlns:aink="http://schemas.microsoft.com/office/drawing/2016/ink" xmlns:am3d="http://schemas.microsoft.com/office/drawing/2017/model3d" xmlns:o="urn:schemas-microsoft-com:office:office" xmlns:oel="http://schemas.microsoft.com/office/2019/extlst" xmlns:r="http://schemas.openxmlformats.org/officeDocument/2006/relationships" xmlns:m="http://schemas.openxmlformats.org/officeDocument/2006/math" xmlns:v="urn:schemas-microsoft-com:vml" xmlns:wp14="http://schemas.microsoft.com/office/word/2010/wordprocessingDrawing" xmlns:wp="http://schemas.openxmlformats.org/drawingml/2006/wordprocessingDrawing" xmlns:w10="urn:schemas-microsoft-com:office:word" xmlns:w="http://schemas.openxmlformats.org/wordprocessingml/2006/main" xmlns:w14="http://schemas.microsoft.com/office/word/2010/wordml" xmlns:w15="http://schemas.microsoft.com/office/word/2012/wordml" xmlns:w16cex="http://schemas.microsoft.com/office/word/2018/wordml/cex" xmlns:w16cid="http://schemas.microsoft.com/office/word/2016/wordml/cid" xmlns:w16="http://schemas.microsoft.com/office/word/2018/wordml" xmlns:w16du="http://schemas.microsoft.com/office/word/2023/wordml/word16du" xmlns:w16sdtdh="http://schemas.microsoft.com/office/word/2020/wordml/sdtdatahash" xmlns:w16sdtfl="http://schemas.microsoft.com/office/word/2024/wordml/sdtformatlock" xmlns:w16se="http://schemas.microsoft.com/office/word/2015/wordml/symex" xmlns:wpg="http://schemas.microsoft.com/office/word/2010/wordprocessingGroup" xmlns:wpi="http://schemas.microsoft.com/office/word/2010/wordprocessingInk" xmlns:wne="http://schemas.microsoft.com/office/word/2006/wordml" xmlns:wps="http://schemas.microsoft.com/office/word/2010/wordprocessingShape" mc:Ignorable="w14 w15 w16se w16cid w16 w16cex w16sdtdh w16sdtfl w16du wp14"><w:body><w:p><w:pPr><w:jc w:val="right"/><w:rPr><w:sz w:val="18"/><w:szCs w:val="18"/><w:lang w:val="el-GR"/></w:rPr></w:pPr></w:p><w:tbl><w:tblPr><w:tblW w:w="5000" w:type="pct"/><w:tblLook w:val="0000" w:firstRow="0" w:lastRow="0" w:firstColumn="0" w:lastColumn="0" w:noHBand="0" w:noVBand="0"/></w:tblPr><w:tblGrid><w:gridCol w:w="1443"/><w:gridCol w:w="332"/><w:gridCol w:w="305"/><w:gridCol w:w="24"/><w:gridCol w:w="13"/><w:gridCol w:w="385"/><w:gridCol w:w="281"/><w:gridCol w:w="711"/><w:gridCol w:w="827"/><w:gridCol w:w="18"/><w:gridCol w:w="1208"/><w:gridCol w:w="67"/><w:gridCol w:w="381"/><w:gridCol w:w="113"/><w:gridCol w:w="226"/><w:gridCol w:w="49"/><w:gridCol w:w="413"/><w:gridCol w:w="1732"/></w:tblGrid><w:tr><w:trPr><w:trHeight w:val="567"/></w:trPr><w:tc><w:tcPr><w:tcW w:w="5000" w:type="pct"/><w:gridSpan w:val="18"/><w:tcBorders><w:top w:val="single" w:sz="6" w:space="0" w:color="auto"/><w:left w:val="single" w:sz="6" w:space="0" w:color="auto"/><w:bottom w:val="single" w:sz="6" w:space="0" w:color="auto"/><w:right w:val="single" w:sz="6" w:space="0" w:color="auto"/></w:tcBorders><w:shd w:val="pct10" w:color="auto" w:fill="auto"/><w:vAlign w:val="center"/></w:tcPr><w:p><w:pPr><w:jc w:val="center"/><w:rPr><w:b/><w:sz w:val="18"/><w:szCs w:val="18"/><w:lang w:val="el-GR"/></w:rPr></w:pPr><w:r><w:rPr><w:b/><w:sz w:val="18"/><w:szCs w:val="18"/><w:lang w:val="el-GR"/></w:rPr><w:t>ΒΙΟΓΡΑΦΙΚΟ ΣΗΜΕΙΩΜΑ</w:t></w:r></w:p></w:tc></w:tr><w:tr><w:tc><w:tcPr><w:tcW w:w="5000" w:type="pct"/><w:gridSpan w:val="18"/></w:tcPr><w:p><w:pPr><w:rPr><w:sz w:val="18"/><w:szCs w:val="18"/><w:lang w:val="el-GR"/></w:rPr></w:pPr></w:p></w:tc></w:tr><w:tr><w:tc><w:tcPr><w:tcW w:w="2054" w:type="pct"/><w:gridSpan w:val="8"/><w:tcBorders><w:top w:val="single" w:sz="6" w:space="0" w:color="auto"/><w:left w:val="single" w:sz="6" w:space="0" w:color="auto"/><w:bottom w:val="single" w:sz="6" w:space="0" w:color="auto"/><w:right w:val="single" w:sz="6" w:space="0" w:color="auto"/></w:tcBorders><w:shd w:val="pct10" w:color="auto" w:fill="auto"/><w:vAlign w:val="center"/></w:tcPr><w:p><w:pPr><w:rPr><w:b/><w:sz w:val="18"/><w:szCs w:val="18"/><w:lang w:val="el-GR"/></w:rPr></w:pPr><w:r><w:rPr><w:b/><w:sz w:val="18"/><w:szCs w:val="18"/><w:lang w:val="el-GR"/></w:rPr><w:t>ΠΡΟΣΩΠΙΚΑ ΣΤΟΙΧΕΙΑ</w:t></w:r></w:p></w:tc><w:tc><w:tcPr><w:tcW w:w="2946" w:type="pct"/><w:gridSpan w:val="10"/><w:vAlign w:val="center"/></w:tcPr><w:p><w:pPr><w:rPr><w:sz w:val="18"/><w:szCs w:val="18"/><w:lang w:val="el-GR"/></w:rPr></w:pPr></w:p></w:tc></w:tr><w:tr><w:tc><w:tcPr><w:tcW w:w="847" w:type="pct"/><w:tcBorders><w:top w:val="double" w:sz="6" w:space="0" w:color="auto"/><w:left w:val="double" w:sz="6" w:space="0" w:color="auto"/><w:bottom w:val="nil"/><w:right w:val="nil"/></w:tcBorders><w:vAlign w:val="center"/></w:tcPr><w:p><w:pPr><w:rPr><w:b/><w:sz w:val="18"/><w:szCs w:val="18"/><w:lang w:val="el-GR"/></w:rPr></w:pPr><w:r><w:rPr><w:b/><w:sz w:val="18"/><w:szCs w:val="18"/><w:lang w:val="el-GR"/></w:rPr><w:t>Επώνυμο:</w:t></w:r></w:p></w:tc><w:tc><w:tcPr><w:tcW w:w="1708" w:type="pct"/><w:gridSpan w:val="9"/><w:tcBorders><w:top w:val="double" w:sz="6" w:space="0" w:color="auto"/><w:left w:val="nil"/><w:bottom w:val="single" w:sz="6" w:space="0" w:color="auto"/><w:right w:val="nil"/></w:tcBorders><w:vAlign w:val="center"/></w:tcPr><w:p><w:pPr><w:rPr><w:sz w:val="18"/><w:szCs w:val="18"/><w:lang w:val="el-GR"/></w:rPr></w:pPr><w:r><w:rPr><w:sz w:val="18"/><w:szCs w:val="18"/><w:lang w:val="el-GR"/></w:rPr><w:t xml:space="preserve">{lastName} </w:t></w:r></w:p></w:tc><w:tc><w:tcPr><w:tcW w:w="709" w:type="pct"/><w:tcBorders><w:top w:val="double" w:sz="6" w:space="0" w:color="auto"/><w:left w:val="nil"/><w:bottom w:val="nil"/><w:right w:val="nil"/></w:tcBorders><w:vAlign w:val="center"/></w:tcPr><w:p><w:pPr><w:rPr><w:b/><w:sz w:val="18"/><w:szCs w:val="18"/><w:lang w:val="el-GR"/></w:rPr></w:pPr><w:r><w:rPr><w:b/><w:sz w:val="18"/><w:szCs w:val="18"/><w:lang w:val="el-GR"/></w:rPr><w:t>Όνομα:</w:t></w:r></w:p></w:tc><w:tc><w:tcPr><w:tcW w:w="1735" w:type="pct"/><w:gridSpan w:val="7"/><w:tcBorders><w:top w:val="double" w:sz="6" w:space="0" w:color="auto"/><w:left w:val="nil"/><w:bottom w:val="single" w:sz="6" w:space="0" w:color="auto"/><w:right w:val="double" w:sz="6" w:space="0" w:color="auto"/></w:tcBorders><w:vAlign w:val="center"/></w:tcPr><w:p><w:pPr><w:rPr><w:sz w:val="18"/><w:szCs w:val="18"/><w:lang w:val="el-GR"/></w:rPr></w:pPr><w:r><w:rPr><w:sz w:val="18"/><w:szCs w:val="18"/><w:lang w:val="el-GR"/></w:rPr><w:t>{firstName}</w:t></w:r></w:p></w:tc></w:tr><w:tr><w:trPr><w:trHeight w:val="247"/></w:trPr><w:tc><w:tcPr><w:tcW w:w="5000" w:type="pct"/><w:gridSpan w:val="18"/><w:tcBorders><w:top w:val="nil"/><w:left w:val="double" w:sz="6" w:space="0" w:color="auto"/><w:bottom w:val="nil"/><w:right w:val="double" w:sz="6" w:space="0" w:color="auto"/></w:tcBorders><w:vAlign w:val="center"/></w:tcPr><w:p><w:pPr><w:rPr><w:sz w:val="18"/><w:szCs w:val="18"/><w:lang w:val="el-GR"/></w:rPr></w:pPr></w:p></w:tc></w:tr><w:tr><w:tc><w:tcPr><w:tcW w:w="1043" w:type="pct"/><w:gridSpan w:val="2"/><w:tcBorders><w:top w:val="nil"/><w:left w:val="double" w:sz="6" w:space="0" w:color="auto"/><w:bottom w:val="nil"/><w:right w:val="nil"/></w:tcBorders><w:vAlign w:val="center"/></w:tcPr><w:p><w:pPr><w:rPr><w:b/><w:sz w:val="18"/><w:szCs w:val="18"/><w:lang w:val="el-GR"/></w:rPr></w:pPr><w:r><w:rPr><w:b/><w:sz w:val="18"/><w:szCs w:val="18"/><w:lang w:val="el-GR"/></w:rPr><w:t>Πατρώνυμο:</w:t></w:r></w:p></w:tc><w:tc><w:tcPr><w:tcW w:w="1513" w:type="pct"/><w:gridSpan w:val="8"/><w:tcBorders><w:top w:val="nil"/><w:left w:val="nil"/><w:bottom w:val="single" w:sz="6" w:space="0" w:color="auto"/><w:right w:val="nil"/></w:tcBorders><w:vAlign w:val="center"/></w:tcPr><w:p><w:pPr><w:rPr><w:sz w:val="18"/><w:szCs w:val="18"/><w:lang w:val="el-GR"/></w:rPr></w:pPr><w:r><w:rPr><w:sz w:val="18"/><w:szCs w:val="18"/><w:lang w:val="el-GR"/></w:rPr><w:t>{fatherName}</w:t></w:r></w:p></w:tc><w:tc><w:tcPr><w:tcW w:w="1033" w:type="pct"/><w:gridSpan w:val="4"/><w:vAlign w:val="center"/></w:tcPr><w:p><w:pPr><w:rPr><w:b/><w:sz w:val="18"/><w:szCs w:val="18"/><w:lang w:val="el-GR"/></w:rPr></w:pPr><w:r><w:rPr><w:b/><w:sz w:val="18"/><w:szCs w:val="18"/><w:lang w:val="el-GR"/></w:rPr><w:t>Μητρώνυμο:</w:t></w:r></w:p></w:tc><w:tc><w:tcPr><w:tcW w:w="1411" w:type="pct"/><w:gridSpan w:val="4"/><w:tcBorders><w:top w:val="nil"/><w:left w:val="nil"/><w:bottom w:val="single" w:sz="6" w:space="0" w:color="auto"/><w:right w:val="double" w:sz="6" w:space="0" w:color="auto"/></w:tcBorders><w:vAlign w:val="center"/></w:tcPr><w:p><w:pPr><w:rPr><w:sz w:val="18"/><w:szCs w:val="18"/><w:lang w:val="el-GR"/></w:rPr></w:pPr><w:r><w:rPr><w:sz w:val="18"/><w:szCs w:val="18"/><w:lang w:val="el-GR"/></w:rPr><w:t>{motherName}</w:t></w:r></w:p></w:tc></w:tr><w:tr><w:tc><w:tcPr><w:tcW w:w="5000" w:type="pct"/><w:gridSpan w:val="18"/><w:tcBorders><w:top w:val="nil"/><w:left w:val="double" w:sz="6" w:space="0" w:color="auto"/><w:bottom w:val="nil"/><w:right w:val="double" w:sz="6" w:space="0" w:color="auto"/></w:tcBorders><w:vAlign w:val="center"/></w:tcPr><w:p><w:pPr><w:rPr><w:sz w:val="18"/><w:szCs w:val="18"/><w:lang w:val="el-GR"/></w:rPr></w:pPr></w:p></w:tc></w:tr><w:tr><w:tc><w:tcPr><w:tcW w:w="1238" w:type="pct"/><w:gridSpan w:val="4"/><w:tcBorders><w:top w:val="nil"/><w:left w:val="double" w:sz="6" w:space="0" w:color="auto"/><w:bottom w:val="nil"/><w:right w:val="nil"/></w:tcBorders><w:vAlign w:val="center"/></w:tcPr><w:p><w:pPr><w:rPr><w:b/><w:sz w:val="18"/><w:szCs w:val="18"/><w:lang w:val="el-GR"/></w:rPr></w:pPr><w:r><w:rPr><w:b/><w:sz w:val="18"/><w:szCs w:val="18"/><w:lang w:val="el-GR"/></w:rPr><w:t>Ημερομηνία Γέννησης:</w:t></w:r></w:p></w:tc><w:tc><w:tcPr><w:tcW w:w="1317" w:type="pct"/><w:gridSpan w:val="6"/><w:tcBorders><w:top w:val="nil"/><w:left w:val="nil"/><w:bottom w:val="single" w:sz="6" w:space="0" w:color="auto"/><w:right w:val="nil"/></w:tcBorders><w:vAlign w:val="center"/></w:tcPr><w:p><w:pPr><w:rPr><w:sz w:val="18"/><w:szCs w:val="18"/><w:lang w:val="el-GR"/></w:rPr></w:pPr><w:r><w:rPr><w:sz w:val="18"/><w:szCs w:val="18"/><w:lang w:val="el-GR"/></w:rPr><w:t>{dateOfBirth}</w:t></w:r></w:p></w:tc><w:tc><w:tcPr><w:tcW w:w="1163" w:type="pct"/><w:gridSpan w:val="5"/><w:vAlign w:val="center"/></w:tcPr><w:p><w:pPr><w:rPr><w:b/><w:sz w:val="18"/><w:szCs w:val="18"/></w:rPr></w:pPr><w:r><w:rPr><w:b/><w:sz w:val="18"/><w:szCs w:val="18"/><w:lang w:val="el-GR"/></w:rPr><w:t>Τόπος Γέννησης</w:t></w:r><w:r><w:rPr><w:b/><w:sz w:val="18"/><w:szCs w:val="18"/></w:rPr><w:t>:</w:t></w:r></w:p></w:tc><w:tc><w:tcPr><w:tcW w:w="1281" w:type="pct"/><w:gridSpan w:val="3"/><w:tcBorders><w:top w:val="nil"/><w:left w:val="nil"/><w:bottom w:val="single" w:sz="6" w:space="0" w:color="auto"/><w:right w:val="double" w:sz="6" w:space="0" w:color="auto"/></w:tcBorders><w:vAlign w:val="center"/></w:tcPr><w:p><w:pPr><w:rPr><w:sz w:val="18"/><w:szCs w:val="18"/><w:lang w:val="el-GR"/></w:rPr></w:pPr><w:r><w:rPr><w:sz w:val="18"/><w:szCs w:val="18"/><w:lang w:val="el-GR"/></w:rPr><w:t>{placeOfBirth}</w:t></w:r></w:p></w:tc></w:tr><w:tr><w:trPr><w:trHeight w:val="65"/></w:trPr><w:tc><w:tcPr><w:tcW w:w="5000" w:type="pct"/><w:gridSpan w:val="18"/><w:tcBorders><w:top w:val="nil"/><w:left w:val="double" w:sz="6" w:space="0" w:color="auto"/><w:bottom w:val="nil"/><w:right w:val="double" w:sz="6" w:space="0" w:color="auto"/></w:tcBorders><w:vAlign w:val="center"/></w:tcPr><w:p><w:pPr><w:rPr><w:sz w:val="18"/><w:szCs w:val="18"/><w:lang w:val="el-GR"/></w:rPr></w:pPr></w:p></w:tc></w:tr><w:tr><w:tc><w:tcPr><w:tcW w:w="1640" w:type="pct"/><w:gridSpan w:val="7"/><w:tcBorders><w:top w:val="nil"/><w:left w:val="double" w:sz="6" w:space="0" w:color="auto"/><w:bottom w:val="nil"/><w:right w:val="nil"/></w:tcBorders><w:vAlign w:val="center"/></w:tcPr><w:p><w:pPr><w:rPr><w:b/><w:sz w:val="18"/><w:szCs w:val="18"/></w:rPr></w:pPr><w:r><w:rPr><w:b/><w:sz w:val="18"/><w:szCs w:val="18"/><w:lang w:val="el-GR"/></w:rPr><w:t>Τηλέφωνο</w:t></w:r><w:r><w:rPr><w:b/><w:sz w:val="18"/><w:szCs w:val="18"/></w:rPr><w:t>:</w:t></w:r></w:p></w:tc><w:tc><w:tcPr><w:tcW w:w="916" w:type="pct"/><w:gridSpan w:val="3"/><w:tcBorders><w:top w:val="nil"/><w:left w:val="nil"/><w:bottom w:val="single" w:sz="6" w:space="0" w:color="auto"/><w:right w:val="nil"/></w:tcBorders><w:vAlign w:val="center"/></w:tcPr><w:p><w:pPr><w:rPr><w:sz w:val="18"/><w:szCs w:val="18"/><w:lang w:val="el-GR"/></w:rPr></w:pPr><w:r><w:rPr><w:sz w:val="18"/><w:szCs w:val="18"/><w:lang w:val="el-GR"/></w:rPr><w:t>{phone}</w:t></w:r></w:p></w:tc><w:tc><w:tcPr><w:tcW w:w="968" w:type="pct"/><w:gridSpan w:val="3"/><w:vAlign w:val="center"/></w:tcPr><w:p><w:pPr><w:rPr><w:b/><w:sz w:val="18"/><w:szCs w:val="18"/><w:lang w:val="en-US"/></w:rPr></w:pPr><w:r><w:rPr><w:b/><w:sz w:val="18"/><w:szCs w:val="18"/><w:lang w:val="en-US"/></w:rPr><w:t>E-mail:</w:t></w:r></w:p></w:tc><w:tc><w:tcPr><w:tcW w:w="1476" w:type="pct"/><w:gridSpan w:val="5"/><w:tcBorders><w:top w:val="nil"/><w:left w:val="nil"/><w:bottom w:val="single" w:sz="6" w:space="0" w:color="auto"/><w:right w:val="double" w:sz="6" w:space="0" w:color="auto"/></w:tcBorders><w:vAlign w:val="center"/></w:tcPr><w:p><w:pPr><w:rPr><w:sz w:val="18"/><w:szCs w:val="18"/><w:lang w:val="en-US"/></w:rPr></w:pPr><w:r><w:rPr><w:sz w:val="18"/><w:szCs w:val="18"/><w:lang w:val="en-US"/></w:rPr><w:t>{email}</w:t></w:r></w:p></w:tc></w:tr><w:tr><w:tc><w:tcPr><w:tcW w:w="1640" w:type="pct"/><w:gridSpan w:val="7"/><w:tcBorders><w:top w:val="nil"/><w:left w:val="double" w:sz="6" w:space="0" w:color="auto"/><w:bottom w:val="nil"/><w:right w:val="nil"/></w:tcBorders><w:vAlign w:val="center"/></w:tcPr><w:p><w:pPr><w:rPr><w:b/><w:sz w:val="18"/><w:szCs w:val="18"/><w:lang w:val="en-US"/></w:rPr></w:pPr><w:r><w:rPr><w:b/><w:sz w:val="18"/><w:szCs w:val="18"/><w:lang w:val="en-US"/></w:rPr><w:t>Fax:</w:t></w:r></w:p></w:tc><w:tc><w:tcPr><w:tcW w:w="916" w:type="pct"/><w:gridSpan w:val="3"/><w:tcBorders><w:top w:val="nil"/><w:left w:val="nil"/><w:bottom w:val="single" w:sz="6" w:space="0" w:color="auto"/><w:right w:val="nil"/></w:tcBorders><w:vAlign w:val="center"/></w:tcPr><w:p><w:pPr><w:rPr><w:sz w:val="18"/><w:szCs w:val="18"/><w:lang w:val="en-US"/></w:rPr></w:pPr></w:p></w:tc><w:tc><w:tcPr><w:tcW w:w="968" w:type="pct"/><w:gridSpan w:val="3"/><w:vAlign w:val="center"/></w:tcPr><w:p><w:pPr><w:rPr><w:b/><w:sz w:val="18"/><w:szCs w:val="18"/><w:lang w:val="en-US"/></w:rPr></w:pPr></w:p></w:tc><w:tc><w:tcPr><w:tcW w:w="1476" w:type="pct"/><w:gridSpan w:val="5"/><w:tcBorders><w:top w:val="single" w:sz="6" w:space="0" w:color="auto"/><w:left w:val="nil"/><w:bottom w:val="nil"/><w:right w:val="double" w:sz="6" w:space="0" w:color="auto"/></w:tcBorders><w:vAlign w:val="center"/></w:tcPr><w:p><w:pPr><w:rPr><w:sz w:val="18"/><w:szCs w:val="18"/><w:lang w:val="en-US"/></w:rPr></w:pPr></w:p></w:tc></w:tr><w:tr><w:tc><w:tcPr><w:tcW w:w="1247" w:type="pct"/><w:gridSpan w:val="5"/><w:tcBorders><w:top w:val="nil"/><w:left w:val="double" w:sz="6" w:space="0" w:color="auto"/><w:bottom w:val="nil"/><w:right w:val="nil"/></w:tcBorders><w:vAlign w:val="center"/></w:tcPr><w:p><w:pPr><w:rPr><w:sz w:val="18"/><w:szCs w:val="18"/><w:lang w:val="en-US"/></w:rPr></w:pPr></w:p></w:tc><w:tc><w:tcPr><w:tcW w:w="1297" w:type="pct"/><w:gridSpan w:val="4"/><w:vAlign w:val="center"/></w:tcPr><w:p><w:pPr><w:rPr><w:sz w:val="18"/><w:szCs w:val="18"/><w:lang w:val="en-US"/></w:rPr></w:pPr></w:p></w:tc><w:tc><w:tcPr><w:tcW w:w="1203" w:type="pct"/><w:gridSpan w:val="7"/><w:vAlign w:val="center"/></w:tcPr><w:p><w:pPr><w:rPr><w:sz w:val="18"/><w:szCs w:val="18"/><w:lang w:val="en-US"/></w:rPr></w:pPr></w:p></w:tc><w:tc><w:tcPr><w:tcW w:w="1253" w:type="pct"/><w:gridSpan w:val="2"/><w:tcBorders><w:top w:val="nil"/><w:left w:val="nil"/><w:bottom w:val="nil"/><w:right w:val="double" w:sz="6" w:space="0" w:color="auto"/></w:tcBorders><w:vAlign w:val="center"/></w:tcPr><w:p><w:pPr><w:rPr><w:sz w:val="18"/><w:szCs w:val="18"/><w:lang w:val="en-US"/></w:rPr></w:pPr></w:p></w:tc></w:tr><w:tr><w:tc><w:tcPr><w:tcW w:w="1474" w:type="pct"/><w:gridSpan w:val="6"/><w:tcBorders><w:top w:val="nil"/><w:left w:val="double" w:sz="6" w:space="0" w:color="auto"/><w:bottom w:val="nil"/><w:right w:val="nil"/></w:tcBorders><w:vAlign w:val="center"/></w:tcPr><w:p><w:pPr><w:rPr><w:b/><w:sz w:val="18"/><w:szCs w:val="18"/></w:rPr></w:pPr><w:r><w:rPr><w:b/><w:sz w:val="18"/><w:szCs w:val="18"/><w:lang w:val="el-GR"/></w:rPr><w:t>Διεύθυνση Κατοικίας</w:t></w:r><w:r><w:rPr><w:b/><w:sz w:val="18"/><w:szCs w:val="18"/></w:rPr><w:t>:</w:t></w:r></w:p></w:tc><w:tc><w:tcPr><w:tcW w:w="3526" w:type="pct"/><w:gridSpan w:val="12"/><w:tcBorders><w:top w:val="nil"/><w:left w:val="nil"/><w:bottom w:val="single" w:sz="6" w:space="0" w:color="auto"/><w:right w:val="double" w:sz="6" w:space="0" w:color="auto"/></w:tcBorders><w:vAlign w:val="center"/></w:tcPr><w:p><w:pPr><w:rPr><w:sz w:val="18"/><w:szCs w:val="18"/><w:lang w:val="el-GR"/></w:rPr></w:pPr><w:r><w:rPr><w:sz w:val="18"/><w:szCs w:val="18"/><w:lang w:val="el-GR"/></w:rPr><w:t xml:space="preserve">{homeAddress}</w:t></w:r></w:p></w:tc></w:tr><w:tr><w:tc><w:tcPr><w:tcW w:w="1247" w:type="pct"/><w:gridSpan w:val="5"/><w:tcBorders><w:top w:val="nil"/><w:left w:val="double" w:sz="6" w:space="0" w:color="auto"/><w:bottom w:val="double" w:sz="6" w:space="0" w:color="auto"/><w:right w:val="nil"/></w:tcBorders><w:vAlign w:val="center"/></w:tcPr><w:p><w:pPr><w:rPr><w:sz w:val="18"/><w:szCs w:val="18"/><w:lang w:val="el-GR"/></w:rPr></w:pPr></w:p></w:tc><w:tc><w:tcPr><w:tcW w:w="1297" w:type="pct"/><w:gridSpan w:val="4"/><w:tcBorders><w:top w:val="nil"/><w:left w:val="nil"/><w:bottom w:val="double" w:sz="6" w:space="0" w:color="auto"/><w:right w:val="nil"/></w:tcBorders><w:vAlign w:val="center"/></w:tcPr><w:p><w:pPr><w:rPr><w:sz w:val="18"/><w:szCs w:val="18"/><w:lang w:val="el-GR"/></w:rPr></w:pPr></w:p></w:tc><w:tc><w:tcPr><w:tcW w:w="1203" w:type="pct"/><w:gridSpan w:val="7"/><w:tcBorders><w:top w:val="nil"/><w:left w:val="nil"/><w:bottom w:val="double" w:sz="6" w:space="0" w:color="auto"/><w:right w:val="nil"/></w:tcBorders><w:vAlign w:val="center"/></w:tcPr><w:p><w:pPr><w:rPr><w:sz w:val="18"/><w:szCs w:val="18"/><w:lang w:val="el-GR"/></w:rPr></w:pPr></w:p></w:tc><w:tc><w:tcPr><w:tcW w:w="1253" w:type="pct"/><w:gridSpan w:val="2"/><w:tcBorders><w:top w:val="nil"/><w:left w:val="nil"/><w:bottom w:val="double" w:sz="6" w:space="0" w:color="auto"/><w:right w:val="double" w:sz="6" w:space="0" w:color="auto"/></w:tcBorders><w:vAlign w:val="center"/></w:tcPr><w:p><w:pPr><w:rPr><w:sz w:val="18"/><w:szCs w:val="18"/><w:lang w:val="el-GR"/></w:rPr></w:pPr></w:p></w:tc></w:tr><w:tr><w:tc><w:tcPr><w:tcW w:w="5000" w:type="pct"/><w:gridSpan w:val="18"/></w:tcPr><w:p><w:pPr><w:rPr><w:sz w:val="18"/><w:szCs w:val="18"/><w:lang w:val="el-GR"/></w:rPr></w:pPr></w:p><w:p><w:pPr><w:rPr><w:sz w:val="18"/><w:szCs w:val="18"/><w:lang w:val="el-GR"/></w:rPr></w:pPr></w:p></w:tc></w:tr><w:tr><w:tc><w:tcPr><w:tcW w:w="1223" w:type="pct"/><w:gridSpan w:val="3"/><w:tcBorders><w:top w:val="single" w:sz="6" w:space="0" w:color="auto"/><w:left w:val="single" w:sz="6" w:space="0" w:color="auto"/><w:bottom w:val="single" w:sz="6" w:space="0" w:color="auto"/><w:right w:val="single" w:sz="6" w:space="0" w:color="auto"/></w:tcBorders><w:shd w:val="pct10" w:color="auto" w:fill="auto"/></w:tcPr><w:p><w:pPr><w:rPr><w:b/><w:sz w:val="18"/><w:szCs w:val="18"/><w:lang w:val="el-GR"/></w:rPr></w:pPr><w:r><w:rPr><w:b/><w:sz w:val="18"/><w:szCs w:val="18"/><w:lang w:val="el-GR"/></w:rPr><w:t>ΕΚΠΑΙΔΕΥΣΗ</w:t></w:r></w:p></w:tc><w:tc><w:tcPr><w:tcW w:w="3777" w:type="pct"/><w:gridSpan w:val="15"/></w:tcPr><w:p><w:pPr><w:rPr><w:sz w:val="18"/><w:szCs w:val="18"/><w:lang w:val="el-GR"/></w:rPr></w:pPr></w:p></w:tc></w:tr><w:tr><w:tc><w:tcPr><w:tcW w:w="2058" w:type="pct"/><w:gridSpan w:val="8"/><w:tcBorders><w:top w:val="double" w:sz="6" w:space="0" w:color="auto"/><w:left w:val="double" w:sz="6" w:space="0" w:color="auto"/><w:bottom w:val="nil"/><w:right w:val="single" w:sz="6" w:space="0" w:color="auto"/></w:tcBorders><w:vAlign w:val="center"/></w:tcPr><w:p><w:pPr><w:jc w:val="center"/><w:rPr><w:b/><w:sz w:val="18"/><w:szCs w:val="18"/><w:lang w:val="el-GR"/></w:rPr></w:pPr><w:r><w:rPr><w:b/><w:sz w:val="18"/><w:szCs w:val="18"/><w:lang w:val="el-GR"/></w:rPr><w:t>Όνομα Ιδρύματος</w:t></w:r></w:p></w:tc><w:tc><w:tcPr><w:tcW w:w="1247" w:type="pct"/><w:gridSpan w:val="4"/><w:tcBorders><w:top w:val="double" w:sz="6" w:space="0" w:color="auto"/><w:left w:val="nil"/><w:bottom w:val="nil"/><w:right w:val="single" w:sz="6" w:space="0" w:color="auto"/></w:tcBorders><w:vAlign w:val="center"/></w:tcPr><w:p><w:pPr><w:jc w:val="center"/><w:rPr><w:b/><w:sz w:val="18"/><w:szCs w:val="18"/><w:lang w:val="el-GR"/></w:rPr></w:pPr><w:r><w:rPr><w:b/><w:sz w:val="18"/><w:szCs w:val="18"/><w:lang w:val="el-GR"/></w:rPr><w:t>Τίτλος Πτυχίου</w:t></w:r></w:p></w:tc><w:tc><w:tcPr><w:tcW w:w="679" w:type="pct"/><w:gridSpan w:val="5"/><w:tcBorders><w:top w:val="double" w:sz="6" w:space="0" w:color="auto"/><w:left w:val="nil"/><w:bottom w:val="nil"/><w:right w:val="single" w:sz="6" w:space="0" w:color="auto"/></w:tcBorders><w:vAlign w:val="center"/></w:tcPr><w:p><w:pPr><w:jc w:val="center"/><w:rPr><w:b/><w:sz w:val="18"/><w:szCs w:val="18"/><w:lang w:val="el-GR"/></w:rPr></w:pPr><w:r><w:rPr><w:b/><w:sz w:val="18"/><w:szCs w:val="18"/><w:lang w:val="el-GR"/></w:rPr><w:t>Ειδικότητα</w:t></w:r></w:p></w:tc><w:tc><w:tcPr><w:tcW w:w="1016" w:type="pct"/><w:tcBorders><w:top w:val="double" w:sz="6" w:space="0" w:color="auto"/><w:left w:val="nil"/><w:bottom w:val="nil"/><w:right w:val="double" w:sz="6" w:space="0" w:color="auto"/></w:tcBorders><w:vAlign w:val="center"/></w:tcPr><w:p><w:pPr><w:jc w:val="center"/><w:rPr><w:b/><w:sz w:val="18"/><w:szCs w:val="18"/><w:lang w:val="el-GR"/></w:rPr></w:pPr><w:r><w:rPr><w:b/><w:sz w:val="18"/><w:szCs w:val="18"/><w:lang w:val="el-GR"/></w:rPr><w:t>Ημερομηνία Απόκτησης Πτυχίου</w:t></w:r></w:p></w:tc></w:tr><w:tr w14:paraId="EDU00001"><w:tc><w:tcPr><w:tcW w:w="2058" w:type="pct"/><w:gridSpan w:val="8"/><w:tcBorders><w:top w:val="double" w:sz="6" w:space="0" w:color="auto"/><w:left w:val="double" w:sz="6" w:space="0" w:color="auto"/><w:bottom w:val="single" w:sz="6" w:space="0" w:color="auto"/><w:right w:val="single" w:sz="6" w:space="0" w:color="auto"/></w:tcBorders></w:tcPr><w:p><w:pPr><w:rPr><w:rFonts w:ascii="Calibri" w:hAnsi="Calibri"/><w:sz w:val="20"/><w:szCs w:val="22"/><w:lang w:val="el-GR"/></w:rPr></w:pPr><w:r><w:rPr><w:rFonts w:ascii="Calibri" w:hAnsi="Calibri"/><w:sz w:val="20"/><w:szCs w:val="22"/><w:lang w:val="el-GR"/></w:rPr><w:t>{#educationRows}{institutionFull}</w:t></w:r></w:p></w:tc><w:tc><w:tcPr><w:tcW w:w="1247" w:type="pct"/><w:gridSpan w:val="4"/><w:tcBorders><w:top w:val="double" w:sz="6" w:space="0" w:color="auto"/><w:left w:val="nil"/><w:bottom w:val="single" w:sz="6" w:space="0" w:color="auto"/><w:right w:val="single" w:sz="6" w:space="0" w:color="auto"/></w:tcBorders><w:vAlign w:val="center"/></w:tcPr><w:p><w:pPr><w:jc w:val="center"/><w:rPr><w:rFonts w:ascii="Calibri" w:hAnsi="Calibri"/><w:sz w:val="20"/><w:szCs w:val="22"/><w:lang w:val="el-GR"/></w:rPr></w:pPr><w:r><w:rPr><w:rFonts w:ascii="Calibri" w:hAnsi="Calibri"/><w:sz w:val="20"/><w:szCs w:val="22"/><w:lang w:val="el-GR"/></w:rPr><w:t>{degreeTitle}</w:t></w:r></w:p></w:tc><w:tc><w:tcPr><w:tcW w:w="679" w:type="pct"/><w:gridSpan w:val="5"/><w:tcBorders><w:top w:val="double" w:sz="6" w:space="0" w:color="auto"/><w:left w:val="nil"/><w:bottom w:val="single" w:sz="6" w:space="0" w:color="auto"/><w:right w:val="single" w:sz="6" w:space="0" w:color="auto"/></w:tcBorders></w:tcPr><w:p><w:pPr><w:rPr><w:rFonts w:ascii="Calibri" w:hAnsi="Calibri"/><w:sz w:val="20"/><w:szCs w:val="22"/><w:lang w:val="el-GR"/></w:rPr></w:pPr><w:r><w:rPr><w:rFonts w:ascii="Calibri" w:hAnsi="Calibri"/><w:sz w:val="20"/><w:szCs w:val="22"/><w:lang w:val="el-GR"/></w:rPr><w:t>{specialization}</w:t></w:r></w:p></w:tc><w:tc><w:tcPr><w:tcW w:w="1016" w:type="pct"/><w:tcBorders><w:top w:val="double" w:sz="6" w:space="0" w:color="auto"/><w:left w:val="nil"/><w:bottom w:val="single" w:sz="6" w:space="0" w:color="auto"/><w:right w:val="double" w:sz="6" w:space="0" w:color="auto"/></w:tcBorders></w:tcPr><w:p><w:pPr><w:jc w:val="center"/><w:rPr><w:rFonts w:ascii="Calibri" w:hAnsi="Calibri"/><w:sz w:val="20"/><w:szCs w:val="22"/><w:lang w:val="el-GR"/></w:rPr></w:pPr><w:r><w:rPr><w:rFonts w:ascii="Calibri" w:hAnsi="Calibri"/><w:sz w:val="20"/><w:szCs w:val="22"/><w:lang w:val="el-GR"/></w:rPr><w:t>{dateAwarded}{/educationRows}</w:t></w:r></w:p></w:tc></w:tr></w:tbl><w:p><w:pPr><w:rPr><w:sz w:val="18"/><w:szCs w:val="18"/><w:lang w:val="el-GR"/></w:rPr></w:pPr></w:p><w:tbl><w:tblPr><w:tblW w:w="5652" w:type="pct"/><w:tblInd w:w="-601" w:type="dxa"/><w:tblBorders><w:top w:val="single" w:sz="4" w:space="0" w:color="auto"/><w:left w:val="single" w:sz="4" w:space="0" w:color="auto"/><w:bottom w:val="single" w:sz="4" w:space="0" w:color="auto"/><w:right w:val="single" w:sz="4" w:space="0" w:color="auto"/><w:insideH w:val="single" w:sz="4" w:space="0" w:color="auto"/><w:insideV w:val="single" w:sz="4" w:space="0" w:color="auto"/></w:tblBorders><w:tblLook w:val="0000" w:firstRow="0" w:lastRow="0" w:firstColumn="0" w:lastColumn="0" w:noHBand="0" w:noVBand="0"/></w:tblPr><w:tblGrid><w:gridCol w:w="6266"/><w:gridCol w:w="3374"/></w:tblGrid><w:tr w:rsidR="00KAT001" w14:paraId="KAT00001"><w:trPr><w:trHeight w:val="400"/></w:trPr><w:tc><w:tcPr><w:tcW w:w="3250" w:type="pct"/><w:shd w:val="clear" w:color="auto" w:fill="D9D9D9"/><w:vAlign w:val="center"/></w:tcPr><w:p><w:pPr><w:rPr><w:b/><w:sz w:val="18"/><w:szCs w:val="18"/><w:lang w:val="el-GR"/></w:rPr></w:pPr><w:r><w:rPr><w:b/><w:sz w:val="18"/><w:szCs w:val="18"/><w:lang w:val="el-GR"/></w:rPr><w:t>ΚΑΤΗΓΟΡΙΑ ΣΤΕΛΕΧΟΥΣ</w:t></w:r></w:p></w:tc><w:tc><w:tcPr><w:tcW w:w="1750" w:type="pct"/><w:vAlign w:val="center"/></w:tcPr><w:p><w:pPr><w:rPr><w:sz w:val="18"/><w:szCs w:val="18"/><w:lang w:val="el-GR"/></w:rPr></w:pPr></w:tc></w:tr></w:tbl><w:p><w:pPr><w:ind w:right="-334"/><w:rPr><w:sz w:val="18"/><w:szCs w:val="18"/><w:lang w:val="el-GR"/></w:rPr><w:sectPr><w:pgSz w:w="11906" w:h="16838"/><w:pgMar w:top="1440" w:right="1797" w:bottom="1440" w:left="1797" w:header="709" w:footer="709" w:gutter="0"/><w:cols w:space="708"/><w:docGrid w:linePitch="360"/></w:sectPr></w:pPr></w:p><w:p><w:pPr><w:ind w:right="-334"/><w:rPr><w:sz w:val="18"/><w:szCs w:val="18"/><w:lang w:val="en-US"/></w:rPr></w:pPr></w:p><w:tbl><w:tblPr><w:tblW w:w="5652" w:type="pct"/><w:tblInd w:w="-601" w:type="dxa"/><w:tblBorders><w:top w:val="single" w:sz="4" w:space="0" w:color="auto"/><w:left w:val="single" w:sz="4" w:space="0" w:color="auto"/><w:bottom w:val="single" w:sz="4" w:space="0" w:color="auto"/><w:right w:val="single" w:sz="4" w:space="0" w:color="auto"/><w:insideH w:val="single" w:sz="4" w:space="0" w:color="auto"/><w:insideV w:val="single" w:sz="4" w:space="0" w:color="auto"/></w:tblBorders><w:tblLook w:val="0000" w:firstRow="0" w:lastRow="0" w:firstColumn="0" w:lastColumn="0" w:noHBand="0" w:noVBand="0"/></w:tblPr><w:tblGrid><w:gridCol w:w="9640"/></w:tblGrid><w:tr><w:trPr><w:trHeight w:val="567"/></w:trPr><w:tc><w:tcPr><w:tcW w:w="5000" w:type="pct"/><w:shd w:val="pct10" w:color="auto" w:fill="auto"/><w:vAlign w:val="center"/></w:tcPr><w:p><w:pPr><w:jc w:val="center"/><w:rPr><w:sz w:val="18"/><w:szCs w:val="18"/></w:rPr></w:pPr><w:r><w:rPr><w:b/><w:sz w:val="18"/><w:szCs w:val="18"/><w:lang w:val="el-GR"/></w:rPr><w:t>ΕΠΑΓΓΕΛΜΑΤΙΚΗ ΕΜΠΕΙΡΙΑ</w:t></w:r></w:p></w:tc></w:tr></w:tbl><w:p><w:pPr><w:rPr><w:sz w:val="18"/><w:szCs w:val="18"/><w:lang w:val="el-GR"/></w:rPr></w:pPr></w:p><w:tbl><w:tblPr><w:tblW w:w="5652" w:type="pct"/><w:tblInd w:w="-601" w:type="dxa"/><w:tblBorders><w:top w:val="single" w:sz="4" w:space="0" w:color="auto"/><w:left w:val="single" w:sz="4" w:space="0" w:color="auto"/><w:bottom w:val="single" w:sz="4" w:space="0" w:color="auto"/><w:right w:val="single" w:sz="4" w:space="0" w:color="auto"/><w:insideH w:val="single" w:sz="4" w:space="0" w:color="auto"/><w:insideV w:val="single" w:sz="4" w:space="0" w:color="auto"/></w:tblBorders><w:tblLook w:val="0000" w:firstRow="0" w:lastRow="0" w:firstColumn="0" w:lastColumn="0" w:noHBand="0" w:noVBand="0"/></w:tblPr><w:tblGrid><w:gridCol w:w="3917"/><w:gridCol w:w="1307"/><w:gridCol w:w="2506"/><w:gridCol w:w="1910"/></w:tblGrid><w:tr><w:trPr><w:cantSplit/><w:tblHeader/></w:trPr><w:tc><w:tcPr><w:tcW w:w="2048" w:type="pct"/><w:vMerge w:val="restart"/><w:shd w:val="clear" w:color="auto" w:fill="E6E6E6"/><w:vAlign w:val="center"/></w:tcPr><w:p><w:pPr><w:jc w:val="center"/><w:rPr><w:rFonts w:ascii="Calibri" w:hAnsi="Calibri" w:cs="Calibri"/><w:b/><w:sz w:val="20"/><w:szCs w:val="20"/><w:lang w:val="el-GR"/></w:rPr></w:pPr><w:r><w:rPr><w:rFonts w:ascii="Calibri" w:hAnsi="Calibri" w:cs="Calibri"/><w:b/><w:sz w:val="20"/><w:szCs w:val="20"/><w:lang w:val="el-GR"/></w:rPr><w:t>Έργο</w:t></w:r></w:p></w:tc><w:tc><w:tcPr><w:tcW w:w="629" w:type="pct"/><w:vMerge w:val="restart"/><w:shd w:val="clear" w:color="auto" w:fill="E6E6E6"/><w:vAlign w:val="center"/></w:tcPr><w:p><w:pPr><w:jc w:val="center"/><w:rPr><w:rFonts w:ascii="Calibri" w:hAnsi="Calibri" w:cs="Calibri"/><w:b/><w:sz w:val="20"/><w:szCs w:val="20"/><w:lang w:val="el-GR"/></w:rPr></w:pPr><w:r><w:rPr><w:rFonts w:ascii="Calibri" w:hAnsi="Calibri" w:cs="Calibri"/><w:b/><w:sz w:val="20"/><w:szCs w:val="20"/><w:lang w:val="el-GR"/></w:rPr><w:t>Εργοδότης</w:t></w:r></w:p></w:tc><w:tc><w:tcPr><w:tcW w:w="1316" w:type="pct"/><w:vMerge w:val="restart"/><w:shd w:val="clear" w:color="auto" w:fill="E6E6E6"/><w:vAlign w:val="center"/></w:tcPr><w:p><w:pPr><w:jc w:val="center"/><w:rPr><w:rFonts w:ascii="Calibri" w:hAnsi="Calibri" w:cs="Calibri"/><w:sz w:val="20"/><w:szCs w:val="20"/><w:lang w:val="el-GR"/></w:rPr></w:pPr><w:r><w:rPr><w:rFonts w:ascii="Calibri" w:hAnsi="Calibri" w:cs="Calibri"/><w:b/><w:sz w:val="20"/><w:szCs w:val="20"/><w:lang w:val="el-GR"/></w:rPr><w:t xml:space="preserve">Θέση και Καθήκοντα στο Έργο </w:t></w:r></w:p></w:tc><w:tc><w:tcPr><w:tcW w:w="1007" w:type="pct"/><w:shd w:val="clear" w:color="auto" w:fill="E6E6E6"/><w:vAlign w:val="center"/></w:tcPr><w:p><w:pPr><w:jc w:val="center"/><w:rPr><w:rFonts w:ascii="Calibri" w:hAnsi="Calibri" w:cs="Calibri"/><w:b/><w:sz w:val="20"/><w:szCs w:val="20"/><w:lang w:val="el-GR"/></w:rPr></w:pPr><w:r><w:rPr><w:rFonts w:ascii="Calibri" w:hAnsi="Calibri" w:cs="Calibri"/><w:b/><w:sz w:val="20"/><w:szCs w:val="20"/><w:lang w:val="el-GR"/></w:rPr><w:t>Απασχόληση στο Έργο</w:t></w:r></w:p></w:tc></w:tr><w:tr><w:trPr><w:cantSplit/><w:tblHeader/></w:trPr><w:tc><w:tcPr><w:tcW w:w="2048" w:type="pct"/><w:vMerge/><w:vAlign w:val="center"/></w:tcPr><w:p><w:pPr><w:jc w:val="left"/><w:rPr><w:rFonts w:ascii="Calibri" w:hAnsi="Calibri" w:cs="Calibri"/><w:b/><w:sz w:val="20"/><w:szCs w:val="20"/><w:lang w:val="el-GR"/></w:rPr></w:pPr></w:p></w:tc><w:tc><w:tcPr><w:tcW w:w="629" w:type="pct"/><w:vMerge/><w:vAlign w:val="center"/></w:tcPr><w:p><w:pPr><w:jc w:val="center"/><w:rPr><w:rFonts w:ascii="Calibri" w:hAnsi="Calibri" w:cs="Calibri"/><w:b/><w:sz w:val="20"/><w:szCs w:val="20"/><w:lang w:val="el-GR"/></w:rPr></w:pPr></w:p></w:tc><w:tc><w:tcPr><w:tcW w:w="1316" w:type="pct"/><w:vMerge/><w:vAlign w:val="center"/></w:tcPr><w:p><w:pPr><w:jc w:val="left"/><w:rPr><w:rFonts w:ascii="Calibri" w:hAnsi="Calibri" w:cs="Calibri"/><w:b/><w:sz w:val="20"/><w:szCs w:val="20"/><w:lang w:val="el-GR"/></w:rPr></w:pPr></w:p></w:tc><w:tc><w:tcPr><w:tcW w:w="1007" w:type="pct"/><w:shd w:val="clear" w:color="auto" w:fill="E6E6E6"/><w:vAlign w:val="center"/></w:tcPr><w:p><w:pPr><w:jc w:val="center"/><w:rPr><w:rFonts w:ascii="Calibri" w:hAnsi="Calibri" w:cs="Calibri"/><w:b/><w:sz w:val="20"/><w:szCs w:val="20"/><w:lang w:val="el-GR"/></w:rPr></w:pPr><w:r><w:rPr><w:rFonts w:ascii="Calibri" w:hAnsi="Calibri" w:cs="Calibri"/><w:b/><w:sz w:val="20"/><w:szCs w:val="20"/><w:lang w:val="el-GR"/></w:rPr><w:t>Περίοδος</w:t></w:r></w:p><w:p><w:pPr><w:jc w:val="center"/><w:rPr><w:rFonts w:ascii="Calibri" w:hAnsi="Calibri" w:cs="Calibri"/><w:b/><w:sz w:val="20"/><w:szCs w:val="20"/><w:lang w:val="el-GR"/></w:rPr></w:pPr><w:r><w:rPr><w:rFonts w:ascii="Calibri" w:hAnsi="Calibri" w:cs="Calibri"/><w:sz w:val="20"/><w:szCs w:val="20"/><w:lang w:val="el-GR"/></w:rPr><w:t xml:space="preserve">(από </w:t></w:r><w:r><w:rPr><w:rFonts w:ascii="Calibri" w:hAnsi="Calibri" w:cs="Calibri"/><w:b/><w:sz w:val="20"/><w:szCs w:val="20"/><w:lang w:val="el-GR"/></w:rPr><w:t>-</w:t></w:r><w:r><w:rPr><w:rFonts w:ascii="Calibri" w:hAnsi="Calibri" w:cs="Calibri"/><w:sz w:val="20"/><w:szCs w:val="20"/><w:lang w:val="el-GR"/></w:rPr><w:t xml:space="preserve"> έως)</w:t></w:r></w:p></w:tc></w:tr><w:tr w14:paraId="EXP00001"><w:trPr><w:cantSplit/></w:trPr><w:tc><w:tcPr><w:tcW w:w="2048" w:type="pct"/><w:vAlign w:val="center"/></w:tcPr><w:p><w:pPr><w:spacing w:before="0"/><w:jc w:val="left"/><w:rPr><w:rFonts w:ascii="Calibri" w:hAnsi="Calibri" w:cs="Calibri"/><w:sz w:val="20"/><w:szCs w:val="20"/><w:lang w:val="el-GR"/></w:rPr></w:pPr><w:r><w:rPr><w:rFonts w:ascii="Calibri" w:hAnsi="Calibri" w:cs="Calibri"/><w:sz w:val="20"/><w:szCs w:val="20"/><w:lang w:val="el-GR"/></w:rPr><w:t>{#experienceRows}{projectText}</w:t></w:r></w:p></w:tc><w:tc><w:tcPr><w:tcW w:w="629" w:type="pct"/><w:vAlign w:val="center"/></w:tcPr><w:p><w:pPr><w:spacing w:before="0"/><w:jc w:val="center"/><w:rPr><w:rFonts w:ascii="Calibri" w:hAnsi="Calibri" w:cs="Calibri"/><w:sz w:val="20"/><w:szCs w:val="20"/><w:lang w:val="el-GR"/></w:rPr></w:pPr><w:r><w:rPr><w:rFonts w:ascii="Calibri" w:hAnsi="Calibri" w:cs="Calibri"/><w:sz w:val="20"/><w:szCs w:val="20"/><w:lang w:val="el-GR"/></w:rPr><w:t>{employerName}</w:t></w:r></w:p></w:tc><w:tc><w:tcPr><w:tcW w:w="1316" w:type="pct"/><w:vAlign w:val="center"/></w:tcPr><w:p><w:pPr><w:jc w:val="center"/><w:rPr><w:rFonts w:ascii="Calibri" w:hAnsi="Calibri" w:cs="Calibri"/><w:sz w:val="20"/><w:szCs w:val="20"/><w:lang w:val="el-GR"/></w:rPr></w:pPr><w:r><w:rPr><w:rFonts w:ascii="Calibri" w:hAnsi="Calibri" w:cs="Calibri"/><w:sz w:val="20"/><w:szCs w:val="20"/><w:lang w:val="el-GR"/></w:rPr><w:t>{roleName}</w:t></w:r></w:p></w:tc><w:tc><w:tcPr><w:tcW w:w="1007" w:type="pct"/><w:vAlign w:val="center"/></w:tcPr><w:p><w:pPr><w:jc w:val="center"/><w:rPr><w:rFonts w:ascii="Calibri" w:hAnsi="Calibri" w:cs="Calibri"/><w:sz w:val="20"/><w:szCs w:val="20"/><w:lang w:val="el-GR"/></w:rPr></w:pPr><w:r><w:rPr><w:rFonts w:ascii="Calibri" w:hAnsi="Calibri" w:cs="Calibri"/><w:sz w:val="20"/><w:szCs w:val="20"/><w:lang w:val="el-GR"/></w:rPr><w:t>{period}{/experienceRows}</w:t></w:r></w:p></w:tc></w:tr></w:tbl><w:p><w:pPr><w:rPr><w:sz w:val="18"/><w:szCs w:val="18"/><w:lang w:val="en-US"/></w:rPr></w:pPr></w:p><w:p><w:r><w:t>{#hasPublications}</w:t></w:r></w:p><w:tbl><w:tblPr><w:tblW w:w="5652" w:type="pct"/><w:tblInd w:w="-601" w:type="dxa"/><w:tblBorders><w:top w:val="single" w:sz="4" w:space="0" w:color="auto"/><w:left w:val="single" w:sz="4" w:space="0" w:color="auto"/><w:bottom w:val="single" w:sz="4" w:space="0" w:color="auto"/><w:right w:val="single" w:sz="4" w:space="0" w:color="auto"/><w:insideH w:val="single" w:sz="4" w:space="0" w:color="auto"/><w:insideV w:val="single" w:sz="4" w:space="0" w:color="auto"/></w:tblBorders><w:tblLook w:val="0000" w:firstRow="0" w:lastRow="0" w:firstColumn="0" w:lastColumn="0" w:noHBand="0" w:noVBand="0"/></w:tblPr><w:tblGrid><w:gridCol w:w="9640"/></w:tblGrid><w:tr w:rsidR="00PUB001" w14:paraId="PUB00001"><w:trPr><w:trHeight w:val="567"/></w:trPr><w:tc><w:tcPr><w:tcW w:w="5000" w:type="pct"/><w:shd w:val="pct10" w:color="auto" w:fill="auto"/><w:vAlign w:val="center"/></w:tcPr><w:p><w:pPr><w:jc w:val="center"/><w:rPr><w:sz w:val="18"/><w:szCs w:val="18"/></w:rPr></w:pPr><w:r><w:rPr><w:b/><w:sz w:val="18"/><w:szCs w:val="18"/><w:lang w:val="el-GR"/></w:rPr><w:t>ΔΗΜΟΣΙΕΥΣΕΙΣ</w:t></w:r></w:p></w:tc></w:tr></w:tbl><w:p><w:pPr><w:rPr><w:sz w:val="18"/><w:szCs w:val="18"/><w:lang w:val="el-GR"/></w:rPr></w:pPr></w:p><w:tbl><w:tblPr><w:tblW w:w="5652" w:type="pct"/><w:tblInd w:w="-601" w:type="dxa"/><w:tblBorders><w:top w:val="single" w:sz="4" w:space="0" w:color="auto"/><w:left w:val="single" w:sz="4" w:space="0" w:color="auto"/><w:bottom w:val="single" w:sz="4" w:space="0" w:color="auto"/><w:right w:val="single" w:sz="4" w:space="0" w:color="auto"/><w:insideH w:val="single" w:sz="4" w:space="0" w:color="auto"/><w:insideV w:val="single" w:sz="4" w:space="0" w:color="auto"/></w:tblBorders><w:tblLook w:val="0000" w:firstRow="0" w:lastRow="0" w:firstColumn="0" w:lastColumn="0" w:noHBand="0" w:noVBand="0"/></w:tblPr><w:tblGrid><w:gridCol w:w="9640"/></w:tblGrid><w:tr w:rsidR="00PUB002" w14:paraId="PUB00002"><w:trPr><w:cantSplit/></w:trPr><w:tc><w:tcPr><w:tcW w:w="5000" w:type="pct"/><w:vAlign w:val="center"/></w:tcPr><w:p><w:pPr><w:spacing w:before="0"/><w:rPr><w:rFonts w:ascii="Calibri" w:hAnsi="Calibri" w:cs="Calibri"/><w:sz w:val="20"/><w:szCs w:val="20"/><w:lang w:val="el-GR"/></w:rPr></w:pPr><w:r><w:rPr><w:rFonts w:ascii="Calibri" w:hAnsi="Calibri" w:cs="Calibri"/><w:sz w:val="20"/><w:szCs w:val="20"/><w:lang w:val="el-GR"/></w:rPr><w:t>{publicationsText}</w:t></w:r></w:p></w:tc></w:tr></w:tbl><w:p><w:r><w:t>{/hasPublications}</w:t></w:r></w:p><w:sectPr><w:pgSz w:w="11906" w:h="16838"/><w:pgMar w:top="1440" w:right="1797" w:bottom="1440" w:left="1797" w:header="709" w:footer="709" w:gutter="0"/><w:cols w:space="708"/><w:docGrid w:linePitch="360"/></w:sectPr></w:body></w:document>
 </file>
 
 <file path=word/numbering.xml><?xml version="1.0" encoding="utf-8"?>

</xml_diff>

<commit_message>
CV template: fix missing </w:p> in ΚΑΤΗΓΟΡΙΑ ΣΤΕΛΕΧΟΥΣ cell — caused Word to reject the file
Co-Authored-By: Claude Sonnet 4.6 <noreply@anthropic.com>
</commit_message>
<xml_diff>
--- a/backend/templates/cv_template_placeholders.docx
+++ b/backend/templates/cv_template_placeholders.docx
@@ -1,6 +1,2074 @@
 
-<file path=word/document.xml><?xml version="1.0" encoding="UTF-8" standalone="yes"?>
-<w:document xmlns:wpc="http://schemas.microsoft.com/office/word/2010/wordprocessingCanvas" xmlns:cx="http://schemas.microsoft.com/office/drawing/2014/chartex" xmlns:cx1="http://schemas.microsoft.com/office/drawing/2015/9/8/chartex" xmlns:cx2="http://schemas.microsoft.com/office/drawing/2015/10/21/chartex" xmlns:cx3="http://schemas.microsoft.com/office/drawing/2016/5/9/chartex" xmlns:cx4="http://schemas.microsoft.com/office/drawing/2016/5/10/chartex" xmlns:cx5="http://schemas.microsoft.com/office/drawing/2016/5/11/chartex" xmlns:cx6="http://schemas.microsoft.com/office/drawing/2016/5/12/chartex" xmlns:cx7="http://schemas.microsoft.com/office/drawing/2016/5/13/chartex" xmlns:cx8="http://schemas.microsoft.com/office/drawing/2016/5/14/chartex" xmlns:mc="http://schemas.openxmlformats.org/markup-compatibility/2006" xmlns:aink="http://schemas.microsoft.com/office/drawing/2016/ink" xmlns:am3d="http://schemas.microsoft.com/office/drawing/2017/model3d" xmlns:o="urn:schemas-microsoft-com:office:office" xmlns:oel="http://schemas.microsoft.com/office/2019/extlst" xmlns:r="http://schemas.openxmlformats.org/officeDocument/2006/relationships" xmlns:m="http://schemas.openxmlformats.org/officeDocument/2006/math" xmlns:v="urn:schemas-microsoft-com:vml" xmlns:wp14="http://schemas.microsoft.com/office/word/2010/wordprocessingDrawing" xmlns:wp="http://schemas.openxmlformats.org/drawingml/2006/wordprocessingDrawing" xmlns:w10="urn:schemas-microsoft-com:office:word" xmlns:w="http://schemas.openxmlformats.org/wordprocessingml/2006/main" xmlns:w14="http://schemas.microsoft.com/office/word/2010/wordml" xmlns:w15="http://schemas.microsoft.com/office/word/2012/wordml" xmlns:w16cex="http://schemas.microsoft.com/office/word/2018/wordml/cex" xmlns:w16cid="http://schemas.microsoft.com/office/word/2016/wordml/cid" xmlns:w16="http://schemas.microsoft.com/office/word/2018/wordml" xmlns:w16du="http://schemas.microsoft.com/office/word/2023/wordml/word16du" xmlns:w16sdtdh="http://schemas.microsoft.com/office/word/2020/wordml/sdtdatahash" xmlns:w16sdtfl="http://schemas.microsoft.com/office/word/2024/wordml/sdtformatlock" xmlns:w16se="http://schemas.microsoft.com/office/word/2015/wordml/symex" xmlns:wpg="http://schemas.microsoft.com/office/word/2010/wordprocessingGroup" xmlns:wpi="http://schemas.microsoft.com/office/word/2010/wordprocessingInk" xmlns:wne="http://schemas.microsoft.com/office/word/2006/wordml" xmlns:wps="http://schemas.microsoft.com/office/word/2010/wordprocessingShape" mc:Ignorable="w14 w15 w16se w16cid w16 w16cex w16sdtdh w16sdtfl w16du wp14"><w:body><w:p><w:pPr><w:jc w:val="right"/><w:rPr><w:sz w:val="18"/><w:szCs w:val="18"/><w:lang w:val="el-GR"/></w:rPr></w:pPr></w:p><w:tbl><w:tblPr><w:tblW w:w="5000" w:type="pct"/><w:tblLook w:val="0000" w:firstRow="0" w:lastRow="0" w:firstColumn="0" w:lastColumn="0" w:noHBand="0" w:noVBand="0"/></w:tblPr><w:tblGrid><w:gridCol w:w="1443"/><w:gridCol w:w="332"/><w:gridCol w:w="305"/><w:gridCol w:w="24"/><w:gridCol w:w="13"/><w:gridCol w:w="385"/><w:gridCol w:w="281"/><w:gridCol w:w="711"/><w:gridCol w:w="827"/><w:gridCol w:w="18"/><w:gridCol w:w="1208"/><w:gridCol w:w="67"/><w:gridCol w:w="381"/><w:gridCol w:w="113"/><w:gridCol w:w="226"/><w:gridCol w:w="49"/><w:gridCol w:w="413"/><w:gridCol w:w="1732"/></w:tblGrid><w:tr><w:trPr><w:trHeight w:val="567"/></w:trPr><w:tc><w:tcPr><w:tcW w:w="5000" w:type="pct"/><w:gridSpan w:val="18"/><w:tcBorders><w:top w:val="single" w:sz="6" w:space="0" w:color="auto"/><w:left w:val="single" w:sz="6" w:space="0" w:color="auto"/><w:bottom w:val="single" w:sz="6" w:space="0" w:color="auto"/><w:right w:val="single" w:sz="6" w:space="0" w:color="auto"/></w:tcBorders><w:shd w:val="pct10" w:color="auto" w:fill="auto"/><w:vAlign w:val="center"/></w:tcPr><w:p><w:pPr><w:jc w:val="center"/><w:rPr><w:b/><w:sz w:val="18"/><w:szCs w:val="18"/><w:lang w:val="el-GR"/></w:rPr></w:pPr><w:r><w:rPr><w:b/><w:sz w:val="18"/><w:szCs w:val="18"/><w:lang w:val="el-GR"/></w:rPr><w:t>ΒΙΟΓΡΑΦΙΚΟ ΣΗΜΕΙΩΜΑ</w:t></w:r></w:p></w:tc></w:tr><w:tr><w:tc><w:tcPr><w:tcW w:w="5000" w:type="pct"/><w:gridSpan w:val="18"/></w:tcPr><w:p><w:pPr><w:rPr><w:sz w:val="18"/><w:szCs w:val="18"/><w:lang w:val="el-GR"/></w:rPr></w:pPr></w:p></w:tc></w:tr><w:tr><w:tc><w:tcPr><w:tcW w:w="2054" w:type="pct"/><w:gridSpan w:val="8"/><w:tcBorders><w:top w:val="single" w:sz="6" w:space="0" w:color="auto"/><w:left w:val="single" w:sz="6" w:space="0" w:color="auto"/><w:bottom w:val="single" w:sz="6" w:space="0" w:color="auto"/><w:right w:val="single" w:sz="6" w:space="0" w:color="auto"/></w:tcBorders><w:shd w:val="pct10" w:color="auto" w:fill="auto"/><w:vAlign w:val="center"/></w:tcPr><w:p><w:pPr><w:rPr><w:b/><w:sz w:val="18"/><w:szCs w:val="18"/><w:lang w:val="el-GR"/></w:rPr></w:pPr><w:r><w:rPr><w:b/><w:sz w:val="18"/><w:szCs w:val="18"/><w:lang w:val="el-GR"/></w:rPr><w:t>ΠΡΟΣΩΠΙΚΑ ΣΤΟΙΧΕΙΑ</w:t></w:r></w:p></w:tc><w:tc><w:tcPr><w:tcW w:w="2946" w:type="pct"/><w:gridSpan w:val="10"/><w:vAlign w:val="center"/></w:tcPr><w:p><w:pPr><w:rPr><w:sz w:val="18"/><w:szCs w:val="18"/><w:lang w:val="el-GR"/></w:rPr></w:pPr></w:p></w:tc></w:tr><w:tr><w:tc><w:tcPr><w:tcW w:w="847" w:type="pct"/><w:tcBorders><w:top w:val="double" w:sz="6" w:space="0" w:color="auto"/><w:left w:val="double" w:sz="6" w:space="0" w:color="auto"/><w:bottom w:val="nil"/><w:right w:val="nil"/></w:tcBorders><w:vAlign w:val="center"/></w:tcPr><w:p><w:pPr><w:rPr><w:b/><w:sz w:val="18"/><w:szCs w:val="18"/><w:lang w:val="el-GR"/></w:rPr></w:pPr><w:r><w:rPr><w:b/><w:sz w:val="18"/><w:szCs w:val="18"/><w:lang w:val="el-GR"/></w:rPr><w:t>Επώνυμο:</w:t></w:r></w:p></w:tc><w:tc><w:tcPr><w:tcW w:w="1708" w:type="pct"/><w:gridSpan w:val="9"/><w:tcBorders><w:top w:val="double" w:sz="6" w:space="0" w:color="auto"/><w:left w:val="nil"/><w:bottom w:val="single" w:sz="6" w:space="0" w:color="auto"/><w:right w:val="nil"/></w:tcBorders><w:vAlign w:val="center"/></w:tcPr><w:p><w:pPr><w:rPr><w:sz w:val="18"/><w:szCs w:val="18"/><w:lang w:val="el-GR"/></w:rPr></w:pPr><w:r><w:rPr><w:sz w:val="18"/><w:szCs w:val="18"/><w:lang w:val="el-GR"/></w:rPr><w:t xml:space="preserve">{lastName} </w:t></w:r></w:p></w:tc><w:tc><w:tcPr><w:tcW w:w="709" w:type="pct"/><w:tcBorders><w:top w:val="double" w:sz="6" w:space="0" w:color="auto"/><w:left w:val="nil"/><w:bottom w:val="nil"/><w:right w:val="nil"/></w:tcBorders><w:vAlign w:val="center"/></w:tcPr><w:p><w:pPr><w:rPr><w:b/><w:sz w:val="18"/><w:szCs w:val="18"/><w:lang w:val="el-GR"/></w:rPr></w:pPr><w:r><w:rPr><w:b/><w:sz w:val="18"/><w:szCs w:val="18"/><w:lang w:val="el-GR"/></w:rPr><w:t>Όνομα:</w:t></w:r></w:p></w:tc><w:tc><w:tcPr><w:tcW w:w="1735" w:type="pct"/><w:gridSpan w:val="7"/><w:tcBorders><w:top w:val="double" w:sz="6" w:space="0" w:color="auto"/><w:left w:val="nil"/><w:bottom w:val="single" w:sz="6" w:space="0" w:color="auto"/><w:right w:val="double" w:sz="6" w:space="0" w:color="auto"/></w:tcBorders><w:vAlign w:val="center"/></w:tcPr><w:p><w:pPr><w:rPr><w:sz w:val="18"/><w:szCs w:val="18"/><w:lang w:val="el-GR"/></w:rPr></w:pPr><w:r><w:rPr><w:sz w:val="18"/><w:szCs w:val="18"/><w:lang w:val="el-GR"/></w:rPr><w:t>{firstName}</w:t></w:r></w:p></w:tc></w:tr><w:tr><w:trPr><w:trHeight w:val="247"/></w:trPr><w:tc><w:tcPr><w:tcW w:w="5000" w:type="pct"/><w:gridSpan w:val="18"/><w:tcBorders><w:top w:val="nil"/><w:left w:val="double" w:sz="6" w:space="0" w:color="auto"/><w:bottom w:val="nil"/><w:right w:val="double" w:sz="6" w:space="0" w:color="auto"/></w:tcBorders><w:vAlign w:val="center"/></w:tcPr><w:p><w:pPr><w:rPr><w:sz w:val="18"/><w:szCs w:val="18"/><w:lang w:val="el-GR"/></w:rPr></w:pPr></w:p></w:tc></w:tr><w:tr><w:tc><w:tcPr><w:tcW w:w="1043" w:type="pct"/><w:gridSpan w:val="2"/><w:tcBorders><w:top w:val="nil"/><w:left w:val="double" w:sz="6" w:space="0" w:color="auto"/><w:bottom w:val="nil"/><w:right w:val="nil"/></w:tcBorders><w:vAlign w:val="center"/></w:tcPr><w:p><w:pPr><w:rPr><w:b/><w:sz w:val="18"/><w:szCs w:val="18"/><w:lang w:val="el-GR"/></w:rPr></w:pPr><w:r><w:rPr><w:b/><w:sz w:val="18"/><w:szCs w:val="18"/><w:lang w:val="el-GR"/></w:rPr><w:t>Πατρώνυμο:</w:t></w:r></w:p></w:tc><w:tc><w:tcPr><w:tcW w:w="1513" w:type="pct"/><w:gridSpan w:val="8"/><w:tcBorders><w:top w:val="nil"/><w:left w:val="nil"/><w:bottom w:val="single" w:sz="6" w:space="0" w:color="auto"/><w:right w:val="nil"/></w:tcBorders><w:vAlign w:val="center"/></w:tcPr><w:p><w:pPr><w:rPr><w:sz w:val="18"/><w:szCs w:val="18"/><w:lang w:val="el-GR"/></w:rPr></w:pPr><w:r><w:rPr><w:sz w:val="18"/><w:szCs w:val="18"/><w:lang w:val="el-GR"/></w:rPr><w:t>{fatherName}</w:t></w:r></w:p></w:tc><w:tc><w:tcPr><w:tcW w:w="1033" w:type="pct"/><w:gridSpan w:val="4"/><w:vAlign w:val="center"/></w:tcPr><w:p><w:pPr><w:rPr><w:b/><w:sz w:val="18"/><w:szCs w:val="18"/><w:lang w:val="el-GR"/></w:rPr></w:pPr><w:r><w:rPr><w:b/><w:sz w:val="18"/><w:szCs w:val="18"/><w:lang w:val="el-GR"/></w:rPr><w:t>Μητρώνυμο:</w:t></w:r></w:p></w:tc><w:tc><w:tcPr><w:tcW w:w="1411" w:type="pct"/><w:gridSpan w:val="4"/><w:tcBorders><w:top w:val="nil"/><w:left w:val="nil"/><w:bottom w:val="single" w:sz="6" w:space="0" w:color="auto"/><w:right w:val="double" w:sz="6" w:space="0" w:color="auto"/></w:tcBorders><w:vAlign w:val="center"/></w:tcPr><w:p><w:pPr><w:rPr><w:sz w:val="18"/><w:szCs w:val="18"/><w:lang w:val="el-GR"/></w:rPr></w:pPr><w:r><w:rPr><w:sz w:val="18"/><w:szCs w:val="18"/><w:lang w:val="el-GR"/></w:rPr><w:t>{motherName}</w:t></w:r></w:p></w:tc></w:tr><w:tr><w:tc><w:tcPr><w:tcW w:w="5000" w:type="pct"/><w:gridSpan w:val="18"/><w:tcBorders><w:top w:val="nil"/><w:left w:val="double" w:sz="6" w:space="0" w:color="auto"/><w:bottom w:val="nil"/><w:right w:val="double" w:sz="6" w:space="0" w:color="auto"/></w:tcBorders><w:vAlign w:val="center"/></w:tcPr><w:p><w:pPr><w:rPr><w:sz w:val="18"/><w:szCs w:val="18"/><w:lang w:val="el-GR"/></w:rPr></w:pPr></w:p></w:tc></w:tr><w:tr><w:tc><w:tcPr><w:tcW w:w="1238" w:type="pct"/><w:gridSpan w:val="4"/><w:tcBorders><w:top w:val="nil"/><w:left w:val="double" w:sz="6" w:space="0" w:color="auto"/><w:bottom w:val="nil"/><w:right w:val="nil"/></w:tcBorders><w:vAlign w:val="center"/></w:tcPr><w:p><w:pPr><w:rPr><w:b/><w:sz w:val="18"/><w:szCs w:val="18"/><w:lang w:val="el-GR"/></w:rPr></w:pPr><w:r><w:rPr><w:b/><w:sz w:val="18"/><w:szCs w:val="18"/><w:lang w:val="el-GR"/></w:rPr><w:t>Ημερομηνία Γέννησης:</w:t></w:r></w:p></w:tc><w:tc><w:tcPr><w:tcW w:w="1317" w:type="pct"/><w:gridSpan w:val="6"/><w:tcBorders><w:top w:val="nil"/><w:left w:val="nil"/><w:bottom w:val="single" w:sz="6" w:space="0" w:color="auto"/><w:right w:val="nil"/></w:tcBorders><w:vAlign w:val="center"/></w:tcPr><w:p><w:pPr><w:rPr><w:sz w:val="18"/><w:szCs w:val="18"/><w:lang w:val="el-GR"/></w:rPr></w:pPr><w:r><w:rPr><w:sz w:val="18"/><w:szCs w:val="18"/><w:lang w:val="el-GR"/></w:rPr><w:t>{dateOfBirth}</w:t></w:r></w:p></w:tc><w:tc><w:tcPr><w:tcW w:w="1163" w:type="pct"/><w:gridSpan w:val="5"/><w:vAlign w:val="center"/></w:tcPr><w:p><w:pPr><w:rPr><w:b/><w:sz w:val="18"/><w:szCs w:val="18"/></w:rPr></w:pPr><w:r><w:rPr><w:b/><w:sz w:val="18"/><w:szCs w:val="18"/><w:lang w:val="el-GR"/></w:rPr><w:t>Τόπος Γέννησης</w:t></w:r><w:r><w:rPr><w:b/><w:sz w:val="18"/><w:szCs w:val="18"/></w:rPr><w:t>:</w:t></w:r></w:p></w:tc><w:tc><w:tcPr><w:tcW w:w="1281" w:type="pct"/><w:gridSpan w:val="3"/><w:tcBorders><w:top w:val="nil"/><w:left w:val="nil"/><w:bottom w:val="single" w:sz="6" w:space="0" w:color="auto"/><w:right w:val="double" w:sz="6" w:space="0" w:color="auto"/></w:tcBorders><w:vAlign w:val="center"/></w:tcPr><w:p><w:pPr><w:rPr><w:sz w:val="18"/><w:szCs w:val="18"/><w:lang w:val="el-GR"/></w:rPr></w:pPr><w:r><w:rPr><w:sz w:val="18"/><w:szCs w:val="18"/><w:lang w:val="el-GR"/></w:rPr><w:t>{placeOfBirth}</w:t></w:r></w:p></w:tc></w:tr><w:tr><w:trPr><w:trHeight w:val="65"/></w:trPr><w:tc><w:tcPr><w:tcW w:w="5000" w:type="pct"/><w:gridSpan w:val="18"/><w:tcBorders><w:top w:val="nil"/><w:left w:val="double" w:sz="6" w:space="0" w:color="auto"/><w:bottom w:val="nil"/><w:right w:val="double" w:sz="6" w:space="0" w:color="auto"/></w:tcBorders><w:vAlign w:val="center"/></w:tcPr><w:p><w:pPr><w:rPr><w:sz w:val="18"/><w:szCs w:val="18"/><w:lang w:val="el-GR"/></w:rPr></w:pPr></w:p></w:tc></w:tr><w:tr><w:tc><w:tcPr><w:tcW w:w="1640" w:type="pct"/><w:gridSpan w:val="7"/><w:tcBorders><w:top w:val="nil"/><w:left w:val="double" w:sz="6" w:space="0" w:color="auto"/><w:bottom w:val="nil"/><w:right w:val="nil"/></w:tcBorders><w:vAlign w:val="center"/></w:tcPr><w:p><w:pPr><w:rPr><w:b/><w:sz w:val="18"/><w:szCs w:val="18"/></w:rPr></w:pPr><w:r><w:rPr><w:b/><w:sz w:val="18"/><w:szCs w:val="18"/><w:lang w:val="el-GR"/></w:rPr><w:t>Τηλέφωνο</w:t></w:r><w:r><w:rPr><w:b/><w:sz w:val="18"/><w:szCs w:val="18"/></w:rPr><w:t>:</w:t></w:r></w:p></w:tc><w:tc><w:tcPr><w:tcW w:w="916" w:type="pct"/><w:gridSpan w:val="3"/><w:tcBorders><w:top w:val="nil"/><w:left w:val="nil"/><w:bottom w:val="single" w:sz="6" w:space="0" w:color="auto"/><w:right w:val="nil"/></w:tcBorders><w:vAlign w:val="center"/></w:tcPr><w:p><w:pPr><w:rPr><w:sz w:val="18"/><w:szCs w:val="18"/><w:lang w:val="el-GR"/></w:rPr></w:pPr><w:r><w:rPr><w:sz w:val="18"/><w:szCs w:val="18"/><w:lang w:val="el-GR"/></w:rPr><w:t>{phone}</w:t></w:r></w:p></w:tc><w:tc><w:tcPr><w:tcW w:w="968" w:type="pct"/><w:gridSpan w:val="3"/><w:vAlign w:val="center"/></w:tcPr><w:p><w:pPr><w:rPr><w:b/><w:sz w:val="18"/><w:szCs w:val="18"/><w:lang w:val="en-US"/></w:rPr></w:pPr><w:r><w:rPr><w:b/><w:sz w:val="18"/><w:szCs w:val="18"/><w:lang w:val="en-US"/></w:rPr><w:t>E-mail:</w:t></w:r></w:p></w:tc><w:tc><w:tcPr><w:tcW w:w="1476" w:type="pct"/><w:gridSpan w:val="5"/><w:tcBorders><w:top w:val="nil"/><w:left w:val="nil"/><w:bottom w:val="single" w:sz="6" w:space="0" w:color="auto"/><w:right w:val="double" w:sz="6" w:space="0" w:color="auto"/></w:tcBorders><w:vAlign w:val="center"/></w:tcPr><w:p><w:pPr><w:rPr><w:sz w:val="18"/><w:szCs w:val="18"/><w:lang w:val="en-US"/></w:rPr></w:pPr><w:r><w:rPr><w:sz w:val="18"/><w:szCs w:val="18"/><w:lang w:val="en-US"/></w:rPr><w:t>{email}</w:t></w:r></w:p></w:tc></w:tr><w:tr><w:tc><w:tcPr><w:tcW w:w="1640" w:type="pct"/><w:gridSpan w:val="7"/><w:tcBorders><w:top w:val="nil"/><w:left w:val="double" w:sz="6" w:space="0" w:color="auto"/><w:bottom w:val="nil"/><w:right w:val="nil"/></w:tcBorders><w:vAlign w:val="center"/></w:tcPr><w:p><w:pPr><w:rPr><w:b/><w:sz w:val="18"/><w:szCs w:val="18"/><w:lang w:val="en-US"/></w:rPr></w:pPr><w:r><w:rPr><w:b/><w:sz w:val="18"/><w:szCs w:val="18"/><w:lang w:val="en-US"/></w:rPr><w:t>Fax:</w:t></w:r></w:p></w:tc><w:tc><w:tcPr><w:tcW w:w="916" w:type="pct"/><w:gridSpan w:val="3"/><w:tcBorders><w:top w:val="nil"/><w:left w:val="nil"/><w:bottom w:val="single" w:sz="6" w:space="0" w:color="auto"/><w:right w:val="nil"/></w:tcBorders><w:vAlign w:val="center"/></w:tcPr><w:p><w:pPr><w:rPr><w:sz w:val="18"/><w:szCs w:val="18"/><w:lang w:val="en-US"/></w:rPr></w:pPr></w:p></w:tc><w:tc><w:tcPr><w:tcW w:w="968" w:type="pct"/><w:gridSpan w:val="3"/><w:vAlign w:val="center"/></w:tcPr><w:p><w:pPr><w:rPr><w:b/><w:sz w:val="18"/><w:szCs w:val="18"/><w:lang w:val="en-US"/></w:rPr></w:pPr></w:p></w:tc><w:tc><w:tcPr><w:tcW w:w="1476" w:type="pct"/><w:gridSpan w:val="5"/><w:tcBorders><w:top w:val="single" w:sz="6" w:space="0" w:color="auto"/><w:left w:val="nil"/><w:bottom w:val="nil"/><w:right w:val="double" w:sz="6" w:space="0" w:color="auto"/></w:tcBorders><w:vAlign w:val="center"/></w:tcPr><w:p><w:pPr><w:rPr><w:sz w:val="18"/><w:szCs w:val="18"/><w:lang w:val="en-US"/></w:rPr></w:pPr></w:p></w:tc></w:tr><w:tr><w:tc><w:tcPr><w:tcW w:w="1247" w:type="pct"/><w:gridSpan w:val="5"/><w:tcBorders><w:top w:val="nil"/><w:left w:val="double" w:sz="6" w:space="0" w:color="auto"/><w:bottom w:val="nil"/><w:right w:val="nil"/></w:tcBorders><w:vAlign w:val="center"/></w:tcPr><w:p><w:pPr><w:rPr><w:sz w:val="18"/><w:szCs w:val="18"/><w:lang w:val="en-US"/></w:rPr></w:pPr></w:p></w:tc><w:tc><w:tcPr><w:tcW w:w="1297" w:type="pct"/><w:gridSpan w:val="4"/><w:vAlign w:val="center"/></w:tcPr><w:p><w:pPr><w:rPr><w:sz w:val="18"/><w:szCs w:val="18"/><w:lang w:val="en-US"/></w:rPr></w:pPr></w:p></w:tc><w:tc><w:tcPr><w:tcW w:w="1203" w:type="pct"/><w:gridSpan w:val="7"/><w:vAlign w:val="center"/></w:tcPr><w:p><w:pPr><w:rPr><w:sz w:val="18"/><w:szCs w:val="18"/><w:lang w:val="en-US"/></w:rPr></w:pPr></w:p></w:tc><w:tc><w:tcPr><w:tcW w:w="1253" w:type="pct"/><w:gridSpan w:val="2"/><w:tcBorders><w:top w:val="nil"/><w:left w:val="nil"/><w:bottom w:val="nil"/><w:right w:val="double" w:sz="6" w:space="0" w:color="auto"/></w:tcBorders><w:vAlign w:val="center"/></w:tcPr><w:p><w:pPr><w:rPr><w:sz w:val="18"/><w:szCs w:val="18"/><w:lang w:val="en-US"/></w:rPr></w:pPr></w:p></w:tc></w:tr><w:tr><w:tc><w:tcPr><w:tcW w:w="1474" w:type="pct"/><w:gridSpan w:val="6"/><w:tcBorders><w:top w:val="nil"/><w:left w:val="double" w:sz="6" w:space="0" w:color="auto"/><w:bottom w:val="nil"/><w:right w:val="nil"/></w:tcBorders><w:vAlign w:val="center"/></w:tcPr><w:p><w:pPr><w:rPr><w:b/><w:sz w:val="18"/><w:szCs w:val="18"/></w:rPr></w:pPr><w:r><w:rPr><w:b/><w:sz w:val="18"/><w:szCs w:val="18"/><w:lang w:val="el-GR"/></w:rPr><w:t>Διεύθυνση Κατοικίας</w:t></w:r><w:r><w:rPr><w:b/><w:sz w:val="18"/><w:szCs w:val="18"/></w:rPr><w:t>:</w:t></w:r></w:p></w:tc><w:tc><w:tcPr><w:tcW w:w="3526" w:type="pct"/><w:gridSpan w:val="12"/><w:tcBorders><w:top w:val="nil"/><w:left w:val="nil"/><w:bottom w:val="single" w:sz="6" w:space="0" w:color="auto"/><w:right w:val="double" w:sz="6" w:space="0" w:color="auto"/></w:tcBorders><w:vAlign w:val="center"/></w:tcPr><w:p><w:pPr><w:rPr><w:sz w:val="18"/><w:szCs w:val="18"/><w:lang w:val="el-GR"/></w:rPr></w:pPr><w:r><w:rPr><w:sz w:val="18"/><w:szCs w:val="18"/><w:lang w:val="el-GR"/></w:rPr><w:t xml:space="preserve">{homeAddress}</w:t></w:r></w:p></w:tc></w:tr><w:tr><w:tc><w:tcPr><w:tcW w:w="1247" w:type="pct"/><w:gridSpan w:val="5"/><w:tcBorders><w:top w:val="nil"/><w:left w:val="double" w:sz="6" w:space="0" w:color="auto"/><w:bottom w:val="double" w:sz="6" w:space="0" w:color="auto"/><w:right w:val="nil"/></w:tcBorders><w:vAlign w:val="center"/></w:tcPr><w:p><w:pPr><w:rPr><w:sz w:val="18"/><w:szCs w:val="18"/><w:lang w:val="el-GR"/></w:rPr></w:pPr></w:p></w:tc><w:tc><w:tcPr><w:tcW w:w="1297" w:type="pct"/><w:gridSpan w:val="4"/><w:tcBorders><w:top w:val="nil"/><w:left w:val="nil"/><w:bottom w:val="double" w:sz="6" w:space="0" w:color="auto"/><w:right w:val="nil"/></w:tcBorders><w:vAlign w:val="center"/></w:tcPr><w:p><w:pPr><w:rPr><w:sz w:val="18"/><w:szCs w:val="18"/><w:lang w:val="el-GR"/></w:rPr></w:pPr></w:p></w:tc><w:tc><w:tcPr><w:tcW w:w="1203" w:type="pct"/><w:gridSpan w:val="7"/><w:tcBorders><w:top w:val="nil"/><w:left w:val="nil"/><w:bottom w:val="double" w:sz="6" w:space="0" w:color="auto"/><w:right w:val="nil"/></w:tcBorders><w:vAlign w:val="center"/></w:tcPr><w:p><w:pPr><w:rPr><w:sz w:val="18"/><w:szCs w:val="18"/><w:lang w:val="el-GR"/></w:rPr></w:pPr></w:p></w:tc><w:tc><w:tcPr><w:tcW w:w="1253" w:type="pct"/><w:gridSpan w:val="2"/><w:tcBorders><w:top w:val="nil"/><w:left w:val="nil"/><w:bottom w:val="double" w:sz="6" w:space="0" w:color="auto"/><w:right w:val="double" w:sz="6" w:space="0" w:color="auto"/></w:tcBorders><w:vAlign w:val="center"/></w:tcPr><w:p><w:pPr><w:rPr><w:sz w:val="18"/><w:szCs w:val="18"/><w:lang w:val="el-GR"/></w:rPr></w:pPr></w:p></w:tc></w:tr><w:tr><w:tc><w:tcPr><w:tcW w:w="5000" w:type="pct"/><w:gridSpan w:val="18"/></w:tcPr><w:p><w:pPr><w:rPr><w:sz w:val="18"/><w:szCs w:val="18"/><w:lang w:val="el-GR"/></w:rPr></w:pPr></w:p><w:p><w:pPr><w:rPr><w:sz w:val="18"/><w:szCs w:val="18"/><w:lang w:val="el-GR"/></w:rPr></w:pPr></w:p></w:tc></w:tr><w:tr><w:tc><w:tcPr><w:tcW w:w="1223" w:type="pct"/><w:gridSpan w:val="3"/><w:tcBorders><w:top w:val="single" w:sz="6" w:space="0" w:color="auto"/><w:left w:val="single" w:sz="6" w:space="0" w:color="auto"/><w:bottom w:val="single" w:sz="6" w:space="0" w:color="auto"/><w:right w:val="single" w:sz="6" w:space="0" w:color="auto"/></w:tcBorders><w:shd w:val="pct10" w:color="auto" w:fill="auto"/></w:tcPr><w:p><w:pPr><w:rPr><w:b/><w:sz w:val="18"/><w:szCs w:val="18"/><w:lang w:val="el-GR"/></w:rPr></w:pPr><w:r><w:rPr><w:b/><w:sz w:val="18"/><w:szCs w:val="18"/><w:lang w:val="el-GR"/></w:rPr><w:t>ΕΚΠΑΙΔΕΥΣΗ</w:t></w:r></w:p></w:tc><w:tc><w:tcPr><w:tcW w:w="3777" w:type="pct"/><w:gridSpan w:val="15"/></w:tcPr><w:p><w:pPr><w:rPr><w:sz w:val="18"/><w:szCs w:val="18"/><w:lang w:val="el-GR"/></w:rPr></w:pPr></w:p></w:tc></w:tr><w:tr><w:tc><w:tcPr><w:tcW w:w="2058" w:type="pct"/><w:gridSpan w:val="8"/><w:tcBorders><w:top w:val="double" w:sz="6" w:space="0" w:color="auto"/><w:left w:val="double" w:sz="6" w:space="0" w:color="auto"/><w:bottom w:val="nil"/><w:right w:val="single" w:sz="6" w:space="0" w:color="auto"/></w:tcBorders><w:vAlign w:val="center"/></w:tcPr><w:p><w:pPr><w:jc w:val="center"/><w:rPr><w:b/><w:sz w:val="18"/><w:szCs w:val="18"/><w:lang w:val="el-GR"/></w:rPr></w:pPr><w:r><w:rPr><w:b/><w:sz w:val="18"/><w:szCs w:val="18"/><w:lang w:val="el-GR"/></w:rPr><w:t>Όνομα Ιδρύματος</w:t></w:r></w:p></w:tc><w:tc><w:tcPr><w:tcW w:w="1247" w:type="pct"/><w:gridSpan w:val="4"/><w:tcBorders><w:top w:val="double" w:sz="6" w:space="0" w:color="auto"/><w:left w:val="nil"/><w:bottom w:val="nil"/><w:right w:val="single" w:sz="6" w:space="0" w:color="auto"/></w:tcBorders><w:vAlign w:val="center"/></w:tcPr><w:p><w:pPr><w:jc w:val="center"/><w:rPr><w:b/><w:sz w:val="18"/><w:szCs w:val="18"/><w:lang w:val="el-GR"/></w:rPr></w:pPr><w:r><w:rPr><w:b/><w:sz w:val="18"/><w:szCs w:val="18"/><w:lang w:val="el-GR"/></w:rPr><w:t>Τίτλος Πτυχίου</w:t></w:r></w:p></w:tc><w:tc><w:tcPr><w:tcW w:w="679" w:type="pct"/><w:gridSpan w:val="5"/><w:tcBorders><w:top w:val="double" w:sz="6" w:space="0" w:color="auto"/><w:left w:val="nil"/><w:bottom w:val="nil"/><w:right w:val="single" w:sz="6" w:space="0" w:color="auto"/></w:tcBorders><w:vAlign w:val="center"/></w:tcPr><w:p><w:pPr><w:jc w:val="center"/><w:rPr><w:b/><w:sz w:val="18"/><w:szCs w:val="18"/><w:lang w:val="el-GR"/></w:rPr></w:pPr><w:r><w:rPr><w:b/><w:sz w:val="18"/><w:szCs w:val="18"/><w:lang w:val="el-GR"/></w:rPr><w:t>Ειδικότητα</w:t></w:r></w:p></w:tc><w:tc><w:tcPr><w:tcW w:w="1016" w:type="pct"/><w:tcBorders><w:top w:val="double" w:sz="6" w:space="0" w:color="auto"/><w:left w:val="nil"/><w:bottom w:val="nil"/><w:right w:val="double" w:sz="6" w:space="0" w:color="auto"/></w:tcBorders><w:vAlign w:val="center"/></w:tcPr><w:p><w:pPr><w:jc w:val="center"/><w:rPr><w:b/><w:sz w:val="18"/><w:szCs w:val="18"/><w:lang w:val="el-GR"/></w:rPr></w:pPr><w:r><w:rPr><w:b/><w:sz w:val="18"/><w:szCs w:val="18"/><w:lang w:val="el-GR"/></w:rPr><w:t>Ημερομηνία Απόκτησης Πτυχίου</w:t></w:r></w:p></w:tc></w:tr><w:tr w14:paraId="EDU00001"><w:tc><w:tcPr><w:tcW w:w="2058" w:type="pct"/><w:gridSpan w:val="8"/><w:tcBorders><w:top w:val="double" w:sz="6" w:space="0" w:color="auto"/><w:left w:val="double" w:sz="6" w:space="0" w:color="auto"/><w:bottom w:val="single" w:sz="6" w:space="0" w:color="auto"/><w:right w:val="single" w:sz="6" w:space="0" w:color="auto"/></w:tcBorders></w:tcPr><w:p><w:pPr><w:rPr><w:rFonts w:ascii="Calibri" w:hAnsi="Calibri"/><w:sz w:val="20"/><w:szCs w:val="22"/><w:lang w:val="el-GR"/></w:rPr></w:pPr><w:r><w:rPr><w:rFonts w:ascii="Calibri" w:hAnsi="Calibri"/><w:sz w:val="20"/><w:szCs w:val="22"/><w:lang w:val="el-GR"/></w:rPr><w:t>{#educationRows}{institutionFull}</w:t></w:r></w:p></w:tc><w:tc><w:tcPr><w:tcW w:w="1247" w:type="pct"/><w:gridSpan w:val="4"/><w:tcBorders><w:top w:val="double" w:sz="6" w:space="0" w:color="auto"/><w:left w:val="nil"/><w:bottom w:val="single" w:sz="6" w:space="0" w:color="auto"/><w:right w:val="single" w:sz="6" w:space="0" w:color="auto"/></w:tcBorders><w:vAlign w:val="center"/></w:tcPr><w:p><w:pPr><w:jc w:val="center"/><w:rPr><w:rFonts w:ascii="Calibri" w:hAnsi="Calibri"/><w:sz w:val="20"/><w:szCs w:val="22"/><w:lang w:val="el-GR"/></w:rPr></w:pPr><w:r><w:rPr><w:rFonts w:ascii="Calibri" w:hAnsi="Calibri"/><w:sz w:val="20"/><w:szCs w:val="22"/><w:lang w:val="el-GR"/></w:rPr><w:t>{degreeTitle}</w:t></w:r></w:p></w:tc><w:tc><w:tcPr><w:tcW w:w="679" w:type="pct"/><w:gridSpan w:val="5"/><w:tcBorders><w:top w:val="double" w:sz="6" w:space="0" w:color="auto"/><w:left w:val="nil"/><w:bottom w:val="single" w:sz="6" w:space="0" w:color="auto"/><w:right w:val="single" w:sz="6" w:space="0" w:color="auto"/></w:tcBorders></w:tcPr><w:p><w:pPr><w:rPr><w:rFonts w:ascii="Calibri" w:hAnsi="Calibri"/><w:sz w:val="20"/><w:szCs w:val="22"/><w:lang w:val="el-GR"/></w:rPr></w:pPr><w:r><w:rPr><w:rFonts w:ascii="Calibri" w:hAnsi="Calibri"/><w:sz w:val="20"/><w:szCs w:val="22"/><w:lang w:val="el-GR"/></w:rPr><w:t>{specialization}</w:t></w:r></w:p></w:tc><w:tc><w:tcPr><w:tcW w:w="1016" w:type="pct"/><w:tcBorders><w:top w:val="double" w:sz="6" w:space="0" w:color="auto"/><w:left w:val="nil"/><w:bottom w:val="single" w:sz="6" w:space="0" w:color="auto"/><w:right w:val="double" w:sz="6" w:space="0" w:color="auto"/></w:tcBorders></w:tcPr><w:p><w:pPr><w:jc w:val="center"/><w:rPr><w:rFonts w:ascii="Calibri" w:hAnsi="Calibri"/><w:sz w:val="20"/><w:szCs w:val="22"/><w:lang w:val="el-GR"/></w:rPr></w:pPr><w:r><w:rPr><w:rFonts w:ascii="Calibri" w:hAnsi="Calibri"/><w:sz w:val="20"/><w:szCs w:val="22"/><w:lang w:val="el-GR"/></w:rPr><w:t>{dateAwarded}{/educationRows}</w:t></w:r></w:p></w:tc></w:tr></w:tbl><w:p><w:pPr><w:rPr><w:sz w:val="18"/><w:szCs w:val="18"/><w:lang w:val="el-GR"/></w:rPr></w:pPr></w:p><w:tbl><w:tblPr><w:tblW w:w="5652" w:type="pct"/><w:tblInd w:w="-601" w:type="dxa"/><w:tblBorders><w:top w:val="single" w:sz="4" w:space="0" w:color="auto"/><w:left w:val="single" w:sz="4" w:space="0" w:color="auto"/><w:bottom w:val="single" w:sz="4" w:space="0" w:color="auto"/><w:right w:val="single" w:sz="4" w:space="0" w:color="auto"/><w:insideH w:val="single" w:sz="4" w:space="0" w:color="auto"/><w:insideV w:val="single" w:sz="4" w:space="0" w:color="auto"/></w:tblBorders><w:tblLook w:val="0000" w:firstRow="0" w:lastRow="0" w:firstColumn="0" w:lastColumn="0" w:noHBand="0" w:noVBand="0"/></w:tblPr><w:tblGrid><w:gridCol w:w="6266"/><w:gridCol w:w="3374"/></w:tblGrid><w:tr w:rsidR="00KAT001" w14:paraId="KAT00001"><w:trPr><w:trHeight w:val="400"/></w:trPr><w:tc><w:tcPr><w:tcW w:w="3250" w:type="pct"/><w:shd w:val="clear" w:color="auto" w:fill="D9D9D9"/><w:vAlign w:val="center"/></w:tcPr><w:p><w:pPr><w:rPr><w:b/><w:sz w:val="18"/><w:szCs w:val="18"/><w:lang w:val="el-GR"/></w:rPr></w:pPr><w:r><w:rPr><w:b/><w:sz w:val="18"/><w:szCs w:val="18"/><w:lang w:val="el-GR"/></w:rPr><w:t>ΚΑΤΗΓΟΡΙΑ ΣΤΕΛΕΧΟΥΣ</w:t></w:r></w:p></w:tc><w:tc><w:tcPr><w:tcW w:w="1750" w:type="pct"/><w:vAlign w:val="center"/></w:tcPr><w:p><w:pPr><w:rPr><w:sz w:val="18"/><w:szCs w:val="18"/><w:lang w:val="el-GR"/></w:rPr></w:pPr></w:tc></w:tr></w:tbl><w:p><w:pPr><w:ind w:right="-334"/><w:rPr><w:sz w:val="18"/><w:szCs w:val="18"/><w:lang w:val="el-GR"/></w:rPr><w:sectPr><w:pgSz w:w="11906" w:h="16838"/><w:pgMar w:top="1440" w:right="1797" w:bottom="1440" w:left="1797" w:header="709" w:footer="709" w:gutter="0"/><w:cols w:space="708"/><w:docGrid w:linePitch="360"/></w:sectPr></w:pPr></w:p><w:p><w:pPr><w:ind w:right="-334"/><w:rPr><w:sz w:val="18"/><w:szCs w:val="18"/><w:lang w:val="en-US"/></w:rPr></w:pPr></w:p><w:tbl><w:tblPr><w:tblW w:w="5652" w:type="pct"/><w:tblInd w:w="-601" w:type="dxa"/><w:tblBorders><w:top w:val="single" w:sz="4" w:space="0" w:color="auto"/><w:left w:val="single" w:sz="4" w:space="0" w:color="auto"/><w:bottom w:val="single" w:sz="4" w:space="0" w:color="auto"/><w:right w:val="single" w:sz="4" w:space="0" w:color="auto"/><w:insideH w:val="single" w:sz="4" w:space="0" w:color="auto"/><w:insideV w:val="single" w:sz="4" w:space="0" w:color="auto"/></w:tblBorders><w:tblLook w:val="0000" w:firstRow="0" w:lastRow="0" w:firstColumn="0" w:lastColumn="0" w:noHBand="0" w:noVBand="0"/></w:tblPr><w:tblGrid><w:gridCol w:w="9640"/></w:tblGrid><w:tr><w:trPr><w:trHeight w:val="567"/></w:trPr><w:tc><w:tcPr><w:tcW w:w="5000" w:type="pct"/><w:shd w:val="pct10" w:color="auto" w:fill="auto"/><w:vAlign w:val="center"/></w:tcPr><w:p><w:pPr><w:jc w:val="center"/><w:rPr><w:sz w:val="18"/><w:szCs w:val="18"/></w:rPr></w:pPr><w:r><w:rPr><w:b/><w:sz w:val="18"/><w:szCs w:val="18"/><w:lang w:val="el-GR"/></w:rPr><w:t>ΕΠΑΓΓΕΛΜΑΤΙΚΗ ΕΜΠΕΙΡΙΑ</w:t></w:r></w:p></w:tc></w:tr></w:tbl><w:p><w:pPr><w:rPr><w:sz w:val="18"/><w:szCs w:val="18"/><w:lang w:val="el-GR"/></w:rPr></w:pPr></w:p><w:tbl><w:tblPr><w:tblW w:w="5652" w:type="pct"/><w:tblInd w:w="-601" w:type="dxa"/><w:tblBorders><w:top w:val="single" w:sz="4" w:space="0" w:color="auto"/><w:left w:val="single" w:sz="4" w:space="0" w:color="auto"/><w:bottom w:val="single" w:sz="4" w:space="0" w:color="auto"/><w:right w:val="single" w:sz="4" w:space="0" w:color="auto"/><w:insideH w:val="single" w:sz="4" w:space="0" w:color="auto"/><w:insideV w:val="single" w:sz="4" w:space="0" w:color="auto"/></w:tblBorders><w:tblLook w:val="0000" w:firstRow="0" w:lastRow="0" w:firstColumn="0" w:lastColumn="0" w:noHBand="0" w:noVBand="0"/></w:tblPr><w:tblGrid><w:gridCol w:w="3917"/><w:gridCol w:w="1307"/><w:gridCol w:w="2506"/><w:gridCol w:w="1910"/></w:tblGrid><w:tr><w:trPr><w:cantSplit/><w:tblHeader/></w:trPr><w:tc><w:tcPr><w:tcW w:w="2048" w:type="pct"/><w:vMerge w:val="restart"/><w:shd w:val="clear" w:color="auto" w:fill="E6E6E6"/><w:vAlign w:val="center"/></w:tcPr><w:p><w:pPr><w:jc w:val="center"/><w:rPr><w:rFonts w:ascii="Calibri" w:hAnsi="Calibri" w:cs="Calibri"/><w:b/><w:sz w:val="20"/><w:szCs w:val="20"/><w:lang w:val="el-GR"/></w:rPr></w:pPr><w:r><w:rPr><w:rFonts w:ascii="Calibri" w:hAnsi="Calibri" w:cs="Calibri"/><w:b/><w:sz w:val="20"/><w:szCs w:val="20"/><w:lang w:val="el-GR"/></w:rPr><w:t>Έργο</w:t></w:r></w:p></w:tc><w:tc><w:tcPr><w:tcW w:w="629" w:type="pct"/><w:vMerge w:val="restart"/><w:shd w:val="clear" w:color="auto" w:fill="E6E6E6"/><w:vAlign w:val="center"/></w:tcPr><w:p><w:pPr><w:jc w:val="center"/><w:rPr><w:rFonts w:ascii="Calibri" w:hAnsi="Calibri" w:cs="Calibri"/><w:b/><w:sz w:val="20"/><w:szCs w:val="20"/><w:lang w:val="el-GR"/></w:rPr></w:pPr><w:r><w:rPr><w:rFonts w:ascii="Calibri" w:hAnsi="Calibri" w:cs="Calibri"/><w:b/><w:sz w:val="20"/><w:szCs w:val="20"/><w:lang w:val="el-GR"/></w:rPr><w:t>Εργοδότης</w:t></w:r></w:p></w:tc><w:tc><w:tcPr><w:tcW w:w="1316" w:type="pct"/><w:vMerge w:val="restart"/><w:shd w:val="clear" w:color="auto" w:fill="E6E6E6"/><w:vAlign w:val="center"/></w:tcPr><w:p><w:pPr><w:jc w:val="center"/><w:rPr><w:rFonts w:ascii="Calibri" w:hAnsi="Calibri" w:cs="Calibri"/><w:sz w:val="20"/><w:szCs w:val="20"/><w:lang w:val="el-GR"/></w:rPr></w:pPr><w:r><w:rPr><w:rFonts w:ascii="Calibri" w:hAnsi="Calibri" w:cs="Calibri"/><w:b/><w:sz w:val="20"/><w:szCs w:val="20"/><w:lang w:val="el-GR"/></w:rPr><w:t xml:space="preserve">Θέση και Καθήκοντα στο Έργο </w:t></w:r></w:p></w:tc><w:tc><w:tcPr><w:tcW w:w="1007" w:type="pct"/><w:shd w:val="clear" w:color="auto" w:fill="E6E6E6"/><w:vAlign w:val="center"/></w:tcPr><w:p><w:pPr><w:jc w:val="center"/><w:rPr><w:rFonts w:ascii="Calibri" w:hAnsi="Calibri" w:cs="Calibri"/><w:b/><w:sz w:val="20"/><w:szCs w:val="20"/><w:lang w:val="el-GR"/></w:rPr></w:pPr><w:r><w:rPr><w:rFonts w:ascii="Calibri" w:hAnsi="Calibri" w:cs="Calibri"/><w:b/><w:sz w:val="20"/><w:szCs w:val="20"/><w:lang w:val="el-GR"/></w:rPr><w:t>Απασχόληση στο Έργο</w:t></w:r></w:p></w:tc></w:tr><w:tr><w:trPr><w:cantSplit/><w:tblHeader/></w:trPr><w:tc><w:tcPr><w:tcW w:w="2048" w:type="pct"/><w:vMerge/><w:vAlign w:val="center"/></w:tcPr><w:p><w:pPr><w:jc w:val="left"/><w:rPr><w:rFonts w:ascii="Calibri" w:hAnsi="Calibri" w:cs="Calibri"/><w:b/><w:sz w:val="20"/><w:szCs w:val="20"/><w:lang w:val="el-GR"/></w:rPr></w:pPr></w:p></w:tc><w:tc><w:tcPr><w:tcW w:w="629" w:type="pct"/><w:vMerge/><w:vAlign w:val="center"/></w:tcPr><w:p><w:pPr><w:jc w:val="center"/><w:rPr><w:rFonts w:ascii="Calibri" w:hAnsi="Calibri" w:cs="Calibri"/><w:b/><w:sz w:val="20"/><w:szCs w:val="20"/><w:lang w:val="el-GR"/></w:rPr></w:pPr></w:p></w:tc><w:tc><w:tcPr><w:tcW w:w="1316" w:type="pct"/><w:vMerge/><w:vAlign w:val="center"/></w:tcPr><w:p><w:pPr><w:jc w:val="left"/><w:rPr><w:rFonts w:ascii="Calibri" w:hAnsi="Calibri" w:cs="Calibri"/><w:b/><w:sz w:val="20"/><w:szCs w:val="20"/><w:lang w:val="el-GR"/></w:rPr></w:pPr></w:p></w:tc><w:tc><w:tcPr><w:tcW w:w="1007" w:type="pct"/><w:shd w:val="clear" w:color="auto" w:fill="E6E6E6"/><w:vAlign w:val="center"/></w:tcPr><w:p><w:pPr><w:jc w:val="center"/><w:rPr><w:rFonts w:ascii="Calibri" w:hAnsi="Calibri" w:cs="Calibri"/><w:b/><w:sz w:val="20"/><w:szCs w:val="20"/><w:lang w:val="el-GR"/></w:rPr></w:pPr><w:r><w:rPr><w:rFonts w:ascii="Calibri" w:hAnsi="Calibri" w:cs="Calibri"/><w:b/><w:sz w:val="20"/><w:szCs w:val="20"/><w:lang w:val="el-GR"/></w:rPr><w:t>Περίοδος</w:t></w:r></w:p><w:p><w:pPr><w:jc w:val="center"/><w:rPr><w:rFonts w:ascii="Calibri" w:hAnsi="Calibri" w:cs="Calibri"/><w:b/><w:sz w:val="20"/><w:szCs w:val="20"/><w:lang w:val="el-GR"/></w:rPr></w:pPr><w:r><w:rPr><w:rFonts w:ascii="Calibri" w:hAnsi="Calibri" w:cs="Calibri"/><w:sz w:val="20"/><w:szCs w:val="20"/><w:lang w:val="el-GR"/></w:rPr><w:t xml:space="preserve">(από </w:t></w:r><w:r><w:rPr><w:rFonts w:ascii="Calibri" w:hAnsi="Calibri" w:cs="Calibri"/><w:b/><w:sz w:val="20"/><w:szCs w:val="20"/><w:lang w:val="el-GR"/></w:rPr><w:t>-</w:t></w:r><w:r><w:rPr><w:rFonts w:ascii="Calibri" w:hAnsi="Calibri" w:cs="Calibri"/><w:sz w:val="20"/><w:szCs w:val="20"/><w:lang w:val="el-GR"/></w:rPr><w:t xml:space="preserve"> έως)</w:t></w:r></w:p></w:tc></w:tr><w:tr w14:paraId="EXP00001"><w:trPr><w:cantSplit/></w:trPr><w:tc><w:tcPr><w:tcW w:w="2048" w:type="pct"/><w:vAlign w:val="center"/></w:tcPr><w:p><w:pPr><w:spacing w:before="0"/><w:jc w:val="left"/><w:rPr><w:rFonts w:ascii="Calibri" w:hAnsi="Calibri" w:cs="Calibri"/><w:sz w:val="20"/><w:szCs w:val="20"/><w:lang w:val="el-GR"/></w:rPr></w:pPr><w:r><w:rPr><w:rFonts w:ascii="Calibri" w:hAnsi="Calibri" w:cs="Calibri"/><w:sz w:val="20"/><w:szCs w:val="20"/><w:lang w:val="el-GR"/></w:rPr><w:t>{#experienceRows}{projectText}</w:t></w:r></w:p></w:tc><w:tc><w:tcPr><w:tcW w:w="629" w:type="pct"/><w:vAlign w:val="center"/></w:tcPr><w:p><w:pPr><w:spacing w:before="0"/><w:jc w:val="center"/><w:rPr><w:rFonts w:ascii="Calibri" w:hAnsi="Calibri" w:cs="Calibri"/><w:sz w:val="20"/><w:szCs w:val="20"/><w:lang w:val="el-GR"/></w:rPr></w:pPr><w:r><w:rPr><w:rFonts w:ascii="Calibri" w:hAnsi="Calibri" w:cs="Calibri"/><w:sz w:val="20"/><w:szCs w:val="20"/><w:lang w:val="el-GR"/></w:rPr><w:t>{employerName}</w:t></w:r></w:p></w:tc><w:tc><w:tcPr><w:tcW w:w="1316" w:type="pct"/><w:vAlign w:val="center"/></w:tcPr><w:p><w:pPr><w:jc w:val="center"/><w:rPr><w:rFonts w:ascii="Calibri" w:hAnsi="Calibri" w:cs="Calibri"/><w:sz w:val="20"/><w:szCs w:val="20"/><w:lang w:val="el-GR"/></w:rPr></w:pPr><w:r><w:rPr><w:rFonts w:ascii="Calibri" w:hAnsi="Calibri" w:cs="Calibri"/><w:sz w:val="20"/><w:szCs w:val="20"/><w:lang w:val="el-GR"/></w:rPr><w:t>{roleName}</w:t></w:r></w:p></w:tc><w:tc><w:tcPr><w:tcW w:w="1007" w:type="pct"/><w:vAlign w:val="center"/></w:tcPr><w:p><w:pPr><w:jc w:val="center"/><w:rPr><w:rFonts w:ascii="Calibri" w:hAnsi="Calibri" w:cs="Calibri"/><w:sz w:val="20"/><w:szCs w:val="20"/><w:lang w:val="el-GR"/></w:rPr></w:pPr><w:r><w:rPr><w:rFonts w:ascii="Calibri" w:hAnsi="Calibri" w:cs="Calibri"/><w:sz w:val="20"/><w:szCs w:val="20"/><w:lang w:val="el-GR"/></w:rPr><w:t>{period}{/experienceRows}</w:t></w:r></w:p></w:tc></w:tr></w:tbl><w:p><w:pPr><w:rPr><w:sz w:val="18"/><w:szCs w:val="18"/><w:lang w:val="en-US"/></w:rPr></w:pPr></w:p><w:p><w:r><w:t>{#hasPublications}</w:t></w:r></w:p><w:tbl><w:tblPr><w:tblW w:w="5652" w:type="pct"/><w:tblInd w:w="-601" w:type="dxa"/><w:tblBorders><w:top w:val="single" w:sz="4" w:space="0" w:color="auto"/><w:left w:val="single" w:sz="4" w:space="0" w:color="auto"/><w:bottom w:val="single" w:sz="4" w:space="0" w:color="auto"/><w:right w:val="single" w:sz="4" w:space="0" w:color="auto"/><w:insideH w:val="single" w:sz="4" w:space="0" w:color="auto"/><w:insideV w:val="single" w:sz="4" w:space="0" w:color="auto"/></w:tblBorders><w:tblLook w:val="0000" w:firstRow="0" w:lastRow="0" w:firstColumn="0" w:lastColumn="0" w:noHBand="0" w:noVBand="0"/></w:tblPr><w:tblGrid><w:gridCol w:w="9640"/></w:tblGrid><w:tr w:rsidR="00PUB001" w14:paraId="PUB00001"><w:trPr><w:trHeight w:val="567"/></w:trPr><w:tc><w:tcPr><w:tcW w:w="5000" w:type="pct"/><w:shd w:val="pct10" w:color="auto" w:fill="auto"/><w:vAlign w:val="center"/></w:tcPr><w:p><w:pPr><w:jc w:val="center"/><w:rPr><w:sz w:val="18"/><w:szCs w:val="18"/></w:rPr></w:pPr><w:r><w:rPr><w:b/><w:sz w:val="18"/><w:szCs w:val="18"/><w:lang w:val="el-GR"/></w:rPr><w:t>ΔΗΜΟΣΙΕΥΣΕΙΣ</w:t></w:r></w:p></w:tc></w:tr></w:tbl><w:p><w:pPr><w:rPr><w:sz w:val="18"/><w:szCs w:val="18"/><w:lang w:val="el-GR"/></w:rPr></w:pPr></w:p><w:tbl><w:tblPr><w:tblW w:w="5652" w:type="pct"/><w:tblInd w:w="-601" w:type="dxa"/><w:tblBorders><w:top w:val="single" w:sz="4" w:space="0" w:color="auto"/><w:left w:val="single" w:sz="4" w:space="0" w:color="auto"/><w:bottom w:val="single" w:sz="4" w:space="0" w:color="auto"/><w:right w:val="single" w:sz="4" w:space="0" w:color="auto"/><w:insideH w:val="single" w:sz="4" w:space="0" w:color="auto"/><w:insideV w:val="single" w:sz="4" w:space="0" w:color="auto"/></w:tblBorders><w:tblLook w:val="0000" w:firstRow="0" w:lastRow="0" w:firstColumn="0" w:lastColumn="0" w:noHBand="0" w:noVBand="0"/></w:tblPr><w:tblGrid><w:gridCol w:w="9640"/></w:tblGrid><w:tr w:rsidR="00PUB002" w14:paraId="PUB00002"><w:trPr><w:cantSplit/></w:trPr><w:tc><w:tcPr><w:tcW w:w="5000" w:type="pct"/><w:vAlign w:val="center"/></w:tcPr><w:p><w:pPr><w:spacing w:before="0"/><w:rPr><w:rFonts w:ascii="Calibri" w:hAnsi="Calibri" w:cs="Calibri"/><w:sz w:val="20"/><w:szCs w:val="20"/><w:lang w:val="el-GR"/></w:rPr></w:pPr><w:r><w:rPr><w:rFonts w:ascii="Calibri" w:hAnsi="Calibri" w:cs="Calibri"/><w:sz w:val="20"/><w:szCs w:val="20"/><w:lang w:val="el-GR"/></w:rPr><w:t>{publicationsText}</w:t></w:r></w:p></w:tc></w:tr></w:tbl><w:p><w:r><w:t>{/hasPublications}</w:t></w:r></w:p><w:sectPr><w:pgSz w:w="11906" w:h="16838"/><w:pgMar w:top="1440" w:right="1797" w:bottom="1440" w:left="1797" w:header="709" w:footer="709" w:gutter="0"/><w:cols w:space="708"/><w:docGrid w:linePitch="360"/></w:sectPr></w:body></w:document>
+<file path=word/document.xml><?xml version="1.0" encoding="utf-8"?>
+<w:document xmlns:wpc="http://schemas.microsoft.com/office/word/2010/wordprocessingCanvas" xmlns:cx="http://schemas.microsoft.com/office/drawing/2014/chartex" xmlns:cx1="http://schemas.microsoft.com/office/drawing/2015/9/8/chartex" xmlns:cx2="http://schemas.microsoft.com/office/drawing/2015/10/21/chartex" xmlns:cx3="http://schemas.microsoft.com/office/drawing/2016/5/9/chartex" xmlns:cx4="http://schemas.microsoft.com/office/drawing/2016/5/10/chartex" xmlns:cx5="http://schemas.microsoft.com/office/drawing/2016/5/11/chartex" xmlns:cx6="http://schemas.microsoft.com/office/drawing/2016/5/12/chartex" xmlns:cx7="http://schemas.microsoft.com/office/drawing/2016/5/13/chartex" xmlns:cx8="http://schemas.microsoft.com/office/drawing/2016/5/14/chartex" xmlns:mc="http://schemas.openxmlformats.org/markup-compatibility/2006" xmlns:aink="http://schemas.microsoft.com/office/drawing/2016/ink" xmlns:am3d="http://schemas.microsoft.com/office/drawing/2017/model3d" xmlns:o="urn:schemas-microsoft-com:office:office" xmlns:oel="http://schemas.microsoft.com/office/2019/extlst" xmlns:r="http://schemas.openxmlformats.org/officeDocument/2006/relationships" xmlns:m="http://schemas.openxmlformats.org/officeDocument/2006/math" xmlns:v="urn:schemas-microsoft-com:vml" xmlns:wp14="http://schemas.microsoft.com/office/word/2010/wordprocessingDrawing" xmlns:wp="http://schemas.openxmlformats.org/drawingml/2006/wordprocessingDrawing" xmlns:w10="urn:schemas-microsoft-com:office:word" xmlns:w="http://schemas.openxmlformats.org/wordprocessingml/2006/main" xmlns:w14="http://schemas.microsoft.com/office/word/2010/wordml" xmlns:w15="http://schemas.microsoft.com/office/word/2012/wordml" xmlns:w16cex="http://schemas.microsoft.com/office/word/2018/wordml/cex" xmlns:w16cid="http://schemas.microsoft.com/office/word/2016/wordml/cid" xmlns:w16="http://schemas.microsoft.com/office/word/2018/wordml" xmlns:w16du="http://schemas.microsoft.com/office/word/2023/wordml/word16du" xmlns:w16sdtdh="http://schemas.microsoft.com/office/word/2020/wordml/sdtdatahash" xmlns:w16sdtfl="http://schemas.microsoft.com/office/word/2024/wordml/sdtformatlock" xmlns:w16se="http://schemas.microsoft.com/office/word/2015/wordml/symex" xmlns:wpg="http://schemas.microsoft.com/office/word/2010/wordprocessingGroup" xmlns:wpi="http://schemas.microsoft.com/office/word/2010/wordprocessingInk" xmlns:wne="http://schemas.microsoft.com/office/word/2006/wordml" xmlns:wps="http://schemas.microsoft.com/office/word/2010/wordprocessingShape" mc:Ignorable="w14 w15 w16se w16cid w16 w16cex w16sdtdh w16sdtfl w16du wp14">
+  <w:body>
+    <w:p>
+      <w:pPr>
+        <w:jc w:val="right"/>
+        <w:rPr>
+          <w:sz w:val="18"/>
+          <w:szCs w:val="18"/>
+          <w:lang w:val="el-GR"/>
+        </w:rPr>
+      </w:pPr>
+    </w:p>
+    <w:tbl>
+      <w:tblPr>
+        <w:tblW w:w="5000" w:type="pct"/>
+        <w:tblLook w:val="0000" w:firstRow="0" w:lastRow="0" w:firstColumn="0" w:lastColumn="0" w:noHBand="0" w:noVBand="0"/>
+      </w:tblPr>
+      <w:tblGrid>
+        <w:gridCol w:w="1443"/>
+        <w:gridCol w:w="332"/>
+        <w:gridCol w:w="305"/>
+        <w:gridCol w:w="24"/>
+        <w:gridCol w:w="13"/>
+        <w:gridCol w:w="385"/>
+        <w:gridCol w:w="281"/>
+        <w:gridCol w:w="711"/>
+        <w:gridCol w:w="827"/>
+        <w:gridCol w:w="18"/>
+        <w:gridCol w:w="1208"/>
+        <w:gridCol w:w="67"/>
+        <w:gridCol w:w="381"/>
+        <w:gridCol w:w="113"/>
+        <w:gridCol w:w="226"/>
+        <w:gridCol w:w="49"/>
+        <w:gridCol w:w="413"/>
+        <w:gridCol w:w="1732"/>
+      </w:tblGrid>
+      <w:tr>
+        <w:trPr>
+          <w:trHeight w:val="567"/>
+        </w:trPr>
+        <w:tc>
+          <w:tcPr>
+            <w:tcW w:w="5000" w:type="pct"/>
+            <w:gridSpan w:val="18"/>
+            <w:tcBorders>
+              <w:top w:val="single" w:sz="6" w:space="0" w:color="auto"/>
+              <w:left w:val="single" w:sz="6" w:space="0" w:color="auto"/>
+              <w:bottom w:val="single" w:sz="6" w:space="0" w:color="auto"/>
+              <w:right w:val="single" w:sz="6" w:space="0" w:color="auto"/>
+            </w:tcBorders>
+            <w:shd w:val="pct10" w:color="auto" w:fill="auto"/>
+            <w:vAlign w:val="center"/>
+          </w:tcPr>
+          <w:p>
+            <w:pPr>
+              <w:jc w:val="center"/>
+              <w:rPr>
+                <w:b/>
+                <w:sz w:val="18"/>
+                <w:szCs w:val="18"/>
+                <w:lang w:val="el-GR"/>
+              </w:rPr>
+            </w:pPr>
+            <w:r>
+              <w:rPr>
+                <w:b/>
+                <w:sz w:val="18"/>
+                <w:szCs w:val="18"/>
+                <w:lang w:val="el-GR"/>
+              </w:rPr>
+              <w:t>ΒΙΟΓΡΑΦΙΚΟ ΣΗΜΕΙΩΜΑ</w:t>
+            </w:r>
+          </w:p>
+        </w:tc>
+      </w:tr>
+      <w:tr>
+        <w:tc>
+          <w:tcPr>
+            <w:tcW w:w="5000" w:type="pct"/>
+            <w:gridSpan w:val="18"/>
+          </w:tcPr>
+          <w:p>
+            <w:pPr>
+              <w:rPr>
+                <w:sz w:val="18"/>
+                <w:szCs w:val="18"/>
+                <w:lang w:val="el-GR"/>
+              </w:rPr>
+            </w:pPr>
+          </w:p>
+        </w:tc>
+      </w:tr>
+      <w:tr>
+        <w:tc>
+          <w:tcPr>
+            <w:tcW w:w="2054" w:type="pct"/>
+            <w:gridSpan w:val="8"/>
+            <w:tcBorders>
+              <w:top w:val="single" w:sz="6" w:space="0" w:color="auto"/>
+              <w:left w:val="single" w:sz="6" w:space="0" w:color="auto"/>
+              <w:bottom w:val="single" w:sz="6" w:space="0" w:color="auto"/>
+              <w:right w:val="single" w:sz="6" w:space="0" w:color="auto"/>
+            </w:tcBorders>
+            <w:shd w:val="pct10" w:color="auto" w:fill="auto"/>
+            <w:vAlign w:val="center"/>
+          </w:tcPr>
+          <w:p>
+            <w:pPr>
+              <w:rPr>
+                <w:b/>
+                <w:sz w:val="18"/>
+                <w:szCs w:val="18"/>
+                <w:lang w:val="el-GR"/>
+              </w:rPr>
+            </w:pPr>
+            <w:r>
+              <w:rPr>
+                <w:b/>
+                <w:sz w:val="18"/>
+                <w:szCs w:val="18"/>
+                <w:lang w:val="el-GR"/>
+              </w:rPr>
+              <w:t>ΠΡΟΣΩΠΙΚΑ ΣΤΟΙΧΕΙΑ</w:t>
+            </w:r>
+          </w:p>
+        </w:tc>
+        <w:tc>
+          <w:tcPr>
+            <w:tcW w:w="2946" w:type="pct"/>
+            <w:gridSpan w:val="10"/>
+            <w:vAlign w:val="center"/>
+          </w:tcPr>
+          <w:p>
+            <w:pPr>
+              <w:rPr>
+                <w:sz w:val="18"/>
+                <w:szCs w:val="18"/>
+                <w:lang w:val="el-GR"/>
+              </w:rPr>
+            </w:pPr>
+          </w:p>
+        </w:tc>
+      </w:tr>
+      <w:tr>
+        <w:tc>
+          <w:tcPr>
+            <w:tcW w:w="847" w:type="pct"/>
+            <w:tcBorders>
+              <w:top w:val="double" w:sz="6" w:space="0" w:color="auto"/>
+              <w:left w:val="double" w:sz="6" w:space="0" w:color="auto"/>
+              <w:bottom w:val="nil"/>
+              <w:right w:val="nil"/>
+            </w:tcBorders>
+            <w:vAlign w:val="center"/>
+          </w:tcPr>
+          <w:p>
+            <w:pPr>
+              <w:rPr>
+                <w:b/>
+                <w:sz w:val="18"/>
+                <w:szCs w:val="18"/>
+                <w:lang w:val="el-GR"/>
+              </w:rPr>
+            </w:pPr>
+            <w:r>
+              <w:rPr>
+                <w:b/>
+                <w:sz w:val="18"/>
+                <w:szCs w:val="18"/>
+                <w:lang w:val="el-GR"/>
+              </w:rPr>
+              <w:t>Επώνυμο:</w:t>
+            </w:r>
+          </w:p>
+        </w:tc>
+        <w:tc>
+          <w:tcPr>
+            <w:tcW w:w="1708" w:type="pct"/>
+            <w:gridSpan w:val="9"/>
+            <w:tcBorders>
+              <w:top w:val="double" w:sz="6" w:space="0" w:color="auto"/>
+              <w:left w:val="nil"/>
+              <w:bottom w:val="single" w:sz="6" w:space="0" w:color="auto"/>
+              <w:right w:val="nil"/>
+            </w:tcBorders>
+            <w:vAlign w:val="center"/>
+          </w:tcPr>
+          <w:p>
+            <w:pPr>
+              <w:rPr>
+                <w:sz w:val="18"/>
+                <w:szCs w:val="18"/>
+                <w:lang w:val="el-GR"/>
+              </w:rPr>
+            </w:pPr>
+            <w:r>
+              <w:rPr>
+                <w:sz w:val="18"/>
+                <w:szCs w:val="18"/>
+                <w:lang w:val="el-GR"/>
+              </w:rPr>
+              <w:t xml:space="preserve">{lastName} </w:t>
+            </w:r>
+          </w:p>
+        </w:tc>
+        <w:tc>
+          <w:tcPr>
+            <w:tcW w:w="709" w:type="pct"/>
+            <w:tcBorders>
+              <w:top w:val="double" w:sz="6" w:space="0" w:color="auto"/>
+              <w:left w:val="nil"/>
+              <w:bottom w:val="nil"/>
+              <w:right w:val="nil"/>
+            </w:tcBorders>
+            <w:vAlign w:val="center"/>
+          </w:tcPr>
+          <w:p>
+            <w:pPr>
+              <w:rPr>
+                <w:b/>
+                <w:sz w:val="18"/>
+                <w:szCs w:val="18"/>
+                <w:lang w:val="el-GR"/>
+              </w:rPr>
+            </w:pPr>
+            <w:r>
+              <w:rPr>
+                <w:b/>
+                <w:sz w:val="18"/>
+                <w:szCs w:val="18"/>
+                <w:lang w:val="el-GR"/>
+              </w:rPr>
+              <w:t>Όνομα:</w:t>
+            </w:r>
+          </w:p>
+        </w:tc>
+        <w:tc>
+          <w:tcPr>
+            <w:tcW w:w="1735" w:type="pct"/>
+            <w:gridSpan w:val="7"/>
+            <w:tcBorders>
+              <w:top w:val="double" w:sz="6" w:space="0" w:color="auto"/>
+              <w:left w:val="nil"/>
+              <w:bottom w:val="single" w:sz="6" w:space="0" w:color="auto"/>
+              <w:right w:val="double" w:sz="6" w:space="0" w:color="auto"/>
+            </w:tcBorders>
+            <w:vAlign w:val="center"/>
+          </w:tcPr>
+          <w:p>
+            <w:pPr>
+              <w:rPr>
+                <w:sz w:val="18"/>
+                <w:szCs w:val="18"/>
+                <w:lang w:val="el-GR"/>
+              </w:rPr>
+            </w:pPr>
+            <w:r>
+              <w:rPr>
+                <w:sz w:val="18"/>
+                <w:szCs w:val="18"/>
+                <w:lang w:val="el-GR"/>
+              </w:rPr>
+              <w:t>{firstName}</w:t>
+            </w:r>
+          </w:p>
+        </w:tc>
+      </w:tr>
+      <w:tr>
+        <w:trPr>
+          <w:trHeight w:val="247"/>
+        </w:trPr>
+        <w:tc>
+          <w:tcPr>
+            <w:tcW w:w="5000" w:type="pct"/>
+            <w:gridSpan w:val="18"/>
+            <w:tcBorders>
+              <w:top w:val="nil"/>
+              <w:left w:val="double" w:sz="6" w:space="0" w:color="auto"/>
+              <w:bottom w:val="nil"/>
+              <w:right w:val="double" w:sz="6" w:space="0" w:color="auto"/>
+            </w:tcBorders>
+            <w:vAlign w:val="center"/>
+          </w:tcPr>
+          <w:p>
+            <w:pPr>
+              <w:rPr>
+                <w:sz w:val="18"/>
+                <w:szCs w:val="18"/>
+                <w:lang w:val="el-GR"/>
+              </w:rPr>
+            </w:pPr>
+          </w:p>
+        </w:tc>
+      </w:tr>
+      <w:tr>
+        <w:tc>
+          <w:tcPr>
+            <w:tcW w:w="1043" w:type="pct"/>
+            <w:gridSpan w:val="2"/>
+            <w:tcBorders>
+              <w:top w:val="nil"/>
+              <w:left w:val="double" w:sz="6" w:space="0" w:color="auto"/>
+              <w:bottom w:val="nil"/>
+              <w:right w:val="nil"/>
+            </w:tcBorders>
+            <w:vAlign w:val="center"/>
+          </w:tcPr>
+          <w:p>
+            <w:pPr>
+              <w:rPr>
+                <w:b/>
+                <w:sz w:val="18"/>
+                <w:szCs w:val="18"/>
+                <w:lang w:val="el-GR"/>
+              </w:rPr>
+            </w:pPr>
+            <w:r>
+              <w:rPr>
+                <w:b/>
+                <w:sz w:val="18"/>
+                <w:szCs w:val="18"/>
+                <w:lang w:val="el-GR"/>
+              </w:rPr>
+              <w:t>Πατρώνυμο:</w:t>
+            </w:r>
+          </w:p>
+        </w:tc>
+        <w:tc>
+          <w:tcPr>
+            <w:tcW w:w="1513" w:type="pct"/>
+            <w:gridSpan w:val="8"/>
+            <w:tcBorders>
+              <w:top w:val="nil"/>
+              <w:left w:val="nil"/>
+              <w:bottom w:val="single" w:sz="6" w:space="0" w:color="auto"/>
+              <w:right w:val="nil"/>
+            </w:tcBorders>
+            <w:vAlign w:val="center"/>
+          </w:tcPr>
+          <w:p>
+            <w:pPr>
+              <w:rPr>
+                <w:sz w:val="18"/>
+                <w:szCs w:val="18"/>
+                <w:lang w:val="el-GR"/>
+              </w:rPr>
+            </w:pPr>
+            <w:r>
+              <w:rPr>
+                <w:sz w:val="18"/>
+                <w:szCs w:val="18"/>
+                <w:lang w:val="el-GR"/>
+              </w:rPr>
+              <w:t>{fatherName}</w:t>
+            </w:r>
+          </w:p>
+        </w:tc>
+        <w:tc>
+          <w:tcPr>
+            <w:tcW w:w="1033" w:type="pct"/>
+            <w:gridSpan w:val="4"/>
+            <w:vAlign w:val="center"/>
+          </w:tcPr>
+          <w:p>
+            <w:pPr>
+              <w:rPr>
+                <w:b/>
+                <w:sz w:val="18"/>
+                <w:szCs w:val="18"/>
+                <w:lang w:val="el-GR"/>
+              </w:rPr>
+            </w:pPr>
+            <w:r>
+              <w:rPr>
+                <w:b/>
+                <w:sz w:val="18"/>
+                <w:szCs w:val="18"/>
+                <w:lang w:val="el-GR"/>
+              </w:rPr>
+              <w:t>Μητρώνυμο:</w:t>
+            </w:r>
+          </w:p>
+        </w:tc>
+        <w:tc>
+          <w:tcPr>
+            <w:tcW w:w="1411" w:type="pct"/>
+            <w:gridSpan w:val="4"/>
+            <w:tcBorders>
+              <w:top w:val="nil"/>
+              <w:left w:val="nil"/>
+              <w:bottom w:val="single" w:sz="6" w:space="0" w:color="auto"/>
+              <w:right w:val="double" w:sz="6" w:space="0" w:color="auto"/>
+            </w:tcBorders>
+            <w:vAlign w:val="center"/>
+          </w:tcPr>
+          <w:p>
+            <w:pPr>
+              <w:rPr>
+                <w:sz w:val="18"/>
+                <w:szCs w:val="18"/>
+                <w:lang w:val="el-GR"/>
+              </w:rPr>
+            </w:pPr>
+            <w:r>
+              <w:rPr>
+                <w:sz w:val="18"/>
+                <w:szCs w:val="18"/>
+                <w:lang w:val="el-GR"/>
+              </w:rPr>
+              <w:t>{motherName}</w:t>
+            </w:r>
+          </w:p>
+        </w:tc>
+      </w:tr>
+      <w:tr>
+        <w:tc>
+          <w:tcPr>
+            <w:tcW w:w="5000" w:type="pct"/>
+            <w:gridSpan w:val="18"/>
+            <w:tcBorders>
+              <w:top w:val="nil"/>
+              <w:left w:val="double" w:sz="6" w:space="0" w:color="auto"/>
+              <w:bottom w:val="nil"/>
+              <w:right w:val="double" w:sz="6" w:space="0" w:color="auto"/>
+            </w:tcBorders>
+            <w:vAlign w:val="center"/>
+          </w:tcPr>
+          <w:p>
+            <w:pPr>
+              <w:rPr>
+                <w:sz w:val="18"/>
+                <w:szCs w:val="18"/>
+                <w:lang w:val="el-GR"/>
+              </w:rPr>
+            </w:pPr>
+          </w:p>
+        </w:tc>
+      </w:tr>
+      <w:tr>
+        <w:tc>
+          <w:tcPr>
+            <w:tcW w:w="1238" w:type="pct"/>
+            <w:gridSpan w:val="4"/>
+            <w:tcBorders>
+              <w:top w:val="nil"/>
+              <w:left w:val="double" w:sz="6" w:space="0" w:color="auto"/>
+              <w:bottom w:val="nil"/>
+              <w:right w:val="nil"/>
+            </w:tcBorders>
+            <w:vAlign w:val="center"/>
+          </w:tcPr>
+          <w:p>
+            <w:pPr>
+              <w:rPr>
+                <w:b/>
+                <w:sz w:val="18"/>
+                <w:szCs w:val="18"/>
+                <w:lang w:val="el-GR"/>
+              </w:rPr>
+            </w:pPr>
+            <w:r>
+              <w:rPr>
+                <w:b/>
+                <w:sz w:val="18"/>
+                <w:szCs w:val="18"/>
+                <w:lang w:val="el-GR"/>
+              </w:rPr>
+              <w:t>Ημερομηνία Γέννησης:</w:t>
+            </w:r>
+          </w:p>
+        </w:tc>
+        <w:tc>
+          <w:tcPr>
+            <w:tcW w:w="1317" w:type="pct"/>
+            <w:gridSpan w:val="6"/>
+            <w:tcBorders>
+              <w:top w:val="nil"/>
+              <w:left w:val="nil"/>
+              <w:bottom w:val="single" w:sz="6" w:space="0" w:color="auto"/>
+              <w:right w:val="nil"/>
+            </w:tcBorders>
+            <w:vAlign w:val="center"/>
+          </w:tcPr>
+          <w:p>
+            <w:pPr>
+              <w:rPr>
+                <w:sz w:val="18"/>
+                <w:szCs w:val="18"/>
+                <w:lang w:val="el-GR"/>
+              </w:rPr>
+            </w:pPr>
+            <w:r>
+              <w:rPr>
+                <w:sz w:val="18"/>
+                <w:szCs w:val="18"/>
+                <w:lang w:val="el-GR"/>
+              </w:rPr>
+              <w:t>{dateOfBirth}</w:t>
+            </w:r>
+          </w:p>
+        </w:tc>
+        <w:tc>
+          <w:tcPr>
+            <w:tcW w:w="1163" w:type="pct"/>
+            <w:gridSpan w:val="5"/>
+            <w:vAlign w:val="center"/>
+          </w:tcPr>
+          <w:p>
+            <w:pPr>
+              <w:rPr>
+                <w:b/>
+                <w:sz w:val="18"/>
+                <w:szCs w:val="18"/>
+              </w:rPr>
+            </w:pPr>
+            <w:r>
+              <w:rPr>
+                <w:b/>
+                <w:sz w:val="18"/>
+                <w:szCs w:val="18"/>
+                <w:lang w:val="el-GR"/>
+              </w:rPr>
+              <w:t>Τόπος Γέννησης</w:t>
+            </w:r>
+            <w:r>
+              <w:rPr>
+                <w:b/>
+                <w:sz w:val="18"/>
+                <w:szCs w:val="18"/>
+              </w:rPr>
+              <w:t>:</w:t>
+            </w:r>
+          </w:p>
+        </w:tc>
+        <w:tc>
+          <w:tcPr>
+            <w:tcW w:w="1281" w:type="pct"/>
+            <w:gridSpan w:val="3"/>
+            <w:tcBorders>
+              <w:top w:val="nil"/>
+              <w:left w:val="nil"/>
+              <w:bottom w:val="single" w:sz="6" w:space="0" w:color="auto"/>
+              <w:right w:val="double" w:sz="6" w:space="0" w:color="auto"/>
+            </w:tcBorders>
+            <w:vAlign w:val="center"/>
+          </w:tcPr>
+          <w:p>
+            <w:pPr>
+              <w:rPr>
+                <w:sz w:val="18"/>
+                <w:szCs w:val="18"/>
+                <w:lang w:val="el-GR"/>
+              </w:rPr>
+            </w:pPr>
+            <w:r>
+              <w:rPr>
+                <w:sz w:val="18"/>
+                <w:szCs w:val="18"/>
+                <w:lang w:val="el-GR"/>
+              </w:rPr>
+              <w:t>{placeOfBirth}</w:t>
+            </w:r>
+          </w:p>
+        </w:tc>
+      </w:tr>
+      <w:tr>
+        <w:trPr>
+          <w:trHeight w:val="65"/>
+        </w:trPr>
+        <w:tc>
+          <w:tcPr>
+            <w:tcW w:w="5000" w:type="pct"/>
+            <w:gridSpan w:val="18"/>
+            <w:tcBorders>
+              <w:top w:val="nil"/>
+              <w:left w:val="double" w:sz="6" w:space="0" w:color="auto"/>
+              <w:bottom w:val="nil"/>
+              <w:right w:val="double" w:sz="6" w:space="0" w:color="auto"/>
+            </w:tcBorders>
+            <w:vAlign w:val="center"/>
+          </w:tcPr>
+          <w:p>
+            <w:pPr>
+              <w:rPr>
+                <w:sz w:val="18"/>
+                <w:szCs w:val="18"/>
+                <w:lang w:val="el-GR"/>
+              </w:rPr>
+            </w:pPr>
+          </w:p>
+        </w:tc>
+      </w:tr>
+      <w:tr>
+        <w:tc>
+          <w:tcPr>
+            <w:tcW w:w="1640" w:type="pct"/>
+            <w:gridSpan w:val="7"/>
+            <w:tcBorders>
+              <w:top w:val="nil"/>
+              <w:left w:val="double" w:sz="6" w:space="0" w:color="auto"/>
+              <w:bottom w:val="nil"/>
+              <w:right w:val="nil"/>
+            </w:tcBorders>
+            <w:vAlign w:val="center"/>
+          </w:tcPr>
+          <w:p>
+            <w:pPr>
+              <w:rPr>
+                <w:b/>
+                <w:sz w:val="18"/>
+                <w:szCs w:val="18"/>
+              </w:rPr>
+            </w:pPr>
+            <w:r>
+              <w:rPr>
+                <w:b/>
+                <w:sz w:val="18"/>
+                <w:szCs w:val="18"/>
+                <w:lang w:val="el-GR"/>
+              </w:rPr>
+              <w:t>Τηλέφωνο</w:t>
+            </w:r>
+            <w:r>
+              <w:rPr>
+                <w:b/>
+                <w:sz w:val="18"/>
+                <w:szCs w:val="18"/>
+              </w:rPr>
+              <w:t>:</w:t>
+            </w:r>
+          </w:p>
+        </w:tc>
+        <w:tc>
+          <w:tcPr>
+            <w:tcW w:w="916" w:type="pct"/>
+            <w:gridSpan w:val="3"/>
+            <w:tcBorders>
+              <w:top w:val="nil"/>
+              <w:left w:val="nil"/>
+              <w:bottom w:val="single" w:sz="6" w:space="0" w:color="auto"/>
+              <w:right w:val="nil"/>
+            </w:tcBorders>
+            <w:vAlign w:val="center"/>
+          </w:tcPr>
+          <w:p>
+            <w:pPr>
+              <w:rPr>
+                <w:sz w:val="18"/>
+                <w:szCs w:val="18"/>
+                <w:lang w:val="el-GR"/>
+              </w:rPr>
+            </w:pPr>
+            <w:r>
+              <w:rPr>
+                <w:sz w:val="18"/>
+                <w:szCs w:val="18"/>
+                <w:lang w:val="el-GR"/>
+              </w:rPr>
+              <w:t>{phone}</w:t>
+            </w:r>
+          </w:p>
+        </w:tc>
+        <w:tc>
+          <w:tcPr>
+            <w:tcW w:w="968" w:type="pct"/>
+            <w:gridSpan w:val="3"/>
+            <w:vAlign w:val="center"/>
+          </w:tcPr>
+          <w:p>
+            <w:pPr>
+              <w:rPr>
+                <w:b/>
+                <w:sz w:val="18"/>
+                <w:szCs w:val="18"/>
+                <w:lang w:val="en-US"/>
+              </w:rPr>
+            </w:pPr>
+            <w:r>
+              <w:rPr>
+                <w:b/>
+                <w:sz w:val="18"/>
+                <w:szCs w:val="18"/>
+                <w:lang w:val="en-US"/>
+              </w:rPr>
+              <w:t>E-mail:</w:t>
+            </w:r>
+          </w:p>
+        </w:tc>
+        <w:tc>
+          <w:tcPr>
+            <w:tcW w:w="1476" w:type="pct"/>
+            <w:gridSpan w:val="5"/>
+            <w:tcBorders>
+              <w:top w:val="nil"/>
+              <w:left w:val="nil"/>
+              <w:bottom w:val="single" w:sz="6" w:space="0" w:color="auto"/>
+              <w:right w:val="double" w:sz="6" w:space="0" w:color="auto"/>
+            </w:tcBorders>
+            <w:vAlign w:val="center"/>
+          </w:tcPr>
+          <w:p>
+            <w:pPr>
+              <w:rPr>
+                <w:sz w:val="18"/>
+                <w:szCs w:val="18"/>
+                <w:lang w:val="en-US"/>
+              </w:rPr>
+            </w:pPr>
+            <w:r>
+              <w:rPr>
+                <w:sz w:val="18"/>
+                <w:szCs w:val="18"/>
+                <w:lang w:val="en-US"/>
+              </w:rPr>
+              <w:t>{email}</w:t>
+            </w:r>
+          </w:p>
+        </w:tc>
+      </w:tr>
+      <w:tr>
+        <w:tc>
+          <w:tcPr>
+            <w:tcW w:w="1640" w:type="pct"/>
+            <w:gridSpan w:val="7"/>
+            <w:tcBorders>
+              <w:top w:val="nil"/>
+              <w:left w:val="double" w:sz="6" w:space="0" w:color="auto"/>
+              <w:bottom w:val="nil"/>
+              <w:right w:val="nil"/>
+            </w:tcBorders>
+            <w:vAlign w:val="center"/>
+          </w:tcPr>
+          <w:p>
+            <w:pPr>
+              <w:rPr>
+                <w:b/>
+                <w:sz w:val="18"/>
+                <w:szCs w:val="18"/>
+                <w:lang w:val="en-US"/>
+              </w:rPr>
+            </w:pPr>
+            <w:r>
+              <w:rPr>
+                <w:b/>
+                <w:sz w:val="18"/>
+                <w:szCs w:val="18"/>
+                <w:lang w:val="en-US"/>
+              </w:rPr>
+              <w:t>Fax:</w:t>
+            </w:r>
+          </w:p>
+        </w:tc>
+        <w:tc>
+          <w:tcPr>
+            <w:tcW w:w="916" w:type="pct"/>
+            <w:gridSpan w:val="3"/>
+            <w:tcBorders>
+              <w:top w:val="nil"/>
+              <w:left w:val="nil"/>
+              <w:bottom w:val="single" w:sz="6" w:space="0" w:color="auto"/>
+              <w:right w:val="nil"/>
+            </w:tcBorders>
+            <w:vAlign w:val="center"/>
+          </w:tcPr>
+          <w:p>
+            <w:pPr>
+              <w:rPr>
+                <w:sz w:val="18"/>
+                <w:szCs w:val="18"/>
+                <w:lang w:val="en-US"/>
+              </w:rPr>
+            </w:pPr>
+          </w:p>
+        </w:tc>
+        <w:tc>
+          <w:tcPr>
+            <w:tcW w:w="968" w:type="pct"/>
+            <w:gridSpan w:val="3"/>
+            <w:vAlign w:val="center"/>
+          </w:tcPr>
+          <w:p>
+            <w:pPr>
+              <w:rPr>
+                <w:b/>
+                <w:sz w:val="18"/>
+                <w:szCs w:val="18"/>
+                <w:lang w:val="en-US"/>
+              </w:rPr>
+            </w:pPr>
+          </w:p>
+        </w:tc>
+        <w:tc>
+          <w:tcPr>
+            <w:tcW w:w="1476" w:type="pct"/>
+            <w:gridSpan w:val="5"/>
+            <w:tcBorders>
+              <w:top w:val="single" w:sz="6" w:space="0" w:color="auto"/>
+              <w:left w:val="nil"/>
+              <w:bottom w:val="nil"/>
+              <w:right w:val="double" w:sz="6" w:space="0" w:color="auto"/>
+            </w:tcBorders>
+            <w:vAlign w:val="center"/>
+          </w:tcPr>
+          <w:p>
+            <w:pPr>
+              <w:rPr>
+                <w:sz w:val="18"/>
+                <w:szCs w:val="18"/>
+                <w:lang w:val="en-US"/>
+              </w:rPr>
+            </w:pPr>
+          </w:p>
+        </w:tc>
+      </w:tr>
+      <w:tr>
+        <w:tc>
+          <w:tcPr>
+            <w:tcW w:w="1247" w:type="pct"/>
+            <w:gridSpan w:val="5"/>
+            <w:tcBorders>
+              <w:top w:val="nil"/>
+              <w:left w:val="double" w:sz="6" w:space="0" w:color="auto"/>
+              <w:bottom w:val="nil"/>
+              <w:right w:val="nil"/>
+            </w:tcBorders>
+            <w:vAlign w:val="center"/>
+          </w:tcPr>
+          <w:p>
+            <w:pPr>
+              <w:rPr>
+                <w:sz w:val="18"/>
+                <w:szCs w:val="18"/>
+                <w:lang w:val="en-US"/>
+              </w:rPr>
+            </w:pPr>
+          </w:p>
+        </w:tc>
+        <w:tc>
+          <w:tcPr>
+            <w:tcW w:w="1297" w:type="pct"/>
+            <w:gridSpan w:val="4"/>
+            <w:vAlign w:val="center"/>
+          </w:tcPr>
+          <w:p>
+            <w:pPr>
+              <w:rPr>
+                <w:sz w:val="18"/>
+                <w:szCs w:val="18"/>
+                <w:lang w:val="en-US"/>
+              </w:rPr>
+            </w:pPr>
+          </w:p>
+        </w:tc>
+        <w:tc>
+          <w:tcPr>
+            <w:tcW w:w="1203" w:type="pct"/>
+            <w:gridSpan w:val="7"/>
+            <w:vAlign w:val="center"/>
+          </w:tcPr>
+          <w:p>
+            <w:pPr>
+              <w:rPr>
+                <w:sz w:val="18"/>
+                <w:szCs w:val="18"/>
+                <w:lang w:val="en-US"/>
+              </w:rPr>
+            </w:pPr>
+          </w:p>
+        </w:tc>
+        <w:tc>
+          <w:tcPr>
+            <w:tcW w:w="1253" w:type="pct"/>
+            <w:gridSpan w:val="2"/>
+            <w:tcBorders>
+              <w:top w:val="nil"/>
+              <w:left w:val="nil"/>
+              <w:bottom w:val="nil"/>
+              <w:right w:val="double" w:sz="6" w:space="0" w:color="auto"/>
+            </w:tcBorders>
+            <w:vAlign w:val="center"/>
+          </w:tcPr>
+          <w:p>
+            <w:pPr>
+              <w:rPr>
+                <w:sz w:val="18"/>
+                <w:szCs w:val="18"/>
+                <w:lang w:val="en-US"/>
+              </w:rPr>
+            </w:pPr>
+          </w:p>
+        </w:tc>
+      </w:tr>
+      <w:tr>
+        <w:tc>
+          <w:tcPr>
+            <w:tcW w:w="1474" w:type="pct"/>
+            <w:gridSpan w:val="6"/>
+            <w:tcBorders>
+              <w:top w:val="nil"/>
+              <w:left w:val="double" w:sz="6" w:space="0" w:color="auto"/>
+              <w:bottom w:val="nil"/>
+              <w:right w:val="nil"/>
+            </w:tcBorders>
+            <w:vAlign w:val="center"/>
+          </w:tcPr>
+          <w:p>
+            <w:pPr>
+              <w:rPr>
+                <w:b/>
+                <w:sz w:val="18"/>
+                <w:szCs w:val="18"/>
+              </w:rPr>
+            </w:pPr>
+            <w:r>
+              <w:rPr>
+                <w:b/>
+                <w:sz w:val="18"/>
+                <w:szCs w:val="18"/>
+                <w:lang w:val="el-GR"/>
+              </w:rPr>
+              <w:t>Διεύθυνση Κατοικίας</w:t>
+            </w:r>
+            <w:r>
+              <w:rPr>
+                <w:b/>
+                <w:sz w:val="18"/>
+                <w:szCs w:val="18"/>
+              </w:rPr>
+              <w:t>:</w:t>
+            </w:r>
+          </w:p>
+        </w:tc>
+        <w:tc>
+          <w:tcPr>
+            <w:tcW w:w="3526" w:type="pct"/>
+            <w:gridSpan w:val="12"/>
+            <w:tcBorders>
+              <w:top w:val="nil"/>
+              <w:left w:val="nil"/>
+              <w:bottom w:val="single" w:sz="6" w:space="0" w:color="auto"/>
+              <w:right w:val="double" w:sz="6" w:space="0" w:color="auto"/>
+            </w:tcBorders>
+            <w:vAlign w:val="center"/>
+          </w:tcPr>
+          <w:p>
+            <w:pPr>
+              <w:rPr>
+                <w:sz w:val="18"/>
+                <w:szCs w:val="18"/>
+                <w:lang w:val="el-GR"/>
+              </w:rPr>
+            </w:pPr>
+            <w:r>
+              <w:rPr>
+                <w:sz w:val="18"/>
+                <w:szCs w:val="18"/>
+                <w:lang w:val="el-GR"/>
+              </w:rPr>
+              <w:t xml:space="preserve">{homeAddress}</w:t>
+            </w:r>
+          </w:p>
+        </w:tc>
+      </w:tr>
+      <w:tr>
+        <w:tc>
+          <w:tcPr>
+            <w:tcW w:w="1247" w:type="pct"/>
+            <w:gridSpan w:val="5"/>
+            <w:tcBorders>
+              <w:top w:val="nil"/>
+              <w:left w:val="double" w:sz="6" w:space="0" w:color="auto"/>
+              <w:bottom w:val="double" w:sz="6" w:space="0" w:color="auto"/>
+              <w:right w:val="nil"/>
+            </w:tcBorders>
+            <w:vAlign w:val="center"/>
+          </w:tcPr>
+          <w:p>
+            <w:pPr>
+              <w:rPr>
+                <w:sz w:val="18"/>
+                <w:szCs w:val="18"/>
+                <w:lang w:val="el-GR"/>
+              </w:rPr>
+            </w:pPr>
+          </w:p>
+        </w:tc>
+        <w:tc>
+          <w:tcPr>
+            <w:tcW w:w="1297" w:type="pct"/>
+            <w:gridSpan w:val="4"/>
+            <w:tcBorders>
+              <w:top w:val="nil"/>
+              <w:left w:val="nil"/>
+              <w:bottom w:val="double" w:sz="6" w:space="0" w:color="auto"/>
+              <w:right w:val="nil"/>
+            </w:tcBorders>
+            <w:vAlign w:val="center"/>
+          </w:tcPr>
+          <w:p>
+            <w:pPr>
+              <w:rPr>
+                <w:sz w:val="18"/>
+                <w:szCs w:val="18"/>
+                <w:lang w:val="el-GR"/>
+              </w:rPr>
+            </w:pPr>
+          </w:p>
+        </w:tc>
+        <w:tc>
+          <w:tcPr>
+            <w:tcW w:w="1203" w:type="pct"/>
+            <w:gridSpan w:val="7"/>
+            <w:tcBorders>
+              <w:top w:val="nil"/>
+              <w:left w:val="nil"/>
+              <w:bottom w:val="double" w:sz="6" w:space="0" w:color="auto"/>
+              <w:right w:val="nil"/>
+            </w:tcBorders>
+            <w:vAlign w:val="center"/>
+          </w:tcPr>
+          <w:p>
+            <w:pPr>
+              <w:rPr>
+                <w:sz w:val="18"/>
+                <w:szCs w:val="18"/>
+                <w:lang w:val="el-GR"/>
+              </w:rPr>
+            </w:pPr>
+          </w:p>
+        </w:tc>
+        <w:tc>
+          <w:tcPr>
+            <w:tcW w:w="1253" w:type="pct"/>
+            <w:gridSpan w:val="2"/>
+            <w:tcBorders>
+              <w:top w:val="nil"/>
+              <w:left w:val="nil"/>
+              <w:bottom w:val="double" w:sz="6" w:space="0" w:color="auto"/>
+              <w:right w:val="double" w:sz="6" w:space="0" w:color="auto"/>
+            </w:tcBorders>
+            <w:vAlign w:val="center"/>
+          </w:tcPr>
+          <w:p>
+            <w:pPr>
+              <w:rPr>
+                <w:sz w:val="18"/>
+                <w:szCs w:val="18"/>
+                <w:lang w:val="el-GR"/>
+              </w:rPr>
+            </w:pPr>
+          </w:p>
+        </w:tc>
+      </w:tr>
+      <w:tr>
+        <w:tc>
+          <w:tcPr>
+            <w:tcW w:w="5000" w:type="pct"/>
+            <w:gridSpan w:val="18"/>
+          </w:tcPr>
+          <w:p>
+            <w:pPr>
+              <w:rPr>
+                <w:sz w:val="18"/>
+                <w:szCs w:val="18"/>
+                <w:lang w:val="el-GR"/>
+              </w:rPr>
+            </w:pPr>
+          </w:p>
+          <w:p>
+            <w:pPr>
+              <w:rPr>
+                <w:sz w:val="18"/>
+                <w:szCs w:val="18"/>
+                <w:lang w:val="el-GR"/>
+              </w:rPr>
+            </w:pPr>
+          </w:p>
+        </w:tc>
+      </w:tr>
+      <w:tr>
+        <w:tc>
+          <w:tcPr>
+            <w:tcW w:w="1223" w:type="pct"/>
+            <w:gridSpan w:val="3"/>
+            <w:tcBorders>
+              <w:top w:val="single" w:sz="6" w:space="0" w:color="auto"/>
+              <w:left w:val="single" w:sz="6" w:space="0" w:color="auto"/>
+              <w:bottom w:val="single" w:sz="6" w:space="0" w:color="auto"/>
+              <w:right w:val="single" w:sz="6" w:space="0" w:color="auto"/>
+            </w:tcBorders>
+            <w:shd w:val="pct10" w:color="auto" w:fill="auto"/>
+          </w:tcPr>
+          <w:p>
+            <w:pPr>
+              <w:rPr>
+                <w:b/>
+                <w:sz w:val="18"/>
+                <w:szCs w:val="18"/>
+                <w:lang w:val="el-GR"/>
+              </w:rPr>
+            </w:pPr>
+            <w:r>
+              <w:rPr>
+                <w:b/>
+                <w:sz w:val="18"/>
+                <w:szCs w:val="18"/>
+                <w:lang w:val="el-GR"/>
+              </w:rPr>
+              <w:t>ΕΚΠΑΙΔΕΥΣΗ</w:t>
+            </w:r>
+          </w:p>
+        </w:tc>
+        <w:tc>
+          <w:tcPr>
+            <w:tcW w:w="3777" w:type="pct"/>
+            <w:gridSpan w:val="15"/>
+          </w:tcPr>
+          <w:p>
+            <w:pPr>
+              <w:rPr>
+                <w:sz w:val="18"/>
+                <w:szCs w:val="18"/>
+                <w:lang w:val="el-GR"/>
+              </w:rPr>
+            </w:pPr>
+          </w:p>
+        </w:tc>
+      </w:tr>
+      <w:tr>
+        <w:tc>
+          <w:tcPr>
+            <w:tcW w:w="2058" w:type="pct"/>
+            <w:gridSpan w:val="8"/>
+            <w:tcBorders>
+              <w:top w:val="double" w:sz="6" w:space="0" w:color="auto"/>
+              <w:left w:val="double" w:sz="6" w:space="0" w:color="auto"/>
+              <w:bottom w:val="nil"/>
+              <w:right w:val="single" w:sz="6" w:space="0" w:color="auto"/>
+            </w:tcBorders>
+            <w:vAlign w:val="center"/>
+          </w:tcPr>
+          <w:p>
+            <w:pPr>
+              <w:jc w:val="center"/>
+              <w:rPr>
+                <w:b/>
+                <w:sz w:val="18"/>
+                <w:szCs w:val="18"/>
+                <w:lang w:val="el-GR"/>
+              </w:rPr>
+            </w:pPr>
+            <w:r>
+              <w:rPr>
+                <w:b/>
+                <w:sz w:val="18"/>
+                <w:szCs w:val="18"/>
+                <w:lang w:val="el-GR"/>
+              </w:rPr>
+              <w:t>Όνομα Ιδρύματος</w:t>
+            </w:r>
+          </w:p>
+        </w:tc>
+        <w:tc>
+          <w:tcPr>
+            <w:tcW w:w="1247" w:type="pct"/>
+            <w:gridSpan w:val="4"/>
+            <w:tcBorders>
+              <w:top w:val="double" w:sz="6" w:space="0" w:color="auto"/>
+              <w:left w:val="nil"/>
+              <w:bottom w:val="nil"/>
+              <w:right w:val="single" w:sz="6" w:space="0" w:color="auto"/>
+            </w:tcBorders>
+            <w:vAlign w:val="center"/>
+          </w:tcPr>
+          <w:p>
+            <w:pPr>
+              <w:jc w:val="center"/>
+              <w:rPr>
+                <w:b/>
+                <w:sz w:val="18"/>
+                <w:szCs w:val="18"/>
+                <w:lang w:val="el-GR"/>
+              </w:rPr>
+            </w:pPr>
+            <w:r>
+              <w:rPr>
+                <w:b/>
+                <w:sz w:val="18"/>
+                <w:szCs w:val="18"/>
+                <w:lang w:val="el-GR"/>
+              </w:rPr>
+              <w:t>Τίτλος Πτυχίου</w:t>
+            </w:r>
+          </w:p>
+        </w:tc>
+        <w:tc>
+          <w:tcPr>
+            <w:tcW w:w="679" w:type="pct"/>
+            <w:gridSpan w:val="5"/>
+            <w:tcBorders>
+              <w:top w:val="double" w:sz="6" w:space="0" w:color="auto"/>
+              <w:left w:val="nil"/>
+              <w:bottom w:val="nil"/>
+              <w:right w:val="single" w:sz="6" w:space="0" w:color="auto"/>
+            </w:tcBorders>
+            <w:vAlign w:val="center"/>
+          </w:tcPr>
+          <w:p>
+            <w:pPr>
+              <w:jc w:val="center"/>
+              <w:rPr>
+                <w:b/>
+                <w:sz w:val="18"/>
+                <w:szCs w:val="18"/>
+                <w:lang w:val="el-GR"/>
+              </w:rPr>
+            </w:pPr>
+            <w:r>
+              <w:rPr>
+                <w:b/>
+                <w:sz w:val="18"/>
+                <w:szCs w:val="18"/>
+                <w:lang w:val="el-GR"/>
+              </w:rPr>
+              <w:t>Ειδικότητα</w:t>
+            </w:r>
+          </w:p>
+        </w:tc>
+        <w:tc>
+          <w:tcPr>
+            <w:tcW w:w="1016" w:type="pct"/>
+            <w:tcBorders>
+              <w:top w:val="double" w:sz="6" w:space="0" w:color="auto"/>
+              <w:left w:val="nil"/>
+              <w:bottom w:val="nil"/>
+              <w:right w:val="double" w:sz="6" w:space="0" w:color="auto"/>
+            </w:tcBorders>
+            <w:vAlign w:val="center"/>
+          </w:tcPr>
+          <w:p>
+            <w:pPr>
+              <w:jc w:val="center"/>
+              <w:rPr>
+                <w:b/>
+                <w:sz w:val="18"/>
+                <w:szCs w:val="18"/>
+                <w:lang w:val="el-GR"/>
+              </w:rPr>
+            </w:pPr>
+            <w:r>
+              <w:rPr>
+                <w:b/>
+                <w:sz w:val="18"/>
+                <w:szCs w:val="18"/>
+                <w:lang w:val="el-GR"/>
+              </w:rPr>
+              <w:t>Ημερομηνία Απόκτησης Πτυχίου</w:t>
+            </w:r>
+          </w:p>
+        </w:tc>
+      </w:tr>
+      <w:tr w14:paraId="EDU00001">
+        <w:tc>
+          <w:tcPr>
+            <w:tcW w:w="2058" w:type="pct"/>
+            <w:gridSpan w:val="8"/>
+            <w:tcBorders>
+              <w:top w:val="double" w:sz="6" w:space="0" w:color="auto"/>
+              <w:left w:val="double" w:sz="6" w:space="0" w:color="auto"/>
+              <w:bottom w:val="single" w:sz="6" w:space="0" w:color="auto"/>
+              <w:right w:val="single" w:sz="6" w:space="0" w:color="auto"/>
+            </w:tcBorders>
+          </w:tcPr>
+          <w:p>
+            <w:pPr>
+              <w:rPr>
+                <w:rFonts w:ascii="Calibri" w:hAnsi="Calibri"/>
+                <w:sz w:val="20"/>
+                <w:szCs w:val="22"/>
+                <w:lang w:val="el-GR"/>
+              </w:rPr>
+            </w:pPr>
+            <w:r>
+              <w:rPr>
+                <w:rFonts w:ascii="Calibri" w:hAnsi="Calibri"/>
+                <w:sz w:val="20"/>
+                <w:szCs w:val="22"/>
+                <w:lang w:val="el-GR"/>
+              </w:rPr>
+              <w:t>{#educationRows}{institutionFull}</w:t>
+            </w:r>
+          </w:p>
+        </w:tc>
+        <w:tc>
+          <w:tcPr>
+            <w:tcW w:w="1247" w:type="pct"/>
+            <w:gridSpan w:val="4"/>
+            <w:tcBorders>
+              <w:top w:val="double" w:sz="6" w:space="0" w:color="auto"/>
+              <w:left w:val="nil"/>
+              <w:bottom w:val="single" w:sz="6" w:space="0" w:color="auto"/>
+              <w:right w:val="single" w:sz="6" w:space="0" w:color="auto"/>
+            </w:tcBorders>
+            <w:vAlign w:val="center"/>
+          </w:tcPr>
+          <w:p>
+            <w:pPr>
+              <w:jc w:val="center"/>
+              <w:rPr>
+                <w:rFonts w:ascii="Calibri" w:hAnsi="Calibri"/>
+                <w:sz w:val="20"/>
+                <w:szCs w:val="22"/>
+                <w:lang w:val="el-GR"/>
+              </w:rPr>
+            </w:pPr>
+            <w:r>
+              <w:rPr>
+                <w:rFonts w:ascii="Calibri" w:hAnsi="Calibri"/>
+                <w:sz w:val="20"/>
+                <w:szCs w:val="22"/>
+                <w:lang w:val="el-GR"/>
+              </w:rPr>
+              <w:t>{degreeTitle}</w:t>
+            </w:r>
+          </w:p>
+        </w:tc>
+        <w:tc>
+          <w:tcPr>
+            <w:tcW w:w="679" w:type="pct"/>
+            <w:gridSpan w:val="5"/>
+            <w:tcBorders>
+              <w:top w:val="double" w:sz="6" w:space="0" w:color="auto"/>
+              <w:left w:val="nil"/>
+              <w:bottom w:val="single" w:sz="6" w:space="0" w:color="auto"/>
+              <w:right w:val="single" w:sz="6" w:space="0" w:color="auto"/>
+            </w:tcBorders>
+          </w:tcPr>
+          <w:p>
+            <w:pPr>
+              <w:rPr>
+                <w:rFonts w:ascii="Calibri" w:hAnsi="Calibri"/>
+                <w:sz w:val="20"/>
+                <w:szCs w:val="22"/>
+                <w:lang w:val="el-GR"/>
+              </w:rPr>
+            </w:pPr>
+            <w:r>
+              <w:rPr>
+                <w:rFonts w:ascii="Calibri" w:hAnsi="Calibri"/>
+                <w:sz w:val="20"/>
+                <w:szCs w:val="22"/>
+                <w:lang w:val="el-GR"/>
+              </w:rPr>
+              <w:t>{specialization}</w:t>
+            </w:r>
+          </w:p>
+        </w:tc>
+        <w:tc>
+          <w:tcPr>
+            <w:tcW w:w="1016" w:type="pct"/>
+            <w:tcBorders>
+              <w:top w:val="double" w:sz="6" w:space="0" w:color="auto"/>
+              <w:left w:val="nil"/>
+              <w:bottom w:val="single" w:sz="6" w:space="0" w:color="auto"/>
+              <w:right w:val="double" w:sz="6" w:space="0" w:color="auto"/>
+            </w:tcBorders>
+          </w:tcPr>
+          <w:p>
+            <w:pPr>
+              <w:jc w:val="center"/>
+              <w:rPr>
+                <w:rFonts w:ascii="Calibri" w:hAnsi="Calibri"/>
+                <w:sz w:val="20"/>
+                <w:szCs w:val="22"/>
+                <w:lang w:val="el-GR"/>
+              </w:rPr>
+            </w:pPr>
+            <w:r>
+              <w:rPr>
+                <w:rFonts w:ascii="Calibri" w:hAnsi="Calibri"/>
+                <w:sz w:val="20"/>
+                <w:szCs w:val="22"/>
+                <w:lang w:val="el-GR"/>
+              </w:rPr>
+              <w:t>{dateAwarded}{/educationRows}</w:t>
+            </w:r>
+          </w:p>
+        </w:tc>
+      </w:tr>
+    </w:tbl>
+    <w:p>
+      <w:pPr>
+        <w:rPr>
+          <w:sz w:val="18"/>
+          <w:szCs w:val="18"/>
+          <w:lang w:val="el-GR"/>
+        </w:rPr>
+      </w:pPr>
+    </w:p>
+    <w:tbl>
+      <w:tblPr>
+        <w:tblW w:w="5652" w:type="pct"/>
+        <w:tblInd w:w="-601" w:type="dxa"/>
+        <w:tblBorders>
+          <w:top w:val="single" w:sz="4" w:space="0" w:color="auto"/>
+          <w:left w:val="single" w:sz="4" w:space="0" w:color="auto"/>
+          <w:bottom w:val="single" w:sz="4" w:space="0" w:color="auto"/>
+          <w:right w:val="single" w:sz="4" w:space="0" w:color="auto"/>
+          <w:insideH w:val="single" w:sz="4" w:space="0" w:color="auto"/>
+          <w:insideV w:val="single" w:sz="4" w:space="0" w:color="auto"/>
+        </w:tblBorders>
+        <w:tblLook w:val="0000" w:firstRow="0" w:lastRow="0" w:firstColumn="0" w:lastColumn="0" w:noHBand="0" w:noVBand="0"/>
+      </w:tblPr>
+      <w:tblGrid>
+        <w:gridCol w:w="6266"/>
+        <w:gridCol w:w="3374"/>
+      </w:tblGrid>
+      <w:tr w:rsidR="00KAT001" w14:paraId="KAT00001">
+        <w:trPr>
+          <w:trHeight w:val="400"/>
+        </w:trPr>
+        <w:tc>
+          <w:tcPr>
+            <w:tcW w:w="3250" w:type="pct"/>
+            <w:shd w:val="clear" w:color="auto" w:fill="D9D9D9"/>
+            <w:vAlign w:val="center"/>
+          </w:tcPr>
+          <w:p>
+            <w:pPr>
+              <w:rPr>
+                <w:b/>
+                <w:sz w:val="18"/>
+                <w:szCs w:val="18"/>
+                <w:lang w:val="el-GR"/>
+              </w:rPr>
+            </w:pPr>
+            <w:r>
+              <w:rPr>
+                <w:b/>
+                <w:sz w:val="18"/>
+                <w:szCs w:val="18"/>
+                <w:lang w:val="el-GR"/>
+              </w:rPr>
+              <w:t>ΚΑΤΗΓΟΡΙΑ ΣΤΕΛΕΧΟΥΣ</w:t>
+            </w:r>
+          </w:p>
+        </w:tc>
+        <w:tc>
+          <w:tcPr>
+            <w:tcW w:w="1750" w:type="pct"/>
+            <w:vAlign w:val="center"/>
+          </w:tcPr>
+          <w:p>
+            <w:pPr>
+              <w:rPr>
+                <w:sz w:val="18"/>
+                <w:szCs w:val="18"/>
+                <w:lang w:val="el-GR"/>
+              </w:rPr>
+            </w:pPr>
+          </w:p>
+        </w:tc>
+      </w:tr>
+    </w:tbl>
+    <w:p>
+      <w:pPr>
+        <w:ind w:right="-334"/>
+        <w:rPr>
+          <w:sz w:val="18"/>
+          <w:szCs w:val="18"/>
+          <w:lang w:val="el-GR"/>
+        </w:rPr>
+        <w:sectPr>
+          <w:pgSz w:w="11906" w:h="16838"/>
+          <w:pgMar w:top="1440" w:right="1797" w:bottom="1440" w:left="1797" w:header="709" w:footer="709" w:gutter="0"/>
+          <w:cols w:space="708"/>
+          <w:docGrid w:linePitch="360"/>
+        </w:sectPr>
+      </w:pPr>
+    </w:p>
+    <w:p>
+      <w:pPr>
+        <w:ind w:right="-334"/>
+        <w:rPr>
+          <w:sz w:val="18"/>
+          <w:szCs w:val="18"/>
+          <w:lang w:val="en-US"/>
+        </w:rPr>
+      </w:pPr>
+    </w:p>
+    <w:tbl>
+      <w:tblPr>
+        <w:tblW w:w="5652" w:type="pct"/>
+        <w:tblInd w:w="-601" w:type="dxa"/>
+        <w:tblBorders>
+          <w:top w:val="single" w:sz="4" w:space="0" w:color="auto"/>
+          <w:left w:val="single" w:sz="4" w:space="0" w:color="auto"/>
+          <w:bottom w:val="single" w:sz="4" w:space="0" w:color="auto"/>
+          <w:right w:val="single" w:sz="4" w:space="0" w:color="auto"/>
+          <w:insideH w:val="single" w:sz="4" w:space="0" w:color="auto"/>
+          <w:insideV w:val="single" w:sz="4" w:space="0" w:color="auto"/>
+        </w:tblBorders>
+        <w:tblLook w:val="0000" w:firstRow="0" w:lastRow="0" w:firstColumn="0" w:lastColumn="0" w:noHBand="0" w:noVBand="0"/>
+      </w:tblPr>
+      <w:tblGrid>
+        <w:gridCol w:w="9640"/>
+      </w:tblGrid>
+      <w:tr>
+        <w:trPr>
+          <w:trHeight w:val="567"/>
+        </w:trPr>
+        <w:tc>
+          <w:tcPr>
+            <w:tcW w:w="5000" w:type="pct"/>
+            <w:shd w:val="pct10" w:color="auto" w:fill="auto"/>
+            <w:vAlign w:val="center"/>
+          </w:tcPr>
+          <w:p>
+            <w:pPr>
+              <w:jc w:val="center"/>
+              <w:rPr>
+                <w:sz w:val="18"/>
+                <w:szCs w:val="18"/>
+              </w:rPr>
+            </w:pPr>
+            <w:r>
+              <w:rPr>
+                <w:b/>
+                <w:sz w:val="18"/>
+                <w:szCs w:val="18"/>
+                <w:lang w:val="el-GR"/>
+              </w:rPr>
+              <w:t>ΕΠΑΓΓΕΛΜΑΤΙΚΗ ΕΜΠΕΙΡΙΑ</w:t>
+            </w:r>
+          </w:p>
+        </w:tc>
+      </w:tr>
+    </w:tbl>
+    <w:p>
+      <w:pPr>
+        <w:rPr>
+          <w:sz w:val="18"/>
+          <w:szCs w:val="18"/>
+          <w:lang w:val="el-GR"/>
+        </w:rPr>
+      </w:pPr>
+    </w:p>
+    <w:tbl>
+      <w:tblPr>
+        <w:tblW w:w="5652" w:type="pct"/>
+        <w:tblInd w:w="-601" w:type="dxa"/>
+        <w:tblBorders>
+          <w:top w:val="single" w:sz="4" w:space="0" w:color="auto"/>
+          <w:left w:val="single" w:sz="4" w:space="0" w:color="auto"/>
+          <w:bottom w:val="single" w:sz="4" w:space="0" w:color="auto"/>
+          <w:right w:val="single" w:sz="4" w:space="0" w:color="auto"/>
+          <w:insideH w:val="single" w:sz="4" w:space="0" w:color="auto"/>
+          <w:insideV w:val="single" w:sz="4" w:space="0" w:color="auto"/>
+        </w:tblBorders>
+        <w:tblLook w:val="0000" w:firstRow="0" w:lastRow="0" w:firstColumn="0" w:lastColumn="0" w:noHBand="0" w:noVBand="0"/>
+      </w:tblPr>
+      <w:tblGrid>
+        <w:gridCol w:w="3917"/>
+        <w:gridCol w:w="1307"/>
+        <w:gridCol w:w="2506"/>
+        <w:gridCol w:w="1910"/>
+      </w:tblGrid>
+      <w:tr>
+        <w:trPr>
+          <w:cantSplit/>
+          <w:tblHeader/>
+        </w:trPr>
+        <w:tc>
+          <w:tcPr>
+            <w:tcW w:w="2048" w:type="pct"/>
+            <w:vMerge w:val="restart"/>
+            <w:shd w:val="clear" w:color="auto" w:fill="E6E6E6"/>
+            <w:vAlign w:val="center"/>
+          </w:tcPr>
+          <w:p>
+            <w:pPr>
+              <w:jc w:val="center"/>
+              <w:rPr>
+                <w:rFonts w:ascii="Calibri" w:hAnsi="Calibri" w:cs="Calibri"/>
+                <w:b/>
+                <w:sz w:val="20"/>
+                <w:szCs w:val="20"/>
+                <w:lang w:val="el-GR"/>
+              </w:rPr>
+            </w:pPr>
+            <w:r>
+              <w:rPr>
+                <w:rFonts w:ascii="Calibri" w:hAnsi="Calibri" w:cs="Calibri"/>
+                <w:b/>
+                <w:sz w:val="20"/>
+                <w:szCs w:val="20"/>
+                <w:lang w:val="el-GR"/>
+              </w:rPr>
+              <w:t>Έργο</w:t>
+            </w:r>
+          </w:p>
+        </w:tc>
+        <w:tc>
+          <w:tcPr>
+            <w:tcW w:w="629" w:type="pct"/>
+            <w:vMerge w:val="restart"/>
+            <w:shd w:val="clear" w:color="auto" w:fill="E6E6E6"/>
+            <w:vAlign w:val="center"/>
+          </w:tcPr>
+          <w:p>
+            <w:pPr>
+              <w:jc w:val="center"/>
+              <w:rPr>
+                <w:rFonts w:ascii="Calibri" w:hAnsi="Calibri" w:cs="Calibri"/>
+                <w:b/>
+                <w:sz w:val="20"/>
+                <w:szCs w:val="20"/>
+                <w:lang w:val="el-GR"/>
+              </w:rPr>
+            </w:pPr>
+            <w:r>
+              <w:rPr>
+                <w:rFonts w:ascii="Calibri" w:hAnsi="Calibri" w:cs="Calibri"/>
+                <w:b/>
+                <w:sz w:val="20"/>
+                <w:szCs w:val="20"/>
+                <w:lang w:val="el-GR"/>
+              </w:rPr>
+              <w:t>Εργοδότης</w:t>
+            </w:r>
+          </w:p>
+        </w:tc>
+        <w:tc>
+          <w:tcPr>
+            <w:tcW w:w="1316" w:type="pct"/>
+            <w:vMerge w:val="restart"/>
+            <w:shd w:val="clear" w:color="auto" w:fill="E6E6E6"/>
+            <w:vAlign w:val="center"/>
+          </w:tcPr>
+          <w:p>
+            <w:pPr>
+              <w:jc w:val="center"/>
+              <w:rPr>
+                <w:rFonts w:ascii="Calibri" w:hAnsi="Calibri" w:cs="Calibri"/>
+                <w:sz w:val="20"/>
+                <w:szCs w:val="20"/>
+                <w:lang w:val="el-GR"/>
+              </w:rPr>
+            </w:pPr>
+            <w:r>
+              <w:rPr>
+                <w:rFonts w:ascii="Calibri" w:hAnsi="Calibri" w:cs="Calibri"/>
+                <w:b/>
+                <w:sz w:val="20"/>
+                <w:szCs w:val="20"/>
+                <w:lang w:val="el-GR"/>
+              </w:rPr>
+              <w:t xml:space="preserve">Θέση και Καθήκοντα στο Έργο </w:t>
+            </w:r>
+          </w:p>
+        </w:tc>
+        <w:tc>
+          <w:tcPr>
+            <w:tcW w:w="1007" w:type="pct"/>
+            <w:shd w:val="clear" w:color="auto" w:fill="E6E6E6"/>
+            <w:vAlign w:val="center"/>
+          </w:tcPr>
+          <w:p>
+            <w:pPr>
+              <w:jc w:val="center"/>
+              <w:rPr>
+                <w:rFonts w:ascii="Calibri" w:hAnsi="Calibri" w:cs="Calibri"/>
+                <w:b/>
+                <w:sz w:val="20"/>
+                <w:szCs w:val="20"/>
+                <w:lang w:val="el-GR"/>
+              </w:rPr>
+            </w:pPr>
+            <w:r>
+              <w:rPr>
+                <w:rFonts w:ascii="Calibri" w:hAnsi="Calibri" w:cs="Calibri"/>
+                <w:b/>
+                <w:sz w:val="20"/>
+                <w:szCs w:val="20"/>
+                <w:lang w:val="el-GR"/>
+              </w:rPr>
+              <w:t>Απασχόληση στο Έργο</w:t>
+            </w:r>
+          </w:p>
+        </w:tc>
+      </w:tr>
+      <w:tr>
+        <w:trPr>
+          <w:cantSplit/>
+          <w:tblHeader/>
+        </w:trPr>
+        <w:tc>
+          <w:tcPr>
+            <w:tcW w:w="2048" w:type="pct"/>
+            <w:vMerge/>
+            <w:vAlign w:val="center"/>
+          </w:tcPr>
+          <w:p>
+            <w:pPr>
+              <w:jc w:val="left"/>
+              <w:rPr>
+                <w:rFonts w:ascii="Calibri" w:hAnsi="Calibri" w:cs="Calibri"/>
+                <w:b/>
+                <w:sz w:val="20"/>
+                <w:szCs w:val="20"/>
+                <w:lang w:val="el-GR"/>
+              </w:rPr>
+            </w:pPr>
+          </w:p>
+        </w:tc>
+        <w:tc>
+          <w:tcPr>
+            <w:tcW w:w="629" w:type="pct"/>
+            <w:vMerge/>
+            <w:vAlign w:val="center"/>
+          </w:tcPr>
+          <w:p>
+            <w:pPr>
+              <w:jc w:val="center"/>
+              <w:rPr>
+                <w:rFonts w:ascii="Calibri" w:hAnsi="Calibri" w:cs="Calibri"/>
+                <w:b/>
+                <w:sz w:val="20"/>
+                <w:szCs w:val="20"/>
+                <w:lang w:val="el-GR"/>
+              </w:rPr>
+            </w:pPr>
+          </w:p>
+        </w:tc>
+        <w:tc>
+          <w:tcPr>
+            <w:tcW w:w="1316" w:type="pct"/>
+            <w:vMerge/>
+            <w:vAlign w:val="center"/>
+          </w:tcPr>
+          <w:p>
+            <w:pPr>
+              <w:jc w:val="left"/>
+              <w:rPr>
+                <w:rFonts w:ascii="Calibri" w:hAnsi="Calibri" w:cs="Calibri"/>
+                <w:b/>
+                <w:sz w:val="20"/>
+                <w:szCs w:val="20"/>
+                <w:lang w:val="el-GR"/>
+              </w:rPr>
+            </w:pPr>
+          </w:p>
+        </w:tc>
+        <w:tc>
+          <w:tcPr>
+            <w:tcW w:w="1007" w:type="pct"/>
+            <w:shd w:val="clear" w:color="auto" w:fill="E6E6E6"/>
+            <w:vAlign w:val="center"/>
+          </w:tcPr>
+          <w:p>
+            <w:pPr>
+              <w:jc w:val="center"/>
+              <w:rPr>
+                <w:rFonts w:ascii="Calibri" w:hAnsi="Calibri" w:cs="Calibri"/>
+                <w:b/>
+                <w:sz w:val="20"/>
+                <w:szCs w:val="20"/>
+                <w:lang w:val="el-GR"/>
+              </w:rPr>
+            </w:pPr>
+            <w:r>
+              <w:rPr>
+                <w:rFonts w:ascii="Calibri" w:hAnsi="Calibri" w:cs="Calibri"/>
+                <w:b/>
+                <w:sz w:val="20"/>
+                <w:szCs w:val="20"/>
+                <w:lang w:val="el-GR"/>
+              </w:rPr>
+              <w:t>Περίοδος</w:t>
+            </w:r>
+          </w:p>
+          <w:p>
+            <w:pPr>
+              <w:jc w:val="center"/>
+              <w:rPr>
+                <w:rFonts w:ascii="Calibri" w:hAnsi="Calibri" w:cs="Calibri"/>
+                <w:b/>
+                <w:sz w:val="20"/>
+                <w:szCs w:val="20"/>
+                <w:lang w:val="el-GR"/>
+              </w:rPr>
+            </w:pPr>
+            <w:r>
+              <w:rPr>
+                <w:rFonts w:ascii="Calibri" w:hAnsi="Calibri" w:cs="Calibri"/>
+                <w:sz w:val="20"/>
+                <w:szCs w:val="20"/>
+                <w:lang w:val="el-GR"/>
+              </w:rPr>
+              <w:t xml:space="preserve">(από </w:t>
+            </w:r>
+            <w:r>
+              <w:rPr>
+                <w:rFonts w:ascii="Calibri" w:hAnsi="Calibri" w:cs="Calibri"/>
+                <w:b/>
+                <w:sz w:val="20"/>
+                <w:szCs w:val="20"/>
+                <w:lang w:val="el-GR"/>
+              </w:rPr>
+              <w:t>-</w:t>
+            </w:r>
+            <w:r>
+              <w:rPr>
+                <w:rFonts w:ascii="Calibri" w:hAnsi="Calibri" w:cs="Calibri"/>
+                <w:sz w:val="20"/>
+                <w:szCs w:val="20"/>
+                <w:lang w:val="el-GR"/>
+              </w:rPr>
+              <w:t xml:space="preserve"> έως)</w:t>
+            </w:r>
+          </w:p>
+        </w:tc>
+      </w:tr>
+      <w:tr w14:paraId="EXP00001">
+        <w:trPr>
+          <w:cantSplit/>
+        </w:trPr>
+        <w:tc>
+          <w:tcPr>
+            <w:tcW w:w="2048" w:type="pct"/>
+            <w:vAlign w:val="center"/>
+          </w:tcPr>
+          <w:p>
+            <w:pPr>
+              <w:spacing w:before="0"/>
+              <w:jc w:val="left"/>
+              <w:rPr>
+                <w:rFonts w:ascii="Calibri" w:hAnsi="Calibri" w:cs="Calibri"/>
+                <w:sz w:val="20"/>
+                <w:szCs w:val="20"/>
+                <w:lang w:val="el-GR"/>
+              </w:rPr>
+            </w:pPr>
+            <w:r>
+              <w:rPr>
+                <w:rFonts w:ascii="Calibri" w:hAnsi="Calibri" w:cs="Calibri"/>
+                <w:sz w:val="20"/>
+                <w:szCs w:val="20"/>
+                <w:lang w:val="el-GR"/>
+              </w:rPr>
+              <w:t>{#experienceRows}{projectText}</w:t>
+            </w:r>
+          </w:p>
+        </w:tc>
+        <w:tc>
+          <w:tcPr>
+            <w:tcW w:w="629" w:type="pct"/>
+            <w:vAlign w:val="center"/>
+          </w:tcPr>
+          <w:p>
+            <w:pPr>
+              <w:spacing w:before="0"/>
+              <w:jc w:val="center"/>
+              <w:rPr>
+                <w:rFonts w:ascii="Calibri" w:hAnsi="Calibri" w:cs="Calibri"/>
+                <w:sz w:val="20"/>
+                <w:szCs w:val="20"/>
+                <w:lang w:val="el-GR"/>
+              </w:rPr>
+            </w:pPr>
+            <w:r>
+              <w:rPr>
+                <w:rFonts w:ascii="Calibri" w:hAnsi="Calibri" w:cs="Calibri"/>
+                <w:sz w:val="20"/>
+                <w:szCs w:val="20"/>
+                <w:lang w:val="el-GR"/>
+              </w:rPr>
+              <w:t>{employerName}</w:t>
+            </w:r>
+          </w:p>
+        </w:tc>
+        <w:tc>
+          <w:tcPr>
+            <w:tcW w:w="1316" w:type="pct"/>
+            <w:vAlign w:val="center"/>
+          </w:tcPr>
+          <w:p>
+            <w:pPr>
+              <w:jc w:val="center"/>
+              <w:rPr>
+                <w:rFonts w:ascii="Calibri" w:hAnsi="Calibri" w:cs="Calibri"/>
+                <w:sz w:val="20"/>
+                <w:szCs w:val="20"/>
+                <w:lang w:val="el-GR"/>
+              </w:rPr>
+            </w:pPr>
+            <w:r>
+              <w:rPr>
+                <w:rFonts w:ascii="Calibri" w:hAnsi="Calibri" w:cs="Calibri"/>
+                <w:sz w:val="20"/>
+                <w:szCs w:val="20"/>
+                <w:lang w:val="el-GR"/>
+              </w:rPr>
+              <w:t>{roleName}</w:t>
+            </w:r>
+          </w:p>
+        </w:tc>
+        <w:tc>
+          <w:tcPr>
+            <w:tcW w:w="1007" w:type="pct"/>
+            <w:vAlign w:val="center"/>
+          </w:tcPr>
+          <w:p>
+            <w:pPr>
+              <w:jc w:val="center"/>
+              <w:rPr>
+                <w:rFonts w:ascii="Calibri" w:hAnsi="Calibri" w:cs="Calibri"/>
+                <w:sz w:val="20"/>
+                <w:szCs w:val="20"/>
+                <w:lang w:val="el-GR"/>
+              </w:rPr>
+            </w:pPr>
+            <w:r>
+              <w:rPr>
+                <w:rFonts w:ascii="Calibri" w:hAnsi="Calibri" w:cs="Calibri"/>
+                <w:sz w:val="20"/>
+                <w:szCs w:val="20"/>
+                <w:lang w:val="el-GR"/>
+              </w:rPr>
+              <w:t>{period}{/experienceRows}</w:t>
+            </w:r>
+          </w:p>
+        </w:tc>
+      </w:tr>
+    </w:tbl>
+    <w:p>
+      <w:pPr>
+        <w:rPr>
+          <w:sz w:val="18"/>
+          <w:szCs w:val="18"/>
+          <w:lang w:val="en-US"/>
+        </w:rPr>
+      </w:pPr>
+    </w:p>
+    <w:p>
+      <w:r>
+        <w:t>{#hasPublications}</w:t>
+      </w:r>
+    </w:p>
+    <w:tbl>
+      <w:tblPr>
+        <w:tblW w:w="5652" w:type="pct"/>
+        <w:tblInd w:w="-601" w:type="dxa"/>
+        <w:tblBorders>
+          <w:top w:val="single" w:sz="4" w:space="0" w:color="auto"/>
+          <w:left w:val="single" w:sz="4" w:space="0" w:color="auto"/>
+          <w:bottom w:val="single" w:sz="4" w:space="0" w:color="auto"/>
+          <w:right w:val="single" w:sz="4" w:space="0" w:color="auto"/>
+          <w:insideH w:val="single" w:sz="4" w:space="0" w:color="auto"/>
+          <w:insideV w:val="single" w:sz="4" w:space="0" w:color="auto"/>
+        </w:tblBorders>
+        <w:tblLook w:val="0000" w:firstRow="0" w:lastRow="0" w:firstColumn="0" w:lastColumn="0" w:noHBand="0" w:noVBand="0"/>
+      </w:tblPr>
+      <w:tblGrid>
+        <w:gridCol w:w="9640"/>
+      </w:tblGrid>
+      <w:tr w:rsidR="00PUB001" w14:paraId="PUB00001">
+        <w:trPr>
+          <w:trHeight w:val="567"/>
+        </w:trPr>
+        <w:tc>
+          <w:tcPr>
+            <w:tcW w:w="5000" w:type="pct"/>
+            <w:shd w:val="pct10" w:color="auto" w:fill="auto"/>
+            <w:vAlign w:val="center"/>
+          </w:tcPr>
+          <w:p>
+            <w:pPr>
+              <w:jc w:val="center"/>
+              <w:rPr>
+                <w:sz w:val="18"/>
+                <w:szCs w:val="18"/>
+              </w:rPr>
+            </w:pPr>
+            <w:r>
+              <w:rPr>
+                <w:b/>
+                <w:sz w:val="18"/>
+                <w:szCs w:val="18"/>
+                <w:lang w:val="el-GR"/>
+              </w:rPr>
+              <w:t>ΔΗΜΟΣΙΕΥΣΕΙΣ</w:t>
+            </w:r>
+          </w:p>
+        </w:tc>
+      </w:tr>
+    </w:tbl>
+    <w:p>
+      <w:pPr>
+        <w:rPr>
+          <w:sz w:val="18"/>
+          <w:szCs w:val="18"/>
+          <w:lang w:val="el-GR"/>
+        </w:rPr>
+      </w:pPr>
+    </w:p>
+    <w:tbl>
+      <w:tblPr>
+        <w:tblW w:w="5652" w:type="pct"/>
+        <w:tblInd w:w="-601" w:type="dxa"/>
+        <w:tblBorders>
+          <w:top w:val="single" w:sz="4" w:space="0" w:color="auto"/>
+          <w:left w:val="single" w:sz="4" w:space="0" w:color="auto"/>
+          <w:bottom w:val="single" w:sz="4" w:space="0" w:color="auto"/>
+          <w:right w:val="single" w:sz="4" w:space="0" w:color="auto"/>
+          <w:insideH w:val="single" w:sz="4" w:space="0" w:color="auto"/>
+          <w:insideV w:val="single" w:sz="4" w:space="0" w:color="auto"/>
+        </w:tblBorders>
+        <w:tblLook w:val="0000" w:firstRow="0" w:lastRow="0" w:firstColumn="0" w:lastColumn="0" w:noHBand="0" w:noVBand="0"/>
+      </w:tblPr>
+      <w:tblGrid>
+        <w:gridCol w:w="9640"/>
+      </w:tblGrid>
+      <w:tr w:rsidR="00PUB002" w14:paraId="PUB00002">
+        <w:trPr>
+          <w:cantSplit/>
+        </w:trPr>
+        <w:tc>
+          <w:tcPr>
+            <w:tcW w:w="5000" w:type="pct"/>
+            <w:vAlign w:val="center"/>
+          </w:tcPr>
+          <w:p>
+            <w:pPr>
+              <w:spacing w:before="0"/>
+              <w:rPr>
+                <w:rFonts w:ascii="Calibri" w:hAnsi="Calibri" w:cs="Calibri"/>
+                <w:sz w:val="20"/>
+                <w:szCs w:val="20"/>
+                <w:lang w:val="el-GR"/>
+              </w:rPr>
+            </w:pPr>
+            <w:r>
+              <w:rPr>
+                <w:rFonts w:ascii="Calibri" w:hAnsi="Calibri" w:cs="Calibri"/>
+                <w:sz w:val="20"/>
+                <w:szCs w:val="20"/>
+                <w:lang w:val="el-GR"/>
+              </w:rPr>
+              <w:t>{publicationsText}</w:t>
+            </w:r>
+          </w:p>
+        </w:tc>
+      </w:tr>
+    </w:tbl>
+    <w:p>
+      <w:r>
+        <w:t>{/hasPublications}</w:t>
+      </w:r>
+    </w:p>
+    <w:sectPr>
+      <w:pgSz w:w="11906" w:h="16838"/>
+      <w:pgMar w:top="1440" w:right="1797" w:bottom="1440" w:left="1797" w:header="709" w:footer="709" w:gutter="0"/>
+      <w:cols w:space="708"/>
+      <w:docGrid w:linePitch="360"/>
+    </w:sectPr>
+  </w:body>
+</w:document>
 </file>
 
 <file path=word/numbering.xml><?xml version="1.0" encoding="utf-8"?>

</xml_diff>